<commit_message>
docs: add database backup and deploy_structure
</commit_message>
<xml_diff>
--- a/deploy_structure.docx
+++ b/deploy_structure.docx
@@ -13,20 +13,21 @@
         <w:rPr>
           <w:rStyle w:val="m"/>
         </w:rPr>
-        <w:t xml:space="preserve">Qui trình thay đổi database : </w:t>
-      </w:r>
-    </w:p>
-    <w:p>
-      <w:pPr>
+        <w:t xml:space="preserve">Qui trình thay đổi </w:t>
+      </w:r>
+      <w:proofErr w:type="gramStart"/>
+      <w:r>
         <w:rPr>
           <w:rStyle w:val="m"/>
         </w:rPr>
-      </w:pPr>
+        <w:t>database :</w:t>
+      </w:r>
+      <w:proofErr w:type="gramEnd"/>
       <w:r>
         <w:rPr>
           <w:rStyle w:val="m"/>
         </w:rPr>
-        <w:t>Thay đổi vài entity :</w:t>
+        <w:t xml:space="preserve"> </w:t>
       </w:r>
     </w:p>
     <w:p>
@@ -39,16 +40,53 @@
         <w:rPr>
           <w:rStyle w:val="m"/>
         </w:rPr>
-        <w:t xml:space="preserve">Chạy lệnh sau để tạo migrations mới và update : </w:t>
-      </w:r>
-    </w:p>
-    <w:p>
+        <w:t xml:space="preserve">Thay đổi vài </w:t>
+      </w:r>
+      <w:proofErr w:type="gramStart"/>
       <w:r>
         <w:rPr>
           <w:rStyle w:val="m"/>
         </w:rPr>
+        <w:t>entity :</w:t>
+      </w:r>
+      <w:proofErr w:type="gramEnd"/>
+    </w:p>
+    <w:p>
+      <w:pPr>
+        <w:rPr>
+          <w:rStyle w:val="m"/>
+        </w:rPr>
+      </w:pPr>
+      <w:r>
+        <w:rPr>
+          <w:rStyle w:val="m"/>
+        </w:rPr>
+        <w:t xml:space="preserve">Chạy lệnh sau để tạo migrations mới và </w:t>
+      </w:r>
+      <w:proofErr w:type="gramStart"/>
+      <w:r>
+        <w:rPr>
+          <w:rStyle w:val="m"/>
+        </w:rPr>
+        <w:t>update :</w:t>
+      </w:r>
+      <w:proofErr w:type="gramEnd"/>
+      <w:r>
+        <w:rPr>
+          <w:rStyle w:val="m"/>
+        </w:rPr>
+        <w:t xml:space="preserve"> </w:t>
+      </w:r>
+    </w:p>
+    <w:p>
+      <w:proofErr w:type="gramStart"/>
+      <w:r>
+        <w:rPr>
+          <w:rStyle w:val="m"/>
+        </w:rPr>
         <w:t>dotnet</w:t>
       </w:r>
+      <w:proofErr w:type="gramEnd"/>
       <w:r>
         <w:t xml:space="preserve"> </w:t>
       </w:r>
@@ -87,14 +125,27 @@
       </w:r>
     </w:p>
     <w:p>
-      <w:r>
-        <w:t>dotnet ef database update</w:t>
+      <w:proofErr w:type="gramStart"/>
+      <w:r>
+        <w:t>dotnet</w:t>
+      </w:r>
+      <w:proofErr w:type="gramEnd"/>
+      <w:r>
+        <w:t xml:space="preserve"> ef database update</w:t>
       </w:r>
     </w:p>
     <w:p/>
     <w:p>
       <w:r>
-        <w:t xml:space="preserve">Lúc pull về : </w:t>
+        <w:t xml:space="preserve">Lúc pull </w:t>
+      </w:r>
+      <w:proofErr w:type="gramStart"/>
+      <w:r>
+        <w:t>về :</w:t>
+      </w:r>
+      <w:proofErr w:type="gramEnd"/>
+      <w:r>
+        <w:t xml:space="preserve"> </w:t>
       </w:r>
     </w:p>
     <w:p>
@@ -104,8 +155,13 @@
       <w:r>
         <w:br/>
       </w:r>
-      <w:r>
-        <w:t>dotnet ef database update</w:t>
+      <w:proofErr w:type="gramStart"/>
+      <w:r>
+        <w:t>dotnet</w:t>
+      </w:r>
+      <w:proofErr w:type="gramEnd"/>
+      <w:r>
+        <w:t xml:space="preserve"> ef database update</w:t>
       </w:r>
       <w:r>
         <w:br/>
@@ -123,12 +179,28 @@
     </w:p>
     <w:p>
       <w:r>
-        <w:t>Dotnet run : chạy ở backend</w:t>
-      </w:r>
-    </w:p>
-    <w:p>
-      <w:r>
-        <w:t>Npm run dev : chạy ở frontend</w:t>
+        <w:t xml:space="preserve">Dotnet </w:t>
+      </w:r>
+      <w:proofErr w:type="gramStart"/>
+      <w:r>
+        <w:t>run :</w:t>
+      </w:r>
+      <w:proofErr w:type="gramEnd"/>
+      <w:r>
+        <w:t xml:space="preserve"> chạy ở backend</w:t>
+      </w:r>
+    </w:p>
+    <w:p>
+      <w:r>
+        <w:t xml:space="preserve">Npm run </w:t>
+      </w:r>
+      <w:proofErr w:type="gramStart"/>
+      <w:r>
+        <w:t>dev :</w:t>
+      </w:r>
+      <w:proofErr w:type="gramEnd"/>
+      <w:r>
+        <w:t xml:space="preserve"> chạy ở frontend</w:t>
       </w:r>
       <w:r>
         <w:br/>
@@ -141,17 +213,41 @@
     </w:p>
     <w:p>
       <w:r>
-        <w:t xml:space="preserve">Phase 3 4 5 : Develop 1 module </w:t>
-      </w:r>
-    </w:p>
-    <w:p>
-      <w:r>
-        <w:t>Phase 6 : Set up docker.</w:t>
-      </w:r>
-    </w:p>
-    <w:p>
-      <w:r>
-        <w:t xml:space="preserve">Cách test : </w:t>
+        <w:t xml:space="preserve">Phase 3 4 </w:t>
+      </w:r>
+      <w:proofErr w:type="gramStart"/>
+      <w:r>
+        <w:t>5 :</w:t>
+      </w:r>
+      <w:proofErr w:type="gramEnd"/>
+      <w:r>
+        <w:t xml:space="preserve"> Develop 1 module </w:t>
+      </w:r>
+    </w:p>
+    <w:p>
+      <w:r>
+        <w:t xml:space="preserve">Phase </w:t>
+      </w:r>
+      <w:proofErr w:type="gramStart"/>
+      <w:r>
+        <w:t>6 :</w:t>
+      </w:r>
+      <w:proofErr w:type="gramEnd"/>
+      <w:r>
+        <w:t xml:space="preserve"> Set up docker.</w:t>
+      </w:r>
+    </w:p>
+    <w:p>
+      <w:r>
+        <w:t xml:space="preserve">Cách </w:t>
+      </w:r>
+      <w:proofErr w:type="gramStart"/>
+      <w:r>
+        <w:t>test :</w:t>
+      </w:r>
+      <w:proofErr w:type="gramEnd"/>
+      <w:r>
+        <w:t xml:space="preserve"> </w:t>
       </w:r>
     </w:p>
     <w:p>
@@ -162,7 +258,15 @@
     <w:p/>
     <w:p>
       <w:r>
-        <w:t>Phase 7 + 8 : CI/CD and push to GHCR</w:t>
+        <w:t xml:space="preserve">Phase 7 + </w:t>
+      </w:r>
+      <w:proofErr w:type="gramStart"/>
+      <w:r>
+        <w:t>8 :</w:t>
+      </w:r>
+      <w:proofErr w:type="gramEnd"/>
+      <w:r>
+        <w:t xml:space="preserve"> CI/CD and push to GHCR</w:t>
       </w:r>
     </w:p>
     <w:p/>
@@ -172,8 +276,13 @@
           <w:lang w:val="vi-VN"/>
         </w:rPr>
       </w:pPr>
-      <w:r>
-        <w:t>ssh root@192.168.1.6 -i D:\passkey_root</w:t>
+      <w:proofErr w:type="gramStart"/>
+      <w:r>
+        <w:t>ssh</w:t>
+      </w:r>
+      <w:proofErr w:type="gramEnd"/>
+      <w:r>
+        <w:t xml:space="preserve"> root@192.168.1.6 -i D:\passkey_root</w:t>
       </w:r>
       <w:r>
         <w:rPr>
@@ -1129,7 +1238,25 @@
           <w:sz w:val="24"/>
           <w:szCs w:val="24"/>
         </w:rPr>
-        <w:t>Mình xác định module dùng để làm gì, ai dùng, dữ liệu vào/ra là gì, có cần auth, phân quyền, CSRF, upload, transaction hay không.</w:t>
+        <w:t xml:space="preserve">Mình xác định module dùng để làm gì, ai dùng, dữ liệu vào/ra là gì, có cần auth, phân quyền, CSRF, </w:t>
+      </w:r>
+      <w:proofErr w:type="gramStart"/>
+      <w:r>
+        <w:rPr>
+          <w:rFonts w:ascii="Times New Roman" w:eastAsia="Times New Roman" w:hAnsi="Times New Roman" w:cs="Times New Roman"/>
+          <w:sz w:val="24"/>
+          <w:szCs w:val="24"/>
+        </w:rPr>
+        <w:t>upload,</w:t>
+      </w:r>
+      <w:proofErr w:type="gramEnd"/>
+      <w:r>
+        <w:rPr>
+          <w:rFonts w:ascii="Times New Roman" w:eastAsia="Times New Roman" w:hAnsi="Times New Roman" w:cs="Times New Roman"/>
+          <w:sz w:val="24"/>
+          <w:szCs w:val="24"/>
+        </w:rPr>
+        <w:t xml:space="preserve"> transaction hay không.</w:t>
       </w:r>
     </w:p>
     <w:p>
@@ -1203,13 +1330,23 @@
           <w:szCs w:val="20"/>
         </w:rPr>
       </w:pPr>
-      <w:r>
-        <w:rPr>
-          <w:rFonts w:ascii="Courier New" w:eastAsia="Times New Roman" w:hAnsi="Courier New" w:cs="Courier New"/>
-          <w:sz w:val="20"/>
-          <w:szCs w:val="20"/>
-        </w:rPr>
-        <w:t>route -&gt; validation -&gt; controller -&gt; service -&gt; repository -&gt; model</w:t>
+      <w:proofErr w:type="gramStart"/>
+      <w:r>
+        <w:rPr>
+          <w:rFonts w:ascii="Courier New" w:eastAsia="Times New Roman" w:hAnsi="Courier New" w:cs="Courier New"/>
+          <w:sz w:val="20"/>
+          <w:szCs w:val="20"/>
+        </w:rPr>
+        <w:t>route</w:t>
+      </w:r>
+      <w:proofErr w:type="gramEnd"/>
+      <w:r>
+        <w:rPr>
+          <w:rFonts w:ascii="Courier New" w:eastAsia="Times New Roman" w:hAnsi="Courier New" w:cs="Courier New"/>
+          <w:sz w:val="20"/>
+          <w:szCs w:val="20"/>
+        </w:rPr>
+        <w:t xml:space="preserve"> -&gt; validation -&gt; controller -&gt; service -&gt; repository -&gt; model</w:t>
       </w:r>
     </w:p>
     <w:p>
@@ -1546,8 +1683,18 @@
           <w:sz w:val="20"/>
           <w:szCs w:val="20"/>
         </w:rPr>
-        <w:t>GET /api/v1/categories/:categoryId</w:t>
-      </w:r>
+        <w:t>GET /api/v1/categories/</w:t>
+      </w:r>
+      <w:proofErr w:type="gramStart"/>
+      <w:r>
+        <w:rPr>
+          <w:rFonts w:ascii="Courier New" w:eastAsia="Times New Roman" w:hAnsi="Courier New" w:cs="Courier New"/>
+          <w:sz w:val="20"/>
+          <w:szCs w:val="20"/>
+        </w:rPr>
+        <w:t>:categoryId</w:t>
+      </w:r>
+      <w:proofErr w:type="gramEnd"/>
     </w:p>
     <w:p>
       <w:pPr>
@@ -1620,8 +1767,18 @@
           <w:sz w:val="20"/>
           <w:szCs w:val="20"/>
         </w:rPr>
-        <w:t>PATCH /api/v1/categories/:categoryId</w:t>
-      </w:r>
+        <w:t>PATCH /api/v1/categories/</w:t>
+      </w:r>
+      <w:proofErr w:type="gramStart"/>
+      <w:r>
+        <w:rPr>
+          <w:rFonts w:ascii="Courier New" w:eastAsia="Times New Roman" w:hAnsi="Courier New" w:cs="Courier New"/>
+          <w:sz w:val="20"/>
+          <w:szCs w:val="20"/>
+        </w:rPr>
+        <w:t>:categoryId</w:t>
+      </w:r>
+      <w:proofErr w:type="gramEnd"/>
     </w:p>
     <w:p>
       <w:pPr>
@@ -1657,8 +1814,18 @@
           <w:sz w:val="20"/>
           <w:szCs w:val="20"/>
         </w:rPr>
-        <w:t>DELETE /api/v1/categories/:categoryId</w:t>
-      </w:r>
+        <w:t>DELETE /api/v1/categories/</w:t>
+      </w:r>
+      <w:proofErr w:type="gramStart"/>
+      <w:r>
+        <w:rPr>
+          <w:rFonts w:ascii="Courier New" w:eastAsia="Times New Roman" w:hAnsi="Courier New" w:cs="Courier New"/>
+          <w:sz w:val="20"/>
+          <w:szCs w:val="20"/>
+        </w:rPr>
+        <w:t>:categoryId</w:t>
+      </w:r>
+      <w:proofErr w:type="gramEnd"/>
     </w:p>
     <w:p>
       <w:pPr>
@@ -1751,6 +1918,7 @@
           <w:szCs w:val="20"/>
         </w:rPr>
       </w:pPr>
+      <w:proofErr w:type="gramStart"/>
       <w:r>
         <w:rPr>
           <w:rFonts w:ascii="Courier New" w:eastAsia="Times New Roman" w:hAnsi="Courier New" w:cs="Courier New"/>
@@ -1759,6 +1927,7 @@
         </w:rPr>
         <w:t>name</w:t>
       </w:r>
+      <w:proofErr w:type="gramEnd"/>
     </w:p>
     <w:p>
       <w:pPr>
@@ -1788,6 +1957,7 @@
           <w:szCs w:val="20"/>
         </w:rPr>
       </w:pPr>
+      <w:proofErr w:type="gramStart"/>
       <w:r>
         <w:rPr>
           <w:rFonts w:ascii="Courier New" w:eastAsia="Times New Roman" w:hAnsi="Courier New" w:cs="Courier New"/>
@@ -1796,6 +1966,7 @@
         </w:rPr>
         <w:t>slug</w:t>
       </w:r>
+      <w:proofErr w:type="gramEnd"/>
     </w:p>
     <w:p>
       <w:pPr>
@@ -1825,6 +1996,7 @@
           <w:szCs w:val="20"/>
         </w:rPr>
       </w:pPr>
+      <w:proofErr w:type="gramStart"/>
       <w:r>
         <w:rPr>
           <w:rFonts w:ascii="Courier New" w:eastAsia="Times New Roman" w:hAnsi="Courier New" w:cs="Courier New"/>
@@ -1833,6 +2005,7 @@
         </w:rPr>
         <w:t>parentId</w:t>
       </w:r>
+      <w:proofErr w:type="gramEnd"/>
     </w:p>
     <w:p>
       <w:pPr>
@@ -1862,6 +2035,7 @@
           <w:szCs w:val="20"/>
         </w:rPr>
       </w:pPr>
+      <w:proofErr w:type="gramStart"/>
       <w:r>
         <w:rPr>
           <w:rFonts w:ascii="Courier New" w:eastAsia="Times New Roman" w:hAnsi="Courier New" w:cs="Courier New"/>
@@ -1870,6 +2044,7 @@
         </w:rPr>
         <w:t>status</w:t>
       </w:r>
+      <w:proofErr w:type="gramEnd"/>
     </w:p>
     <w:p>
       <w:pPr>
@@ -1899,6 +2074,7 @@
           <w:szCs w:val="20"/>
         </w:rPr>
       </w:pPr>
+      <w:proofErr w:type="gramStart"/>
       <w:r>
         <w:rPr>
           <w:rFonts w:ascii="Courier New" w:eastAsia="Times New Roman" w:hAnsi="Courier New" w:cs="Courier New"/>
@@ -1907,6 +2083,7 @@
         </w:rPr>
         <w:t>createdAt</w:t>
       </w:r>
+      <w:proofErr w:type="gramEnd"/>
     </w:p>
     <w:p>
       <w:pPr>
@@ -1936,6 +2113,7 @@
           <w:szCs w:val="20"/>
         </w:rPr>
       </w:pPr>
+      <w:proofErr w:type="gramStart"/>
       <w:r>
         <w:rPr>
           <w:rFonts w:ascii="Courier New" w:eastAsia="Times New Roman" w:hAnsi="Courier New" w:cs="Courier New"/>
@@ -1944,6 +2122,7 @@
         </w:rPr>
         <w:t>updatedAt</w:t>
       </w:r>
+      <w:proofErr w:type="gramEnd"/>
     </w:p>
     <w:p>
       <w:pPr>
@@ -2035,13 +2214,23 @@
           <w:szCs w:val="20"/>
         </w:rPr>
       </w:pPr>
-      <w:r>
-        <w:rPr>
-          <w:rFonts w:ascii="Courier New" w:eastAsia="Times New Roman" w:hAnsi="Courier New" w:cs="Courier New"/>
-          <w:sz w:val="20"/>
-          <w:szCs w:val="20"/>
-        </w:rPr>
-        <w:t>route: khai báo endpoint + middleware</w:t>
+      <w:proofErr w:type="gramStart"/>
+      <w:r>
+        <w:rPr>
+          <w:rFonts w:ascii="Courier New" w:eastAsia="Times New Roman" w:hAnsi="Courier New" w:cs="Courier New"/>
+          <w:sz w:val="20"/>
+          <w:szCs w:val="20"/>
+        </w:rPr>
+        <w:t>route</w:t>
+      </w:r>
+      <w:proofErr w:type="gramEnd"/>
+      <w:r>
+        <w:rPr>
+          <w:rFonts w:ascii="Courier New" w:eastAsia="Times New Roman" w:hAnsi="Courier New" w:cs="Courier New"/>
+          <w:sz w:val="20"/>
+          <w:szCs w:val="20"/>
+        </w:rPr>
+        <w:t>: khai báo endpoint + middleware</w:t>
       </w:r>
     </w:p>
     <w:p>
@@ -2072,13 +2261,23 @@
           <w:szCs w:val="20"/>
         </w:rPr>
       </w:pPr>
-      <w:r>
-        <w:rPr>
-          <w:rFonts w:ascii="Courier New" w:eastAsia="Times New Roman" w:hAnsi="Courier New" w:cs="Courier New"/>
-          <w:sz w:val="20"/>
-          <w:szCs w:val="20"/>
-        </w:rPr>
-        <w:t>validation: validate params/query/body</w:t>
+      <w:proofErr w:type="gramStart"/>
+      <w:r>
+        <w:rPr>
+          <w:rFonts w:ascii="Courier New" w:eastAsia="Times New Roman" w:hAnsi="Courier New" w:cs="Courier New"/>
+          <w:sz w:val="20"/>
+          <w:szCs w:val="20"/>
+        </w:rPr>
+        <w:t>validation</w:t>
+      </w:r>
+      <w:proofErr w:type="gramEnd"/>
+      <w:r>
+        <w:rPr>
+          <w:rFonts w:ascii="Courier New" w:eastAsia="Times New Roman" w:hAnsi="Courier New" w:cs="Courier New"/>
+          <w:sz w:val="20"/>
+          <w:szCs w:val="20"/>
+        </w:rPr>
+        <w:t>: validate params/query/body</w:t>
       </w:r>
     </w:p>
     <w:p>
@@ -2109,13 +2308,23 @@
           <w:szCs w:val="20"/>
         </w:rPr>
       </w:pPr>
-      <w:r>
-        <w:rPr>
-          <w:rFonts w:ascii="Courier New" w:eastAsia="Times New Roman" w:hAnsi="Courier New" w:cs="Courier New"/>
-          <w:sz w:val="20"/>
-          <w:szCs w:val="20"/>
-        </w:rPr>
-        <w:t>controller: nhận req/res, gọi service</w:t>
+      <w:proofErr w:type="gramStart"/>
+      <w:r>
+        <w:rPr>
+          <w:rFonts w:ascii="Courier New" w:eastAsia="Times New Roman" w:hAnsi="Courier New" w:cs="Courier New"/>
+          <w:sz w:val="20"/>
+          <w:szCs w:val="20"/>
+        </w:rPr>
+        <w:t>controller</w:t>
+      </w:r>
+      <w:proofErr w:type="gramEnd"/>
+      <w:r>
+        <w:rPr>
+          <w:rFonts w:ascii="Courier New" w:eastAsia="Times New Roman" w:hAnsi="Courier New" w:cs="Courier New"/>
+          <w:sz w:val="20"/>
+          <w:szCs w:val="20"/>
+        </w:rPr>
+        <w:t>: nhận req/res, gọi service</w:t>
       </w:r>
     </w:p>
     <w:p>
@@ -2146,13 +2355,23 @@
           <w:szCs w:val="20"/>
         </w:rPr>
       </w:pPr>
-      <w:r>
-        <w:rPr>
-          <w:rFonts w:ascii="Courier New" w:eastAsia="Times New Roman" w:hAnsi="Courier New" w:cs="Courier New"/>
-          <w:sz w:val="20"/>
-          <w:szCs w:val="20"/>
-        </w:rPr>
-        <w:t>service: nghiệp vụ chính</w:t>
+      <w:proofErr w:type="gramStart"/>
+      <w:r>
+        <w:rPr>
+          <w:rFonts w:ascii="Courier New" w:eastAsia="Times New Roman" w:hAnsi="Courier New" w:cs="Courier New"/>
+          <w:sz w:val="20"/>
+          <w:szCs w:val="20"/>
+        </w:rPr>
+        <w:t>service</w:t>
+      </w:r>
+      <w:proofErr w:type="gramEnd"/>
+      <w:r>
+        <w:rPr>
+          <w:rFonts w:ascii="Courier New" w:eastAsia="Times New Roman" w:hAnsi="Courier New" w:cs="Courier New"/>
+          <w:sz w:val="20"/>
+          <w:szCs w:val="20"/>
+        </w:rPr>
+        <w:t>: nghiệp vụ chính</w:t>
       </w:r>
     </w:p>
     <w:p>
@@ -2183,13 +2402,23 @@
           <w:szCs w:val="20"/>
         </w:rPr>
       </w:pPr>
-      <w:r>
-        <w:rPr>
-          <w:rFonts w:ascii="Courier New" w:eastAsia="Times New Roman" w:hAnsi="Courier New" w:cs="Courier New"/>
-          <w:sz w:val="20"/>
-          <w:szCs w:val="20"/>
-        </w:rPr>
-        <w:t>repository: thao tác database</w:t>
+      <w:proofErr w:type="gramStart"/>
+      <w:r>
+        <w:rPr>
+          <w:rFonts w:ascii="Courier New" w:eastAsia="Times New Roman" w:hAnsi="Courier New" w:cs="Courier New"/>
+          <w:sz w:val="20"/>
+          <w:szCs w:val="20"/>
+        </w:rPr>
+        <w:t>repository</w:t>
+      </w:r>
+      <w:proofErr w:type="gramEnd"/>
+      <w:r>
+        <w:rPr>
+          <w:rFonts w:ascii="Courier New" w:eastAsia="Times New Roman" w:hAnsi="Courier New" w:cs="Courier New"/>
+          <w:sz w:val="20"/>
+          <w:szCs w:val="20"/>
+        </w:rPr>
+        <w:t>: thao tác database</w:t>
       </w:r>
     </w:p>
     <w:p>
@@ -2220,13 +2449,23 @@
           <w:szCs w:val="20"/>
         </w:rPr>
       </w:pPr>
-      <w:r>
-        <w:rPr>
-          <w:rFonts w:ascii="Courier New" w:eastAsia="Times New Roman" w:hAnsi="Courier New" w:cs="Courier New"/>
-          <w:sz w:val="20"/>
-          <w:szCs w:val="20"/>
-        </w:rPr>
-        <w:t>model: schema dữ liệu</w:t>
+      <w:proofErr w:type="gramStart"/>
+      <w:r>
+        <w:rPr>
+          <w:rFonts w:ascii="Courier New" w:eastAsia="Times New Roman" w:hAnsi="Courier New" w:cs="Courier New"/>
+          <w:sz w:val="20"/>
+          <w:szCs w:val="20"/>
+        </w:rPr>
+        <w:t>model</w:t>
+      </w:r>
+      <w:proofErr w:type="gramEnd"/>
+      <w:r>
+        <w:rPr>
+          <w:rFonts w:ascii="Courier New" w:eastAsia="Times New Roman" w:hAnsi="Courier New" w:cs="Courier New"/>
+          <w:sz w:val="20"/>
+          <w:szCs w:val="20"/>
+        </w:rPr>
+        <w:t>: schema dữ liệu</w:t>
       </w:r>
     </w:p>
     <w:p>
@@ -2300,13 +2539,23 @@
           <w:szCs w:val="20"/>
         </w:rPr>
       </w:pPr>
-      <w:r>
-        <w:rPr>
-          <w:rFonts w:ascii="Courier New" w:eastAsia="Times New Roman" w:hAnsi="Courier New" w:cs="Courier New"/>
-          <w:sz w:val="20"/>
-          <w:szCs w:val="20"/>
-        </w:rPr>
-        <w:t>dữ liệu không hợp lệ</w:t>
+      <w:proofErr w:type="gramStart"/>
+      <w:r>
+        <w:rPr>
+          <w:rFonts w:ascii="Courier New" w:eastAsia="Times New Roman" w:hAnsi="Courier New" w:cs="Courier New"/>
+          <w:sz w:val="20"/>
+          <w:szCs w:val="20"/>
+        </w:rPr>
+        <w:t>dữ</w:t>
+      </w:r>
+      <w:proofErr w:type="gramEnd"/>
+      <w:r>
+        <w:rPr>
+          <w:rFonts w:ascii="Courier New" w:eastAsia="Times New Roman" w:hAnsi="Courier New" w:cs="Courier New"/>
+          <w:sz w:val="20"/>
+          <w:szCs w:val="20"/>
+        </w:rPr>
+        <w:t xml:space="preserve"> liệu không hợp lệ</w:t>
       </w:r>
     </w:p>
     <w:p>
@@ -2337,13 +2586,23 @@
           <w:szCs w:val="20"/>
         </w:rPr>
       </w:pPr>
-      <w:r>
-        <w:rPr>
-          <w:rFonts w:ascii="Courier New" w:eastAsia="Times New Roman" w:hAnsi="Courier New" w:cs="Courier New"/>
-          <w:sz w:val="20"/>
-          <w:szCs w:val="20"/>
-        </w:rPr>
-        <w:t>objectId sai</w:t>
+      <w:proofErr w:type="gramStart"/>
+      <w:r>
+        <w:rPr>
+          <w:rFonts w:ascii="Courier New" w:eastAsia="Times New Roman" w:hAnsi="Courier New" w:cs="Courier New"/>
+          <w:sz w:val="20"/>
+          <w:szCs w:val="20"/>
+        </w:rPr>
+        <w:t>objectId</w:t>
+      </w:r>
+      <w:proofErr w:type="gramEnd"/>
+      <w:r>
+        <w:rPr>
+          <w:rFonts w:ascii="Courier New" w:eastAsia="Times New Roman" w:hAnsi="Courier New" w:cs="Courier New"/>
+          <w:sz w:val="20"/>
+          <w:szCs w:val="20"/>
+        </w:rPr>
+        <w:t xml:space="preserve"> sai</w:t>
       </w:r>
     </w:p>
     <w:p>
@@ -2374,13 +2633,23 @@
           <w:szCs w:val="20"/>
         </w:rPr>
       </w:pPr>
-      <w:r>
-        <w:rPr>
-          <w:rFonts w:ascii="Courier New" w:eastAsia="Times New Roman" w:hAnsi="Courier New" w:cs="Courier New"/>
-          <w:sz w:val="20"/>
-          <w:szCs w:val="20"/>
-        </w:rPr>
-        <w:t>không tìm thấy resource</w:t>
+      <w:proofErr w:type="gramStart"/>
+      <w:r>
+        <w:rPr>
+          <w:rFonts w:ascii="Courier New" w:eastAsia="Times New Roman" w:hAnsi="Courier New" w:cs="Courier New"/>
+          <w:sz w:val="20"/>
+          <w:szCs w:val="20"/>
+        </w:rPr>
+        <w:t>không</w:t>
+      </w:r>
+      <w:proofErr w:type="gramEnd"/>
+      <w:r>
+        <w:rPr>
+          <w:rFonts w:ascii="Courier New" w:eastAsia="Times New Roman" w:hAnsi="Courier New" w:cs="Courier New"/>
+          <w:sz w:val="20"/>
+          <w:szCs w:val="20"/>
+        </w:rPr>
+        <w:t xml:space="preserve"> tìm thấy resource</w:t>
       </w:r>
     </w:p>
     <w:p>
@@ -2411,13 +2680,23 @@
           <w:szCs w:val="20"/>
         </w:rPr>
       </w:pPr>
-      <w:r>
-        <w:rPr>
-          <w:rFonts w:ascii="Courier New" w:eastAsia="Times New Roman" w:hAnsi="Courier New" w:cs="Courier New"/>
-          <w:sz w:val="20"/>
-          <w:szCs w:val="20"/>
-        </w:rPr>
-        <w:t>trùng dữ liệu</w:t>
+      <w:proofErr w:type="gramStart"/>
+      <w:r>
+        <w:rPr>
+          <w:rFonts w:ascii="Courier New" w:eastAsia="Times New Roman" w:hAnsi="Courier New" w:cs="Courier New"/>
+          <w:sz w:val="20"/>
+          <w:szCs w:val="20"/>
+        </w:rPr>
+        <w:t>trùng</w:t>
+      </w:r>
+      <w:proofErr w:type="gramEnd"/>
+      <w:r>
+        <w:rPr>
+          <w:rFonts w:ascii="Courier New" w:eastAsia="Times New Roman" w:hAnsi="Courier New" w:cs="Courier New"/>
+          <w:sz w:val="20"/>
+          <w:szCs w:val="20"/>
+        </w:rPr>
+        <w:t xml:space="preserve"> dữ liệu</w:t>
       </w:r>
     </w:p>
     <w:p>
@@ -2448,13 +2727,23 @@
           <w:szCs w:val="20"/>
         </w:rPr>
       </w:pPr>
-      <w:r>
-        <w:rPr>
-          <w:rFonts w:ascii="Courier New" w:eastAsia="Times New Roman" w:hAnsi="Courier New" w:cs="Courier New"/>
-          <w:sz w:val="20"/>
-          <w:szCs w:val="20"/>
-        </w:rPr>
-        <w:t>chưa đăng nhập</w:t>
+      <w:proofErr w:type="gramStart"/>
+      <w:r>
+        <w:rPr>
+          <w:rFonts w:ascii="Courier New" w:eastAsia="Times New Roman" w:hAnsi="Courier New" w:cs="Courier New"/>
+          <w:sz w:val="20"/>
+          <w:szCs w:val="20"/>
+        </w:rPr>
+        <w:t>chưa</w:t>
+      </w:r>
+      <w:proofErr w:type="gramEnd"/>
+      <w:r>
+        <w:rPr>
+          <w:rFonts w:ascii="Courier New" w:eastAsia="Times New Roman" w:hAnsi="Courier New" w:cs="Courier New"/>
+          <w:sz w:val="20"/>
+          <w:szCs w:val="20"/>
+        </w:rPr>
+        <w:t xml:space="preserve"> đăng nhập</w:t>
       </w:r>
     </w:p>
     <w:p>
@@ -2485,13 +2774,23 @@
           <w:szCs w:val="20"/>
         </w:rPr>
       </w:pPr>
-      <w:r>
-        <w:rPr>
-          <w:rFonts w:ascii="Courier New" w:eastAsia="Times New Roman" w:hAnsi="Courier New" w:cs="Courier New"/>
-          <w:sz w:val="20"/>
-          <w:szCs w:val="20"/>
-        </w:rPr>
-        <w:t>không có quyền</w:t>
+      <w:proofErr w:type="gramStart"/>
+      <w:r>
+        <w:rPr>
+          <w:rFonts w:ascii="Courier New" w:eastAsia="Times New Roman" w:hAnsi="Courier New" w:cs="Courier New"/>
+          <w:sz w:val="20"/>
+          <w:szCs w:val="20"/>
+        </w:rPr>
+        <w:t>không</w:t>
+      </w:r>
+      <w:proofErr w:type="gramEnd"/>
+      <w:r>
+        <w:rPr>
+          <w:rFonts w:ascii="Courier New" w:eastAsia="Times New Roman" w:hAnsi="Courier New" w:cs="Courier New"/>
+          <w:sz w:val="20"/>
+          <w:szCs w:val="20"/>
+        </w:rPr>
+        <w:t xml:space="preserve"> có quyền</w:t>
       </w:r>
     </w:p>
     <w:p>
@@ -2571,7 +2870,25 @@
           <w:sz w:val="24"/>
           <w:szCs w:val="24"/>
         </w:rPr>
-        <w:t>Nếu module có API mới, mình sẽ thêm docs vào OpenAPI để chạy được trong Swagger:</w:t>
+        <w:t xml:space="preserve">Nếu module có API mới, mình sẽ thêm </w:t>
+      </w:r>
+      <w:proofErr w:type="gramStart"/>
+      <w:r>
+        <w:rPr>
+          <w:rFonts w:ascii="Times New Roman" w:eastAsia="Times New Roman" w:hAnsi="Times New Roman" w:cs="Times New Roman"/>
+          <w:sz w:val="24"/>
+          <w:szCs w:val="24"/>
+        </w:rPr>
+        <w:t>docs</w:t>
+      </w:r>
+      <w:proofErr w:type="gramEnd"/>
+      <w:r>
+        <w:rPr>
+          <w:rFonts w:ascii="Times New Roman" w:eastAsia="Times New Roman" w:hAnsi="Times New Roman" w:cs="Times New Roman"/>
+          <w:sz w:val="24"/>
+          <w:szCs w:val="24"/>
+        </w:rPr>
+        <w:t xml:space="preserve"> vào OpenAPI để chạy được trong Swagger:</w:t>
       </w:r>
     </w:p>
     <w:p>
@@ -2658,13 +2975,23 @@
           <w:szCs w:val="20"/>
         </w:rPr>
       </w:pPr>
-      <w:r>
-        <w:rPr>
-          <w:rFonts w:ascii="Courier New" w:eastAsia="Times New Roman" w:hAnsi="Courier New" w:cs="Courier New"/>
-          <w:sz w:val="20"/>
-          <w:szCs w:val="20"/>
-        </w:rPr>
-        <w:t>npm run docs:check</w:t>
+      <w:proofErr w:type="gramStart"/>
+      <w:r>
+        <w:rPr>
+          <w:rFonts w:ascii="Courier New" w:eastAsia="Times New Roman" w:hAnsi="Courier New" w:cs="Courier New"/>
+          <w:sz w:val="20"/>
+          <w:szCs w:val="20"/>
+        </w:rPr>
+        <w:t>npm</w:t>
+      </w:r>
+      <w:proofErr w:type="gramEnd"/>
+      <w:r>
+        <w:rPr>
+          <w:rFonts w:ascii="Courier New" w:eastAsia="Times New Roman" w:hAnsi="Courier New" w:cs="Courier New"/>
+          <w:sz w:val="20"/>
+          <w:szCs w:val="20"/>
+        </w:rPr>
+        <w:t xml:space="preserve"> run docs:check</w:t>
       </w:r>
     </w:p>
     <w:p>
@@ -2739,13 +3066,23 @@
           <w:szCs w:val="20"/>
         </w:rPr>
       </w:pPr>
-      <w:r>
-        <w:rPr>
-          <w:rFonts w:ascii="Courier New" w:eastAsia="Times New Roman" w:hAnsi="Courier New" w:cs="Courier New"/>
-          <w:sz w:val="20"/>
-          <w:szCs w:val="20"/>
-        </w:rPr>
-        <w:t>validate input</w:t>
+      <w:proofErr w:type="gramStart"/>
+      <w:r>
+        <w:rPr>
+          <w:rFonts w:ascii="Courier New" w:eastAsia="Times New Roman" w:hAnsi="Courier New" w:cs="Courier New"/>
+          <w:sz w:val="20"/>
+          <w:szCs w:val="20"/>
+        </w:rPr>
+        <w:t>validate</w:t>
+      </w:r>
+      <w:proofErr w:type="gramEnd"/>
+      <w:r>
+        <w:rPr>
+          <w:rFonts w:ascii="Courier New" w:eastAsia="Times New Roman" w:hAnsi="Courier New" w:cs="Courier New"/>
+          <w:sz w:val="20"/>
+          <w:szCs w:val="20"/>
+        </w:rPr>
+        <w:t xml:space="preserve"> input</w:t>
       </w:r>
     </w:p>
     <w:p>
@@ -2776,6 +3113,7 @@
           <w:szCs w:val="20"/>
         </w:rPr>
       </w:pPr>
+      <w:proofErr w:type="gramStart"/>
       <w:r>
         <w:rPr>
           <w:rFonts w:ascii="Courier New" w:eastAsia="Times New Roman" w:hAnsi="Courier New" w:cs="Courier New"/>
@@ -2784,6 +3122,7 @@
         </w:rPr>
         <w:t>tạo/sửa/xóa/list</w:t>
       </w:r>
+      <w:proofErr w:type="gramEnd"/>
     </w:p>
     <w:p>
       <w:pPr>
@@ -2813,6 +3152,7 @@
           <w:szCs w:val="20"/>
         </w:rPr>
       </w:pPr>
+      <w:proofErr w:type="gramStart"/>
       <w:r>
         <w:rPr>
           <w:rFonts w:ascii="Courier New" w:eastAsia="Times New Roman" w:hAnsi="Courier New" w:cs="Courier New"/>
@@ -2821,6 +3161,7 @@
         </w:rPr>
         <w:t>auth/permission</w:t>
       </w:r>
+      <w:proofErr w:type="gramEnd"/>
     </w:p>
     <w:p>
       <w:pPr>
@@ -2850,13 +3191,23 @@
           <w:szCs w:val="20"/>
         </w:rPr>
       </w:pPr>
-      <w:r>
-        <w:rPr>
-          <w:rFonts w:ascii="Courier New" w:eastAsia="Times New Roman" w:hAnsi="Courier New" w:cs="Courier New"/>
-          <w:sz w:val="20"/>
-          <w:szCs w:val="20"/>
-        </w:rPr>
-        <w:t>lỗi 400/401/403/404/409</w:t>
+      <w:proofErr w:type="gramStart"/>
+      <w:r>
+        <w:rPr>
+          <w:rFonts w:ascii="Courier New" w:eastAsia="Times New Roman" w:hAnsi="Courier New" w:cs="Courier New"/>
+          <w:sz w:val="20"/>
+          <w:szCs w:val="20"/>
+        </w:rPr>
+        <w:t>lỗi</w:t>
+      </w:r>
+      <w:proofErr w:type="gramEnd"/>
+      <w:r>
+        <w:rPr>
+          <w:rFonts w:ascii="Courier New" w:eastAsia="Times New Roman" w:hAnsi="Courier New" w:cs="Courier New"/>
+          <w:sz w:val="20"/>
+          <w:szCs w:val="20"/>
+        </w:rPr>
+        <w:t xml:space="preserve"> 400/401/403/404/409</w:t>
       </w:r>
     </w:p>
     <w:p>
@@ -2887,13 +3238,23 @@
           <w:szCs w:val="20"/>
         </w:rPr>
       </w:pPr>
-      <w:r>
-        <w:rPr>
-          <w:rFonts w:ascii="Courier New" w:eastAsia="Times New Roman" w:hAnsi="Courier New" w:cs="Courier New"/>
-          <w:sz w:val="20"/>
-          <w:szCs w:val="20"/>
-        </w:rPr>
-        <w:t>transaction nếu có</w:t>
+      <w:proofErr w:type="gramStart"/>
+      <w:r>
+        <w:rPr>
+          <w:rFonts w:ascii="Courier New" w:eastAsia="Times New Roman" w:hAnsi="Courier New" w:cs="Courier New"/>
+          <w:sz w:val="20"/>
+          <w:szCs w:val="20"/>
+        </w:rPr>
+        <w:t>transaction</w:t>
+      </w:r>
+      <w:proofErr w:type="gramEnd"/>
+      <w:r>
+        <w:rPr>
+          <w:rFonts w:ascii="Courier New" w:eastAsia="Times New Roman" w:hAnsi="Courier New" w:cs="Courier New"/>
+          <w:sz w:val="20"/>
+          <w:szCs w:val="20"/>
+        </w:rPr>
+        <w:t xml:space="preserve"> nếu có</w:t>
       </w:r>
     </w:p>
     <w:p>
@@ -2967,13 +3328,23 @@
           <w:szCs w:val="20"/>
         </w:rPr>
       </w:pPr>
-      <w:r>
-        <w:rPr>
-          <w:rFonts w:ascii="Courier New" w:eastAsia="Times New Roman" w:hAnsi="Courier New" w:cs="Courier New"/>
-          <w:sz w:val="20"/>
-          <w:szCs w:val="20"/>
-        </w:rPr>
-        <w:t>npm test</w:t>
+      <w:proofErr w:type="gramStart"/>
+      <w:r>
+        <w:rPr>
+          <w:rFonts w:ascii="Courier New" w:eastAsia="Times New Roman" w:hAnsi="Courier New" w:cs="Courier New"/>
+          <w:sz w:val="20"/>
+          <w:szCs w:val="20"/>
+        </w:rPr>
+        <w:t>npm</w:t>
+      </w:r>
+      <w:proofErr w:type="gramEnd"/>
+      <w:r>
+        <w:rPr>
+          <w:rFonts w:ascii="Courier New" w:eastAsia="Times New Roman" w:hAnsi="Courier New" w:cs="Courier New"/>
+          <w:sz w:val="20"/>
+          <w:szCs w:val="20"/>
+        </w:rPr>
+        <w:t xml:space="preserve"> test</w:t>
       </w:r>
     </w:p>
     <w:p>
@@ -3004,13 +3375,23 @@
           <w:szCs w:val="20"/>
         </w:rPr>
       </w:pPr>
-      <w:r>
-        <w:rPr>
-          <w:rFonts w:ascii="Courier New" w:eastAsia="Times New Roman" w:hAnsi="Courier New" w:cs="Courier New"/>
-          <w:sz w:val="20"/>
-          <w:szCs w:val="20"/>
-        </w:rPr>
-        <w:t>npm run lint</w:t>
+      <w:proofErr w:type="gramStart"/>
+      <w:r>
+        <w:rPr>
+          <w:rFonts w:ascii="Courier New" w:eastAsia="Times New Roman" w:hAnsi="Courier New" w:cs="Courier New"/>
+          <w:sz w:val="20"/>
+          <w:szCs w:val="20"/>
+        </w:rPr>
+        <w:t>npm</w:t>
+      </w:r>
+      <w:proofErr w:type="gramEnd"/>
+      <w:r>
+        <w:rPr>
+          <w:rFonts w:ascii="Courier New" w:eastAsia="Times New Roman" w:hAnsi="Courier New" w:cs="Courier New"/>
+          <w:sz w:val="20"/>
+          <w:szCs w:val="20"/>
+        </w:rPr>
+        <w:t xml:space="preserve"> run lint</w:t>
       </w:r>
     </w:p>
     <w:p>
@@ -3041,13 +3422,23 @@
           <w:szCs w:val="20"/>
         </w:rPr>
       </w:pPr>
-      <w:r>
-        <w:rPr>
-          <w:rFonts w:ascii="Courier New" w:eastAsia="Times New Roman" w:hAnsi="Courier New" w:cs="Courier New"/>
-          <w:sz w:val="20"/>
-          <w:szCs w:val="20"/>
-        </w:rPr>
-        <w:t>npm run docs:check</w:t>
+      <w:proofErr w:type="gramStart"/>
+      <w:r>
+        <w:rPr>
+          <w:rFonts w:ascii="Courier New" w:eastAsia="Times New Roman" w:hAnsi="Courier New" w:cs="Courier New"/>
+          <w:sz w:val="20"/>
+          <w:szCs w:val="20"/>
+        </w:rPr>
+        <w:t>npm</w:t>
+      </w:r>
+      <w:proofErr w:type="gramEnd"/>
+      <w:r>
+        <w:rPr>
+          <w:rFonts w:ascii="Courier New" w:eastAsia="Times New Roman" w:hAnsi="Courier New" w:cs="Courier New"/>
+          <w:sz w:val="20"/>
+          <w:szCs w:val="20"/>
+        </w:rPr>
+        <w:t xml:space="preserve"> run docs:check</w:t>
       </w:r>
     </w:p>
     <w:p>
@@ -3119,13 +3510,23 @@
           <w:szCs w:val="20"/>
         </w:rPr>
       </w:pPr>
-      <w:r>
-        <w:rPr>
-          <w:rFonts w:ascii="Courier New" w:eastAsia="Times New Roman" w:hAnsi="Courier New" w:cs="Courier New"/>
-          <w:sz w:val="20"/>
-          <w:szCs w:val="20"/>
-        </w:rPr>
-        <w:t>git status</w:t>
+      <w:proofErr w:type="gramStart"/>
+      <w:r>
+        <w:rPr>
+          <w:rFonts w:ascii="Courier New" w:eastAsia="Times New Roman" w:hAnsi="Courier New" w:cs="Courier New"/>
+          <w:sz w:val="20"/>
+          <w:szCs w:val="20"/>
+        </w:rPr>
+        <w:t>git</w:t>
+      </w:r>
+      <w:proofErr w:type="gramEnd"/>
+      <w:r>
+        <w:rPr>
+          <w:rFonts w:ascii="Courier New" w:eastAsia="Times New Roman" w:hAnsi="Courier New" w:cs="Courier New"/>
+          <w:sz w:val="20"/>
+          <w:szCs w:val="20"/>
+        </w:rPr>
+        <w:t xml:space="preserve"> status</w:t>
       </w:r>
     </w:p>
     <w:p>
@@ -3155,13 +3556,23 @@
           <w:szCs w:val="20"/>
         </w:rPr>
       </w:pPr>
-      <w:r>
-        <w:rPr>
-          <w:rFonts w:ascii="Courier New" w:eastAsia="Times New Roman" w:hAnsi="Courier New" w:cs="Courier New"/>
-          <w:sz w:val="20"/>
-          <w:szCs w:val="20"/>
-        </w:rPr>
-        <w:t>git add đúng file đã sửa</w:t>
+      <w:proofErr w:type="gramStart"/>
+      <w:r>
+        <w:rPr>
+          <w:rFonts w:ascii="Courier New" w:eastAsia="Times New Roman" w:hAnsi="Courier New" w:cs="Courier New"/>
+          <w:sz w:val="20"/>
+          <w:szCs w:val="20"/>
+        </w:rPr>
+        <w:t>git</w:t>
+      </w:r>
+      <w:proofErr w:type="gramEnd"/>
+      <w:r>
+        <w:rPr>
+          <w:rFonts w:ascii="Courier New" w:eastAsia="Times New Roman" w:hAnsi="Courier New" w:cs="Courier New"/>
+          <w:sz w:val="20"/>
+          <w:szCs w:val="20"/>
+        </w:rPr>
+        <w:t xml:space="preserve"> add đúng file đã sửa</w:t>
       </w:r>
     </w:p>
     <w:p>
@@ -3191,13 +3602,23 @@
           <w:szCs w:val="20"/>
         </w:rPr>
       </w:pPr>
-      <w:r>
-        <w:rPr>
-          <w:rFonts w:ascii="Courier New" w:eastAsia="Times New Roman" w:hAnsi="Courier New" w:cs="Courier New"/>
-          <w:sz w:val="20"/>
-          <w:szCs w:val="20"/>
-        </w:rPr>
-        <w:t>git commit -m "feat: add ..."</w:t>
+      <w:proofErr w:type="gramStart"/>
+      <w:r>
+        <w:rPr>
+          <w:rFonts w:ascii="Courier New" w:eastAsia="Times New Roman" w:hAnsi="Courier New" w:cs="Courier New"/>
+          <w:sz w:val="20"/>
+          <w:szCs w:val="20"/>
+        </w:rPr>
+        <w:t>git</w:t>
+      </w:r>
+      <w:proofErr w:type="gramEnd"/>
+      <w:r>
+        <w:rPr>
+          <w:rFonts w:ascii="Courier New" w:eastAsia="Times New Roman" w:hAnsi="Courier New" w:cs="Courier New"/>
+          <w:sz w:val="20"/>
+          <w:szCs w:val="20"/>
+        </w:rPr>
+        <w:t xml:space="preserve"> commit -m "feat: add ..."</w:t>
       </w:r>
     </w:p>
     <w:p>
@@ -3227,13 +3648,23 @@
           <w:szCs w:val="20"/>
         </w:rPr>
       </w:pPr>
-      <w:r>
-        <w:rPr>
-          <w:rFonts w:ascii="Courier New" w:eastAsia="Times New Roman" w:hAnsi="Courier New" w:cs="Courier New"/>
-          <w:sz w:val="20"/>
-          <w:szCs w:val="20"/>
-        </w:rPr>
-        <w:t>git push origin HEAD</w:t>
+      <w:proofErr w:type="gramStart"/>
+      <w:r>
+        <w:rPr>
+          <w:rFonts w:ascii="Courier New" w:eastAsia="Times New Roman" w:hAnsi="Courier New" w:cs="Courier New"/>
+          <w:sz w:val="20"/>
+          <w:szCs w:val="20"/>
+        </w:rPr>
+        <w:t>git</w:t>
+      </w:r>
+      <w:proofErr w:type="gramEnd"/>
+      <w:r>
+        <w:rPr>
+          <w:rFonts w:ascii="Courier New" w:eastAsia="Times New Roman" w:hAnsi="Courier New" w:cs="Courier New"/>
+          <w:sz w:val="20"/>
+          <w:szCs w:val="20"/>
+        </w:rPr>
+        <w:t xml:space="preserve"> push origin HEAD</w:t>
       </w:r>
     </w:p>
     <w:p>
@@ -7219,7 +7650,25 @@
                 <w:sz w:val="24"/>
                 <w:szCs w:val="24"/>
               </w:rPr>
-              <w:t>Lấy thông tin thanh toán của đơn: số tiền, nội dung chuyển khoản, trạng thái.</w:t>
+              <w:t xml:space="preserve">Lấy thông tin thanh toán của </w:t>
+            </w:r>
+            <w:proofErr w:type="gramStart"/>
+            <w:r>
+              <w:rPr>
+                <w:rFonts w:ascii="Times New Roman" w:eastAsia="Times New Roman" w:hAnsi="Times New Roman" w:cs="Times New Roman"/>
+                <w:sz w:val="24"/>
+                <w:szCs w:val="24"/>
+              </w:rPr>
+              <w:t>đơn:</w:t>
+            </w:r>
+            <w:proofErr w:type="gramEnd"/>
+            <w:r>
+              <w:rPr>
+                <w:rFonts w:ascii="Times New Roman" w:eastAsia="Times New Roman" w:hAnsi="Times New Roman" w:cs="Times New Roman"/>
+                <w:sz w:val="24"/>
+                <w:szCs w:val="24"/>
+              </w:rPr>
+              <w:t xml:space="preserve"> số tiền, nội dung chuyển khoản, trạng thái.</w:t>
             </w:r>
           </w:p>
         </w:tc>
@@ -9412,7 +9861,25 @@
                 <w:sz w:val="24"/>
                 <w:szCs w:val="24"/>
               </w:rPr>
-              <w:t>Lấy danh sách bài viết đã publish, có phân trang.</w:t>
+              <w:t xml:space="preserve">Lấy danh sách bài viết đã </w:t>
+            </w:r>
+            <w:proofErr w:type="gramStart"/>
+            <w:r>
+              <w:rPr>
+                <w:rFonts w:ascii="Times New Roman" w:eastAsia="Times New Roman" w:hAnsi="Times New Roman" w:cs="Times New Roman"/>
+                <w:sz w:val="24"/>
+                <w:szCs w:val="24"/>
+              </w:rPr>
+              <w:t>publish,</w:t>
+            </w:r>
+            <w:proofErr w:type="gramEnd"/>
+            <w:r>
+              <w:rPr>
+                <w:rFonts w:ascii="Times New Roman" w:eastAsia="Times New Roman" w:hAnsi="Times New Roman" w:cs="Times New Roman"/>
+                <w:sz w:val="24"/>
+                <w:szCs w:val="24"/>
+              </w:rPr>
+              <w:t xml:space="preserve"> có phân trang.</w:t>
             </w:r>
           </w:p>
         </w:tc>
@@ -13152,13 +13619,23 @@
                 <w:szCs w:val="24"/>
               </w:rPr>
             </w:pPr>
-            <w:r>
-              <w:rPr>
-                <w:rFonts w:ascii="Times New Roman" w:eastAsia="Times New Roman" w:hAnsi="Times New Roman" w:cs="Times New Roman"/>
-                <w:sz w:val="24"/>
-                <w:szCs w:val="24"/>
-              </w:rPr>
-              <w:t>Thêm item tồn kho cho variant.</w:t>
+            <w:proofErr w:type="gramStart"/>
+            <w:r>
+              <w:rPr>
+                <w:rFonts w:ascii="Times New Roman" w:eastAsia="Times New Roman" w:hAnsi="Times New Roman" w:cs="Times New Roman"/>
+                <w:sz w:val="24"/>
+                <w:szCs w:val="24"/>
+              </w:rPr>
+              <w:t>Thêm</w:t>
+            </w:r>
+            <w:proofErr w:type="gramEnd"/>
+            <w:r>
+              <w:rPr>
+                <w:rFonts w:ascii="Times New Roman" w:eastAsia="Times New Roman" w:hAnsi="Times New Roman" w:cs="Times New Roman"/>
+                <w:sz w:val="24"/>
+                <w:szCs w:val="24"/>
+              </w:rPr>
+              <w:t xml:space="preserve"> item tồn kho cho variant.</w:t>
             </w:r>
           </w:p>
         </w:tc>
@@ -13238,7 +13715,25 @@
                 <w:sz w:val="24"/>
                 <w:szCs w:val="24"/>
               </w:rPr>
-              <w:t>Cập nhật tình trạng item: available, rented, cleaning, damaged.</w:t>
+              <w:t xml:space="preserve">Cập nhật tình trạng item: available, rented, </w:t>
+            </w:r>
+            <w:proofErr w:type="gramStart"/>
+            <w:r>
+              <w:rPr>
+                <w:rFonts w:ascii="Times New Roman" w:eastAsia="Times New Roman" w:hAnsi="Times New Roman" w:cs="Times New Roman"/>
+                <w:sz w:val="24"/>
+                <w:szCs w:val="24"/>
+              </w:rPr>
+              <w:t>cleaning,</w:t>
+            </w:r>
+            <w:proofErr w:type="gramEnd"/>
+            <w:r>
+              <w:rPr>
+                <w:rFonts w:ascii="Times New Roman" w:eastAsia="Times New Roman" w:hAnsi="Times New Roman" w:cs="Times New Roman"/>
+                <w:sz w:val="24"/>
+                <w:szCs w:val="24"/>
+              </w:rPr>
+              <w:t xml:space="preserve"> damaged.</w:t>
             </w:r>
           </w:p>
         </w:tc>
@@ -15465,7 +15960,25 @@
           <w:sz w:val="24"/>
           <w:szCs w:val="24"/>
         </w:rPr>
-        <w:t>Nếu mới bắt đầu backend thật, mình khuyên làm theo thứ tự này:</w:t>
+        <w:t xml:space="preserve">Nếu mới bắt đầu backend thật, mình khuyên làm </w:t>
+      </w:r>
+      <w:proofErr w:type="gramStart"/>
+      <w:r>
+        <w:rPr>
+          <w:rFonts w:ascii="Times New Roman" w:eastAsia="Times New Roman" w:hAnsi="Times New Roman" w:cs="Times New Roman"/>
+          <w:sz w:val="24"/>
+          <w:szCs w:val="24"/>
+        </w:rPr>
+        <w:t>theo</w:t>
+      </w:r>
+      <w:proofErr w:type="gramEnd"/>
+      <w:r>
+        <w:rPr>
+          <w:rFonts w:ascii="Times New Roman" w:eastAsia="Times New Roman" w:hAnsi="Times New Roman" w:cs="Times New Roman"/>
+          <w:sz w:val="24"/>
+          <w:szCs w:val="24"/>
+        </w:rPr>
+        <w:t xml:space="preserve"> thứ tự này:</w:t>
       </w:r>
     </w:p>
     <w:p>
@@ -15773,7 +16286,25 @@
           <w:sz w:val="20"/>
           <w:szCs w:val="20"/>
         </w:rPr>
-        <w:t>GET    /api/products/{productId}</w:t>
+        <w:t>GET    /api/products</w:t>
+      </w:r>
+      <w:proofErr w:type="gramStart"/>
+      <w:r>
+        <w:rPr>
+          <w:rFonts w:ascii="Courier New" w:eastAsia="Times New Roman" w:hAnsi="Courier New" w:cs="Courier New"/>
+          <w:sz w:val="20"/>
+          <w:szCs w:val="20"/>
+        </w:rPr>
+        <w:t>/{</w:t>
+      </w:r>
+      <w:proofErr w:type="gramEnd"/>
+      <w:r>
+        <w:rPr>
+          <w:rFonts w:ascii="Courier New" w:eastAsia="Times New Roman" w:hAnsi="Courier New" w:cs="Courier New"/>
+          <w:sz w:val="20"/>
+          <w:szCs w:val="20"/>
+        </w:rPr>
+        <w:t>productId}</w:t>
       </w:r>
     </w:p>
     <w:p>
@@ -15975,13 +16506,23 @@
           <w:szCs w:val="20"/>
         </w:rPr>
       </w:pPr>
-      <w:r>
-        <w:rPr>
-          <w:rFonts w:ascii="Courier New" w:eastAsia="Times New Roman" w:hAnsi="Courier New" w:cs="Courier New"/>
-          <w:sz w:val="20"/>
-          <w:szCs w:val="20"/>
-        </w:rPr>
-        <w:t>PATCH  /api/cart/items/{cartItemId}</w:t>
+      <w:proofErr w:type="gramStart"/>
+      <w:r>
+        <w:rPr>
+          <w:rFonts w:ascii="Courier New" w:eastAsia="Times New Roman" w:hAnsi="Courier New" w:cs="Courier New"/>
+          <w:sz w:val="20"/>
+          <w:szCs w:val="20"/>
+        </w:rPr>
+        <w:t>PATCH  /</w:t>
+      </w:r>
+      <w:proofErr w:type="gramEnd"/>
+      <w:r>
+        <w:rPr>
+          <w:rFonts w:ascii="Courier New" w:eastAsia="Times New Roman" w:hAnsi="Courier New" w:cs="Courier New"/>
+          <w:sz w:val="20"/>
+          <w:szCs w:val="20"/>
+        </w:rPr>
+        <w:t>api/cart/items/{cartItemId}</w:t>
       </w:r>
     </w:p>
     <w:p>
@@ -16017,7 +16558,25 @@
           <w:sz w:val="20"/>
           <w:szCs w:val="20"/>
         </w:rPr>
-        <w:t>DELETE /api/cart/items/{cartItemId}</w:t>
+        <w:t>DELETE /api/cart/items</w:t>
+      </w:r>
+      <w:proofErr w:type="gramStart"/>
+      <w:r>
+        <w:rPr>
+          <w:rFonts w:ascii="Courier New" w:eastAsia="Times New Roman" w:hAnsi="Courier New" w:cs="Courier New"/>
+          <w:sz w:val="20"/>
+          <w:szCs w:val="20"/>
+        </w:rPr>
+        <w:t>/{</w:t>
+      </w:r>
+      <w:proofErr w:type="gramEnd"/>
+      <w:r>
+        <w:rPr>
+          <w:rFonts w:ascii="Courier New" w:eastAsia="Times New Roman" w:hAnsi="Courier New" w:cs="Courier New"/>
+          <w:sz w:val="20"/>
+          <w:szCs w:val="20"/>
+        </w:rPr>
+        <w:t>cartItemId}</w:t>
       </w:r>
     </w:p>
     <w:p>
@@ -16153,7 +16712,25 @@
           <w:sz w:val="20"/>
           <w:szCs w:val="20"/>
         </w:rPr>
-        <w:t>GET    /api/orders/{orderId}</w:t>
+        <w:t>GET    /api/orders</w:t>
+      </w:r>
+      <w:proofErr w:type="gramStart"/>
+      <w:r>
+        <w:rPr>
+          <w:rFonts w:ascii="Courier New" w:eastAsia="Times New Roman" w:hAnsi="Courier New" w:cs="Courier New"/>
+          <w:sz w:val="20"/>
+          <w:szCs w:val="20"/>
+        </w:rPr>
+        <w:t>/{</w:t>
+      </w:r>
+      <w:proofErr w:type="gramEnd"/>
+      <w:r>
+        <w:rPr>
+          <w:rFonts w:ascii="Courier New" w:eastAsia="Times New Roman" w:hAnsi="Courier New" w:cs="Courier New"/>
+          <w:sz w:val="20"/>
+          <w:szCs w:val="20"/>
+        </w:rPr>
+        <w:t>orderId}</w:t>
       </w:r>
     </w:p>
     <w:p>
@@ -16189,7 +16766,25 @@
           <w:sz w:val="20"/>
           <w:szCs w:val="20"/>
         </w:rPr>
-        <w:t>GET    /api/orders/code/{orderCode}</w:t>
+        <w:t>GET    /api/orders/code</w:t>
+      </w:r>
+      <w:proofErr w:type="gramStart"/>
+      <w:r>
+        <w:rPr>
+          <w:rFonts w:ascii="Courier New" w:eastAsia="Times New Roman" w:hAnsi="Courier New" w:cs="Courier New"/>
+          <w:sz w:val="20"/>
+          <w:szCs w:val="20"/>
+        </w:rPr>
+        <w:t>/{</w:t>
+      </w:r>
+      <w:proofErr w:type="gramEnd"/>
+      <w:r>
+        <w:rPr>
+          <w:rFonts w:ascii="Courier New" w:eastAsia="Times New Roman" w:hAnsi="Courier New" w:cs="Courier New"/>
+          <w:sz w:val="20"/>
+          <w:szCs w:val="20"/>
+        </w:rPr>
+        <w:t>orderCode}</w:t>
       </w:r>
     </w:p>
     <w:p>
@@ -16289,7 +16884,25 @@
           <w:sz w:val="20"/>
           <w:szCs w:val="20"/>
         </w:rPr>
-        <w:t>GET    /api/news/slug/{slug}</w:t>
+        <w:t>GET    /api/news/slug</w:t>
+      </w:r>
+      <w:proofErr w:type="gramStart"/>
+      <w:r>
+        <w:rPr>
+          <w:rFonts w:ascii="Courier New" w:eastAsia="Times New Roman" w:hAnsi="Courier New" w:cs="Courier New"/>
+          <w:sz w:val="20"/>
+          <w:szCs w:val="20"/>
+        </w:rPr>
+        <w:t>/{</w:t>
+      </w:r>
+      <w:proofErr w:type="gramEnd"/>
+      <w:r>
+        <w:rPr>
+          <w:rFonts w:ascii="Courier New" w:eastAsia="Times New Roman" w:hAnsi="Courier New" w:cs="Courier New"/>
+          <w:sz w:val="20"/>
+          <w:szCs w:val="20"/>
+        </w:rPr>
+        <w:t>slug}</w:t>
       </w:r>
     </w:p>
     <w:p>
@@ -16425,7 +17038,67 @@
           <w:sz w:val="20"/>
           <w:szCs w:val="20"/>
         </w:rPr>
-        <w:t>GET    /api/tryon/{requestId}</w:t>
+        <w:t>GET    /api/tryon</w:t>
+      </w:r>
+      <w:proofErr w:type="gramStart"/>
+      <w:r>
+        <w:rPr>
+          <w:rFonts w:ascii="Courier New" w:eastAsia="Times New Roman" w:hAnsi="Courier New" w:cs="Courier New"/>
+          <w:sz w:val="20"/>
+          <w:szCs w:val="20"/>
+        </w:rPr>
+        <w:t>/{</w:t>
+      </w:r>
+      <w:proofErr w:type="gramEnd"/>
+      <w:r>
+        <w:rPr>
+          <w:rFonts w:ascii="Courier New" w:eastAsia="Times New Roman" w:hAnsi="Courier New" w:cs="Courier New"/>
+          <w:sz w:val="20"/>
+          <w:szCs w:val="20"/>
+        </w:rPr>
+        <w:t>requestId}</w:t>
+      </w:r>
+    </w:p>
+    <w:p>
+      <w:pPr>
+        <w:pStyle w:val="NormalWeb"/>
+      </w:pPr>
+      <w:r>
+        <w:t>Đây là bộ path đủ để thay dần phần frontend đang dùng localStorage/static data sang backend thật mà chưa ôm quá rộng.</w:t>
+      </w:r>
+      <w:r>
+        <w:br/>
+      </w:r>
+      <w:r>
+        <w:br/>
+      </w:r>
+      <w:r>
+        <w:br/>
+      </w:r>
+      <w:r>
+        <w:t xml:space="preserve">Dựa trên repo hiện tại, backend đang có nền ASP.NET Core + EF Core/MySQL, JWT auth sơ khởi, </w:t>
+      </w:r>
+      <w:r>
+        <w:rPr>
+          <w:rFonts w:ascii="Courier New" w:hAnsi="Courier New" w:cs="Courier New"/>
+          <w:sz w:val="20"/>
+          <w:szCs w:val="20"/>
+        </w:rPr>
+        <w:t>AuthController</w:t>
+      </w:r>
+      <w:r>
+        <w:t xml:space="preserve">, </w:t>
+      </w:r>
+      <w:r>
+        <w:rPr>
+          <w:rFonts w:ascii="Courier New" w:hAnsi="Courier New" w:cs="Courier New"/>
+          <w:sz w:val="20"/>
+          <w:szCs w:val="20"/>
+        </w:rPr>
+        <w:t>ContactController</w:t>
+      </w:r>
+      <w:r>
+        <w:t>, health check, migration đầu tiên và khá nhiều model domain. Kế hoạch nên đi từ “xương sống sống còn” tới các phần dễ/mở rộng hơn như sau.</w:t>
       </w:r>
     </w:p>
     <w:p>
@@ -16440,11 +17113,2736 @@
       <w:r>
         <w:rPr>
           <w:rFonts w:ascii="Times New Roman" w:eastAsia="Times New Roman" w:hAnsi="Times New Roman" w:cs="Times New Roman"/>
-          <w:sz w:val="24"/>
-          <w:szCs w:val="24"/>
-        </w:rPr>
-        <w:t>Đây là bộ path đủ để thay dần phần frontend đang dùng localStorage/static data sang backend thật mà chưa ôm quá rộng.</w:t>
-      </w:r>
+          <w:b/>
+          <w:bCs/>
+          <w:sz w:val="24"/>
+          <w:szCs w:val="24"/>
+        </w:rPr>
+        <w:t>Kế Hoạch Backend</w:t>
+      </w:r>
+    </w:p>
+    <w:p>
+      <w:pPr>
+        <w:numPr>
+          <w:ilvl w:val="0"/>
+          <w:numId w:val="2"/>
+        </w:numPr>
+        <w:spacing w:before="100" w:beforeAutospacing="1" w:after="100" w:afterAutospacing="1" w:line="240" w:lineRule="auto"/>
+        <w:rPr>
+          <w:rFonts w:ascii="Times New Roman" w:eastAsia="Times New Roman" w:hAnsi="Times New Roman" w:cs="Times New Roman"/>
+          <w:sz w:val="24"/>
+          <w:szCs w:val="24"/>
+        </w:rPr>
+      </w:pPr>
+      <w:r>
+        <w:rPr>
+          <w:rFonts w:ascii="Times New Roman" w:eastAsia="Times New Roman" w:hAnsi="Times New Roman" w:cs="Times New Roman"/>
+          <w:b/>
+          <w:bCs/>
+          <w:sz w:val="24"/>
+          <w:szCs w:val="24"/>
+        </w:rPr>
+        <w:t>Chuẩn hóa nền tảng backend</w:t>
+      </w:r>
+    </w:p>
+    <w:p>
+      <w:pPr>
+        <w:numPr>
+          <w:ilvl w:val="1"/>
+          <w:numId w:val="2"/>
+        </w:numPr>
+        <w:spacing w:before="100" w:beforeAutospacing="1" w:after="100" w:afterAutospacing="1" w:line="240" w:lineRule="auto"/>
+        <w:rPr>
+          <w:rFonts w:ascii="Times New Roman" w:eastAsia="Times New Roman" w:hAnsi="Times New Roman" w:cs="Times New Roman"/>
+          <w:sz w:val="24"/>
+          <w:szCs w:val="24"/>
+        </w:rPr>
+      </w:pPr>
+      <w:r>
+        <w:rPr>
+          <w:rFonts w:ascii="Times New Roman" w:eastAsia="Times New Roman" w:hAnsi="Times New Roman" w:cs="Times New Roman"/>
+          <w:sz w:val="24"/>
+          <w:szCs w:val="24"/>
+        </w:rPr>
+        <w:t xml:space="preserve">Rà lại kiến trúc folder: </w:t>
+      </w:r>
+      <w:r>
+        <w:rPr>
+          <w:rFonts w:ascii="Courier New" w:eastAsia="Times New Roman" w:hAnsi="Courier New" w:cs="Courier New"/>
+          <w:sz w:val="20"/>
+          <w:szCs w:val="20"/>
+        </w:rPr>
+        <w:t>Controllers</w:t>
+      </w:r>
+      <w:r>
+        <w:rPr>
+          <w:rFonts w:ascii="Times New Roman" w:eastAsia="Times New Roman" w:hAnsi="Times New Roman" w:cs="Times New Roman"/>
+          <w:sz w:val="24"/>
+          <w:szCs w:val="24"/>
+        </w:rPr>
+        <w:t xml:space="preserve">, </w:t>
+      </w:r>
+      <w:r>
+        <w:rPr>
+          <w:rFonts w:ascii="Courier New" w:eastAsia="Times New Roman" w:hAnsi="Courier New" w:cs="Courier New"/>
+          <w:sz w:val="20"/>
+          <w:szCs w:val="20"/>
+        </w:rPr>
+        <w:t>Services</w:t>
+      </w:r>
+      <w:r>
+        <w:rPr>
+          <w:rFonts w:ascii="Times New Roman" w:eastAsia="Times New Roman" w:hAnsi="Times New Roman" w:cs="Times New Roman"/>
+          <w:sz w:val="24"/>
+          <w:szCs w:val="24"/>
+        </w:rPr>
+        <w:t xml:space="preserve">, </w:t>
+      </w:r>
+      <w:r>
+        <w:rPr>
+          <w:rFonts w:ascii="Courier New" w:eastAsia="Times New Roman" w:hAnsi="Courier New" w:cs="Courier New"/>
+          <w:sz w:val="20"/>
+          <w:szCs w:val="20"/>
+        </w:rPr>
+        <w:t>Contracts</w:t>
+      </w:r>
+      <w:r>
+        <w:rPr>
+          <w:rFonts w:ascii="Times New Roman" w:eastAsia="Times New Roman" w:hAnsi="Times New Roman" w:cs="Times New Roman"/>
+          <w:sz w:val="24"/>
+          <w:szCs w:val="24"/>
+        </w:rPr>
+        <w:t xml:space="preserve">, </w:t>
+      </w:r>
+      <w:r>
+        <w:rPr>
+          <w:rFonts w:ascii="Courier New" w:eastAsia="Times New Roman" w:hAnsi="Courier New" w:cs="Courier New"/>
+          <w:sz w:val="20"/>
+          <w:szCs w:val="20"/>
+        </w:rPr>
+        <w:t>Data</w:t>
+      </w:r>
+      <w:r>
+        <w:rPr>
+          <w:rFonts w:ascii="Times New Roman" w:eastAsia="Times New Roman" w:hAnsi="Times New Roman" w:cs="Times New Roman"/>
+          <w:sz w:val="24"/>
+          <w:szCs w:val="24"/>
+        </w:rPr>
+        <w:t xml:space="preserve">, </w:t>
+      </w:r>
+      <w:r>
+        <w:rPr>
+          <w:rFonts w:ascii="Courier New" w:eastAsia="Times New Roman" w:hAnsi="Courier New" w:cs="Courier New"/>
+          <w:sz w:val="20"/>
+          <w:szCs w:val="20"/>
+        </w:rPr>
+        <w:t>Models</w:t>
+      </w:r>
+      <w:r>
+        <w:rPr>
+          <w:rFonts w:ascii="Times New Roman" w:eastAsia="Times New Roman" w:hAnsi="Times New Roman" w:cs="Times New Roman"/>
+          <w:sz w:val="24"/>
+          <w:szCs w:val="24"/>
+        </w:rPr>
+        <w:t xml:space="preserve">, </w:t>
+      </w:r>
+      <w:r>
+        <w:rPr>
+          <w:rFonts w:ascii="Courier New" w:eastAsia="Times New Roman" w:hAnsi="Courier New" w:cs="Courier New"/>
+          <w:sz w:val="20"/>
+          <w:szCs w:val="20"/>
+        </w:rPr>
+        <w:t>Common</w:t>
+      </w:r>
+      <w:r>
+        <w:rPr>
+          <w:rFonts w:ascii="Times New Roman" w:eastAsia="Times New Roman" w:hAnsi="Times New Roman" w:cs="Times New Roman"/>
+          <w:sz w:val="24"/>
+          <w:szCs w:val="24"/>
+        </w:rPr>
+        <w:t>.</w:t>
+      </w:r>
+    </w:p>
+    <w:p>
+      <w:pPr>
+        <w:numPr>
+          <w:ilvl w:val="1"/>
+          <w:numId w:val="2"/>
+        </w:numPr>
+        <w:spacing w:before="100" w:beforeAutospacing="1" w:after="100" w:afterAutospacing="1" w:line="240" w:lineRule="auto"/>
+        <w:rPr>
+          <w:rFonts w:ascii="Times New Roman" w:eastAsia="Times New Roman" w:hAnsi="Times New Roman" w:cs="Times New Roman"/>
+          <w:sz w:val="24"/>
+          <w:szCs w:val="24"/>
+        </w:rPr>
+      </w:pPr>
+      <w:r>
+        <w:rPr>
+          <w:rFonts w:ascii="Times New Roman" w:eastAsia="Times New Roman" w:hAnsi="Times New Roman" w:cs="Times New Roman"/>
+          <w:sz w:val="24"/>
+          <w:szCs w:val="24"/>
+        </w:rPr>
+        <w:t>Thống nhất response format, error codes, validation, exception middleware.</w:t>
+      </w:r>
+    </w:p>
+    <w:p>
+      <w:pPr>
+        <w:numPr>
+          <w:ilvl w:val="1"/>
+          <w:numId w:val="2"/>
+        </w:numPr>
+        <w:spacing w:before="100" w:beforeAutospacing="1" w:after="100" w:afterAutospacing="1" w:line="240" w:lineRule="auto"/>
+        <w:rPr>
+          <w:rFonts w:ascii="Times New Roman" w:eastAsia="Times New Roman" w:hAnsi="Times New Roman" w:cs="Times New Roman"/>
+          <w:sz w:val="24"/>
+          <w:szCs w:val="24"/>
+        </w:rPr>
+      </w:pPr>
+      <w:r>
+        <w:rPr>
+          <w:rFonts w:ascii="Times New Roman" w:eastAsia="Times New Roman" w:hAnsi="Times New Roman" w:cs="Times New Roman"/>
+          <w:sz w:val="24"/>
+          <w:szCs w:val="24"/>
+        </w:rPr>
+        <w:t xml:space="preserve">Hoàn thiện config </w:t>
+      </w:r>
+      <w:proofErr w:type="gramStart"/>
+      <w:r>
+        <w:rPr>
+          <w:rFonts w:ascii="Times New Roman" w:eastAsia="Times New Roman" w:hAnsi="Times New Roman" w:cs="Times New Roman"/>
+          <w:sz w:val="24"/>
+          <w:szCs w:val="24"/>
+        </w:rPr>
+        <w:t>theo</w:t>
+      </w:r>
+      <w:proofErr w:type="gramEnd"/>
+      <w:r>
+        <w:rPr>
+          <w:rFonts w:ascii="Times New Roman" w:eastAsia="Times New Roman" w:hAnsi="Times New Roman" w:cs="Times New Roman"/>
+          <w:sz w:val="24"/>
+          <w:szCs w:val="24"/>
+        </w:rPr>
+        <w:t xml:space="preserve"> môi trường: local/dev/prod/test.</w:t>
+      </w:r>
+    </w:p>
+    <w:p>
+      <w:pPr>
+        <w:numPr>
+          <w:ilvl w:val="1"/>
+          <w:numId w:val="2"/>
+        </w:numPr>
+        <w:spacing w:before="100" w:beforeAutospacing="1" w:after="100" w:afterAutospacing="1" w:line="240" w:lineRule="auto"/>
+        <w:rPr>
+          <w:rFonts w:ascii="Times New Roman" w:eastAsia="Times New Roman" w:hAnsi="Times New Roman" w:cs="Times New Roman"/>
+          <w:sz w:val="24"/>
+          <w:szCs w:val="24"/>
+        </w:rPr>
+      </w:pPr>
+      <w:r>
+        <w:rPr>
+          <w:rFonts w:ascii="Times New Roman" w:eastAsia="Times New Roman" w:hAnsi="Times New Roman" w:cs="Times New Roman"/>
+          <w:sz w:val="24"/>
+          <w:szCs w:val="24"/>
+        </w:rPr>
+        <w:t>Chuẩn hóa CORS, Swagger, health check, logging.</w:t>
+      </w:r>
+    </w:p>
+    <w:p>
+      <w:pPr>
+        <w:numPr>
+          <w:ilvl w:val="1"/>
+          <w:numId w:val="2"/>
+        </w:numPr>
+        <w:spacing w:before="100" w:beforeAutospacing="1" w:after="100" w:afterAutospacing="1" w:line="240" w:lineRule="auto"/>
+        <w:rPr>
+          <w:rFonts w:ascii="Times New Roman" w:eastAsia="Times New Roman" w:hAnsi="Times New Roman" w:cs="Times New Roman"/>
+          <w:sz w:val="24"/>
+          <w:szCs w:val="24"/>
+        </w:rPr>
+      </w:pPr>
+      <w:r>
+        <w:rPr>
+          <w:rFonts w:ascii="Times New Roman" w:eastAsia="Times New Roman" w:hAnsi="Times New Roman" w:cs="Times New Roman"/>
+          <w:sz w:val="24"/>
+          <w:szCs w:val="24"/>
+        </w:rPr>
+        <w:t>Thiết lập test integration ổn định bằng test database/in-memory provider.</w:t>
+      </w:r>
+    </w:p>
+    <w:p>
+      <w:pPr>
+        <w:numPr>
+          <w:ilvl w:val="0"/>
+          <w:numId w:val="2"/>
+        </w:numPr>
+        <w:spacing w:before="100" w:beforeAutospacing="1" w:after="100" w:afterAutospacing="1" w:line="240" w:lineRule="auto"/>
+        <w:rPr>
+          <w:rFonts w:ascii="Times New Roman" w:eastAsia="Times New Roman" w:hAnsi="Times New Roman" w:cs="Times New Roman"/>
+          <w:sz w:val="24"/>
+          <w:szCs w:val="24"/>
+        </w:rPr>
+      </w:pPr>
+      <w:r>
+        <w:rPr>
+          <w:rFonts w:ascii="Times New Roman" w:eastAsia="Times New Roman" w:hAnsi="Times New Roman" w:cs="Times New Roman"/>
+          <w:b/>
+          <w:bCs/>
+          <w:sz w:val="24"/>
+          <w:szCs w:val="24"/>
+        </w:rPr>
+        <w:t>Thiết kế database và domain cốt lõi</w:t>
+      </w:r>
+    </w:p>
+    <w:p>
+      <w:pPr>
+        <w:numPr>
+          <w:ilvl w:val="1"/>
+          <w:numId w:val="2"/>
+        </w:numPr>
+        <w:spacing w:before="100" w:beforeAutospacing="1" w:after="100" w:afterAutospacing="1" w:line="240" w:lineRule="auto"/>
+        <w:rPr>
+          <w:rFonts w:ascii="Times New Roman" w:eastAsia="Times New Roman" w:hAnsi="Times New Roman" w:cs="Times New Roman"/>
+          <w:sz w:val="24"/>
+          <w:szCs w:val="24"/>
+        </w:rPr>
+      </w:pPr>
+      <w:r>
+        <w:rPr>
+          <w:rFonts w:ascii="Times New Roman" w:eastAsia="Times New Roman" w:hAnsi="Times New Roman" w:cs="Times New Roman"/>
+          <w:sz w:val="24"/>
+          <w:szCs w:val="24"/>
+        </w:rPr>
+        <w:lastRenderedPageBreak/>
+        <w:t>Chốt schema cho các module chính: user, role, product, variant, inventory, cart, order, payment, shipment, review, voucher, notification.</w:t>
+      </w:r>
+    </w:p>
+    <w:p>
+      <w:pPr>
+        <w:numPr>
+          <w:ilvl w:val="1"/>
+          <w:numId w:val="2"/>
+        </w:numPr>
+        <w:spacing w:before="100" w:beforeAutospacing="1" w:after="100" w:afterAutospacing="1" w:line="240" w:lineRule="auto"/>
+        <w:rPr>
+          <w:rFonts w:ascii="Times New Roman" w:eastAsia="Times New Roman" w:hAnsi="Times New Roman" w:cs="Times New Roman"/>
+          <w:sz w:val="24"/>
+          <w:szCs w:val="24"/>
+        </w:rPr>
+      </w:pPr>
+      <w:r>
+        <w:rPr>
+          <w:rFonts w:ascii="Times New Roman" w:eastAsia="Times New Roman" w:hAnsi="Times New Roman" w:cs="Times New Roman"/>
+          <w:sz w:val="24"/>
+          <w:szCs w:val="24"/>
+        </w:rPr>
+        <w:t>Rà quan hệ EF Core: required/optional, indexes, cascade delete, unique constraints.</w:t>
+      </w:r>
+    </w:p>
+    <w:p>
+      <w:pPr>
+        <w:numPr>
+          <w:ilvl w:val="1"/>
+          <w:numId w:val="2"/>
+        </w:numPr>
+        <w:spacing w:before="100" w:beforeAutospacing="1" w:after="100" w:afterAutospacing="1" w:line="240" w:lineRule="auto"/>
+        <w:rPr>
+          <w:rFonts w:ascii="Times New Roman" w:eastAsia="Times New Roman" w:hAnsi="Times New Roman" w:cs="Times New Roman"/>
+          <w:sz w:val="24"/>
+          <w:szCs w:val="24"/>
+        </w:rPr>
+      </w:pPr>
+      <w:proofErr w:type="gramStart"/>
+      <w:r>
+        <w:rPr>
+          <w:rFonts w:ascii="Times New Roman" w:eastAsia="Times New Roman" w:hAnsi="Times New Roman" w:cs="Times New Roman"/>
+          <w:sz w:val="24"/>
+          <w:szCs w:val="24"/>
+        </w:rPr>
+        <w:t>Thêm</w:t>
+      </w:r>
+      <w:proofErr w:type="gramEnd"/>
+      <w:r>
+        <w:rPr>
+          <w:rFonts w:ascii="Times New Roman" w:eastAsia="Times New Roman" w:hAnsi="Times New Roman" w:cs="Times New Roman"/>
+          <w:sz w:val="24"/>
+          <w:szCs w:val="24"/>
+        </w:rPr>
+        <w:t xml:space="preserve"> audit fields nếu cần: </w:t>
+      </w:r>
+      <w:r>
+        <w:rPr>
+          <w:rFonts w:ascii="Courier New" w:eastAsia="Times New Roman" w:hAnsi="Courier New" w:cs="Courier New"/>
+          <w:sz w:val="20"/>
+          <w:szCs w:val="20"/>
+        </w:rPr>
+        <w:t>CreatedAt</w:t>
+      </w:r>
+      <w:r>
+        <w:rPr>
+          <w:rFonts w:ascii="Times New Roman" w:eastAsia="Times New Roman" w:hAnsi="Times New Roman" w:cs="Times New Roman"/>
+          <w:sz w:val="24"/>
+          <w:szCs w:val="24"/>
+        </w:rPr>
+        <w:t xml:space="preserve">, </w:t>
+      </w:r>
+      <w:r>
+        <w:rPr>
+          <w:rFonts w:ascii="Courier New" w:eastAsia="Times New Roman" w:hAnsi="Courier New" w:cs="Courier New"/>
+          <w:sz w:val="20"/>
+          <w:szCs w:val="20"/>
+        </w:rPr>
+        <w:t>UpdatedAt</w:t>
+      </w:r>
+      <w:r>
+        <w:rPr>
+          <w:rFonts w:ascii="Times New Roman" w:eastAsia="Times New Roman" w:hAnsi="Times New Roman" w:cs="Times New Roman"/>
+          <w:sz w:val="24"/>
+          <w:szCs w:val="24"/>
+        </w:rPr>
+        <w:t xml:space="preserve">, </w:t>
+      </w:r>
+      <w:r>
+        <w:rPr>
+          <w:rFonts w:ascii="Courier New" w:eastAsia="Times New Roman" w:hAnsi="Courier New" w:cs="Courier New"/>
+          <w:sz w:val="20"/>
+          <w:szCs w:val="20"/>
+        </w:rPr>
+        <w:t>DeletedAt</w:t>
+      </w:r>
+      <w:r>
+        <w:rPr>
+          <w:rFonts w:ascii="Times New Roman" w:eastAsia="Times New Roman" w:hAnsi="Times New Roman" w:cs="Times New Roman"/>
+          <w:sz w:val="24"/>
+          <w:szCs w:val="24"/>
+        </w:rPr>
+        <w:t>.</w:t>
+      </w:r>
+    </w:p>
+    <w:p>
+      <w:pPr>
+        <w:numPr>
+          <w:ilvl w:val="1"/>
+          <w:numId w:val="2"/>
+        </w:numPr>
+        <w:spacing w:before="100" w:beforeAutospacing="1" w:after="100" w:afterAutospacing="1" w:line="240" w:lineRule="auto"/>
+        <w:rPr>
+          <w:rFonts w:ascii="Times New Roman" w:eastAsia="Times New Roman" w:hAnsi="Times New Roman" w:cs="Times New Roman"/>
+          <w:sz w:val="24"/>
+          <w:szCs w:val="24"/>
+        </w:rPr>
+      </w:pPr>
+      <w:r>
+        <w:rPr>
+          <w:rFonts w:ascii="Times New Roman" w:eastAsia="Times New Roman" w:hAnsi="Times New Roman" w:cs="Times New Roman"/>
+          <w:sz w:val="24"/>
+          <w:szCs w:val="24"/>
+        </w:rPr>
+        <w:t>Tách rõ status enum: order status, payment status, shipment status, refund status.</w:t>
+      </w:r>
+    </w:p>
+    <w:p>
+      <w:pPr>
+        <w:numPr>
+          <w:ilvl w:val="0"/>
+          <w:numId w:val="2"/>
+        </w:numPr>
+        <w:spacing w:before="100" w:beforeAutospacing="1" w:after="100" w:afterAutospacing="1" w:line="240" w:lineRule="auto"/>
+        <w:rPr>
+          <w:rFonts w:ascii="Times New Roman" w:eastAsia="Times New Roman" w:hAnsi="Times New Roman" w:cs="Times New Roman"/>
+          <w:sz w:val="24"/>
+          <w:szCs w:val="24"/>
+        </w:rPr>
+      </w:pPr>
+      <w:r>
+        <w:rPr>
+          <w:rFonts w:ascii="Times New Roman" w:eastAsia="Times New Roman" w:hAnsi="Times New Roman" w:cs="Times New Roman"/>
+          <w:b/>
+          <w:bCs/>
+          <w:sz w:val="24"/>
+          <w:szCs w:val="24"/>
+        </w:rPr>
+        <w:t>Auth và phân quyền</w:t>
+      </w:r>
+    </w:p>
+    <w:p>
+      <w:pPr>
+        <w:numPr>
+          <w:ilvl w:val="1"/>
+          <w:numId w:val="2"/>
+        </w:numPr>
+        <w:spacing w:before="100" w:beforeAutospacing="1" w:after="100" w:afterAutospacing="1" w:line="240" w:lineRule="auto"/>
+        <w:rPr>
+          <w:rFonts w:ascii="Times New Roman" w:eastAsia="Times New Roman" w:hAnsi="Times New Roman" w:cs="Times New Roman"/>
+          <w:sz w:val="24"/>
+          <w:szCs w:val="24"/>
+        </w:rPr>
+      </w:pPr>
+      <w:r>
+        <w:rPr>
+          <w:rFonts w:ascii="Times New Roman" w:eastAsia="Times New Roman" w:hAnsi="Times New Roman" w:cs="Times New Roman"/>
+          <w:sz w:val="24"/>
+          <w:szCs w:val="24"/>
+        </w:rPr>
+        <w:t>Hoàn thiện register/login/logout/refresh token.</w:t>
+      </w:r>
+    </w:p>
+    <w:p>
+      <w:pPr>
+        <w:numPr>
+          <w:ilvl w:val="1"/>
+          <w:numId w:val="2"/>
+        </w:numPr>
+        <w:spacing w:before="100" w:beforeAutospacing="1" w:after="100" w:afterAutospacing="1" w:line="240" w:lineRule="auto"/>
+        <w:rPr>
+          <w:rFonts w:ascii="Times New Roman" w:eastAsia="Times New Roman" w:hAnsi="Times New Roman" w:cs="Times New Roman"/>
+          <w:sz w:val="24"/>
+          <w:szCs w:val="24"/>
+        </w:rPr>
+      </w:pPr>
+      <w:r>
+        <w:rPr>
+          <w:rFonts w:ascii="Times New Roman" w:eastAsia="Times New Roman" w:hAnsi="Times New Roman" w:cs="Times New Roman"/>
+          <w:sz w:val="24"/>
+          <w:szCs w:val="24"/>
+        </w:rPr>
+        <w:t>Password hashing chuẩn, JWT expiration, refresh token rotation.</w:t>
+      </w:r>
+    </w:p>
+    <w:p>
+      <w:pPr>
+        <w:numPr>
+          <w:ilvl w:val="1"/>
+          <w:numId w:val="2"/>
+        </w:numPr>
+        <w:spacing w:before="100" w:beforeAutospacing="1" w:after="100" w:afterAutospacing="1" w:line="240" w:lineRule="auto"/>
+        <w:rPr>
+          <w:rFonts w:ascii="Times New Roman" w:eastAsia="Times New Roman" w:hAnsi="Times New Roman" w:cs="Times New Roman"/>
+          <w:sz w:val="24"/>
+          <w:szCs w:val="24"/>
+        </w:rPr>
+      </w:pPr>
+      <w:r>
+        <w:rPr>
+          <w:rFonts w:ascii="Times New Roman" w:eastAsia="Times New Roman" w:hAnsi="Times New Roman" w:cs="Times New Roman"/>
+          <w:sz w:val="24"/>
+          <w:szCs w:val="24"/>
+        </w:rPr>
+        <w:t>Role-based authorization: customer, shop owner, admin.</w:t>
+      </w:r>
+    </w:p>
+    <w:p>
+      <w:pPr>
+        <w:numPr>
+          <w:ilvl w:val="1"/>
+          <w:numId w:val="2"/>
+        </w:numPr>
+        <w:spacing w:before="100" w:beforeAutospacing="1" w:after="100" w:afterAutospacing="1" w:line="240" w:lineRule="auto"/>
+        <w:rPr>
+          <w:rFonts w:ascii="Times New Roman" w:eastAsia="Times New Roman" w:hAnsi="Times New Roman" w:cs="Times New Roman"/>
+          <w:sz w:val="24"/>
+          <w:szCs w:val="24"/>
+        </w:rPr>
+      </w:pPr>
+      <w:r>
+        <w:rPr>
+          <w:rFonts w:ascii="Times New Roman" w:eastAsia="Times New Roman" w:hAnsi="Times New Roman" w:cs="Times New Roman"/>
+          <w:sz w:val="24"/>
+          <w:szCs w:val="24"/>
+        </w:rPr>
+        <w:t xml:space="preserve">Endpoint lấy profile hiện tại: </w:t>
+      </w:r>
+      <w:r>
+        <w:rPr>
+          <w:rFonts w:ascii="Courier New" w:eastAsia="Times New Roman" w:hAnsi="Courier New" w:cs="Courier New"/>
+          <w:sz w:val="20"/>
+          <w:szCs w:val="20"/>
+        </w:rPr>
+        <w:t>GET /api/me</w:t>
+      </w:r>
+      <w:r>
+        <w:rPr>
+          <w:rFonts w:ascii="Times New Roman" w:eastAsia="Times New Roman" w:hAnsi="Times New Roman" w:cs="Times New Roman"/>
+          <w:sz w:val="24"/>
+          <w:szCs w:val="24"/>
+        </w:rPr>
+        <w:t>.</w:t>
+      </w:r>
+    </w:p>
+    <w:p>
+      <w:pPr>
+        <w:numPr>
+          <w:ilvl w:val="1"/>
+          <w:numId w:val="2"/>
+        </w:numPr>
+        <w:spacing w:before="100" w:beforeAutospacing="1" w:after="100" w:afterAutospacing="1" w:line="240" w:lineRule="auto"/>
+        <w:rPr>
+          <w:rFonts w:ascii="Times New Roman" w:eastAsia="Times New Roman" w:hAnsi="Times New Roman" w:cs="Times New Roman"/>
+          <w:sz w:val="24"/>
+          <w:szCs w:val="24"/>
+        </w:rPr>
+      </w:pPr>
+      <w:r>
+        <w:rPr>
+          <w:rFonts w:ascii="Times New Roman" w:eastAsia="Times New Roman" w:hAnsi="Times New Roman" w:cs="Times New Roman"/>
+          <w:sz w:val="24"/>
+          <w:szCs w:val="24"/>
+        </w:rPr>
+        <w:t>Update profile, đổi mật khẩu, quản lý địa chỉ người dùng.</w:t>
+      </w:r>
+    </w:p>
+    <w:p>
+      <w:pPr>
+        <w:numPr>
+          <w:ilvl w:val="1"/>
+          <w:numId w:val="2"/>
+        </w:numPr>
+        <w:spacing w:before="100" w:beforeAutospacing="1" w:after="100" w:afterAutospacing="1" w:line="240" w:lineRule="auto"/>
+        <w:rPr>
+          <w:rFonts w:ascii="Times New Roman" w:eastAsia="Times New Roman" w:hAnsi="Times New Roman" w:cs="Times New Roman"/>
+          <w:sz w:val="24"/>
+          <w:szCs w:val="24"/>
+        </w:rPr>
+      </w:pPr>
+      <w:r>
+        <w:rPr>
+          <w:rFonts w:ascii="Times New Roman" w:eastAsia="Times New Roman" w:hAnsi="Times New Roman" w:cs="Times New Roman"/>
+          <w:sz w:val="24"/>
+          <w:szCs w:val="24"/>
+        </w:rPr>
+        <w:t xml:space="preserve">Integration tests cho auth happy </w:t>
+      </w:r>
+      <w:proofErr w:type="gramStart"/>
+      <w:r>
+        <w:rPr>
+          <w:rFonts w:ascii="Times New Roman" w:eastAsia="Times New Roman" w:hAnsi="Times New Roman" w:cs="Times New Roman"/>
+          <w:sz w:val="24"/>
+          <w:szCs w:val="24"/>
+        </w:rPr>
+        <w:t>path và failure path</w:t>
+      </w:r>
+      <w:proofErr w:type="gramEnd"/>
+      <w:r>
+        <w:rPr>
+          <w:rFonts w:ascii="Times New Roman" w:eastAsia="Times New Roman" w:hAnsi="Times New Roman" w:cs="Times New Roman"/>
+          <w:sz w:val="24"/>
+          <w:szCs w:val="24"/>
+        </w:rPr>
+        <w:t>.</w:t>
+      </w:r>
+    </w:p>
+    <w:p>
+      <w:pPr>
+        <w:numPr>
+          <w:ilvl w:val="0"/>
+          <w:numId w:val="2"/>
+        </w:numPr>
+        <w:spacing w:before="100" w:beforeAutospacing="1" w:after="100" w:afterAutospacing="1" w:line="240" w:lineRule="auto"/>
+        <w:rPr>
+          <w:rFonts w:ascii="Times New Roman" w:eastAsia="Times New Roman" w:hAnsi="Times New Roman" w:cs="Times New Roman"/>
+          <w:sz w:val="24"/>
+          <w:szCs w:val="24"/>
+        </w:rPr>
+      </w:pPr>
+      <w:r>
+        <w:rPr>
+          <w:rFonts w:ascii="Times New Roman" w:eastAsia="Times New Roman" w:hAnsi="Times New Roman" w:cs="Times New Roman"/>
+          <w:b/>
+          <w:bCs/>
+          <w:sz w:val="24"/>
+          <w:szCs w:val="24"/>
+        </w:rPr>
+        <w:t>Product catalog</w:t>
+      </w:r>
+    </w:p>
+    <w:p>
+      <w:pPr>
+        <w:numPr>
+          <w:ilvl w:val="1"/>
+          <w:numId w:val="2"/>
+        </w:numPr>
+        <w:spacing w:before="100" w:beforeAutospacing="1" w:after="100" w:afterAutospacing="1" w:line="240" w:lineRule="auto"/>
+        <w:rPr>
+          <w:rFonts w:ascii="Times New Roman" w:eastAsia="Times New Roman" w:hAnsi="Times New Roman" w:cs="Times New Roman"/>
+          <w:sz w:val="24"/>
+          <w:szCs w:val="24"/>
+        </w:rPr>
+      </w:pPr>
+      <w:r>
+        <w:rPr>
+          <w:rFonts w:ascii="Times New Roman" w:eastAsia="Times New Roman" w:hAnsi="Times New Roman" w:cs="Times New Roman"/>
+          <w:sz w:val="24"/>
+          <w:szCs w:val="24"/>
+        </w:rPr>
+        <w:t>API categories, brands, shops.</w:t>
+      </w:r>
+    </w:p>
+    <w:p>
+      <w:pPr>
+        <w:numPr>
+          <w:ilvl w:val="1"/>
+          <w:numId w:val="2"/>
+        </w:numPr>
+        <w:spacing w:before="100" w:beforeAutospacing="1" w:after="100" w:afterAutospacing="1" w:line="240" w:lineRule="auto"/>
+        <w:rPr>
+          <w:rFonts w:ascii="Times New Roman" w:eastAsia="Times New Roman" w:hAnsi="Times New Roman" w:cs="Times New Roman"/>
+          <w:sz w:val="24"/>
+          <w:szCs w:val="24"/>
+        </w:rPr>
+      </w:pPr>
+      <w:r>
+        <w:rPr>
+          <w:rFonts w:ascii="Times New Roman" w:eastAsia="Times New Roman" w:hAnsi="Times New Roman" w:cs="Times New Roman"/>
+          <w:sz w:val="24"/>
+          <w:szCs w:val="24"/>
+        </w:rPr>
+        <w:t>API product list/detail/search/filter/sort/pagination.</w:t>
+      </w:r>
+    </w:p>
+    <w:p>
+      <w:pPr>
+        <w:numPr>
+          <w:ilvl w:val="1"/>
+          <w:numId w:val="2"/>
+        </w:numPr>
+        <w:spacing w:before="100" w:beforeAutospacing="1" w:after="100" w:afterAutospacing="1" w:line="240" w:lineRule="auto"/>
+        <w:rPr>
+          <w:rFonts w:ascii="Times New Roman" w:eastAsia="Times New Roman" w:hAnsi="Times New Roman" w:cs="Times New Roman"/>
+          <w:sz w:val="24"/>
+          <w:szCs w:val="24"/>
+        </w:rPr>
+      </w:pPr>
+      <w:r>
+        <w:rPr>
+          <w:rFonts w:ascii="Times New Roman" w:eastAsia="Times New Roman" w:hAnsi="Times New Roman" w:cs="Times New Roman"/>
+          <w:sz w:val="24"/>
+          <w:szCs w:val="24"/>
+        </w:rPr>
+        <w:t>Product variants: size, color, condition, price, stock.</w:t>
+      </w:r>
+    </w:p>
+    <w:p>
+      <w:pPr>
+        <w:numPr>
+          <w:ilvl w:val="1"/>
+          <w:numId w:val="2"/>
+        </w:numPr>
+        <w:spacing w:before="100" w:beforeAutospacing="1" w:after="100" w:afterAutospacing="1" w:line="240" w:lineRule="auto"/>
+        <w:rPr>
+          <w:rFonts w:ascii="Times New Roman" w:eastAsia="Times New Roman" w:hAnsi="Times New Roman" w:cs="Times New Roman"/>
+          <w:sz w:val="24"/>
+          <w:szCs w:val="24"/>
+        </w:rPr>
+      </w:pPr>
+      <w:r>
+        <w:rPr>
+          <w:rFonts w:ascii="Times New Roman" w:eastAsia="Times New Roman" w:hAnsi="Times New Roman" w:cs="Times New Roman"/>
+          <w:sz w:val="24"/>
+          <w:szCs w:val="24"/>
+        </w:rPr>
+        <w:t>Product images.</w:t>
+      </w:r>
+    </w:p>
+    <w:p>
+      <w:pPr>
+        <w:numPr>
+          <w:ilvl w:val="1"/>
+          <w:numId w:val="2"/>
+        </w:numPr>
+        <w:spacing w:before="100" w:beforeAutospacing="1" w:after="100" w:afterAutospacing="1" w:line="240" w:lineRule="auto"/>
+        <w:rPr>
+          <w:rFonts w:ascii="Times New Roman" w:eastAsia="Times New Roman" w:hAnsi="Times New Roman" w:cs="Times New Roman"/>
+          <w:sz w:val="24"/>
+          <w:szCs w:val="24"/>
+        </w:rPr>
+      </w:pPr>
+      <w:r>
+        <w:rPr>
+          <w:rFonts w:ascii="Times New Roman" w:eastAsia="Times New Roman" w:hAnsi="Times New Roman" w:cs="Times New Roman"/>
+          <w:sz w:val="24"/>
+          <w:szCs w:val="24"/>
+        </w:rPr>
+        <w:t>Like/favorite product.</w:t>
+      </w:r>
+    </w:p>
+    <w:p>
+      <w:pPr>
+        <w:numPr>
+          <w:ilvl w:val="1"/>
+          <w:numId w:val="2"/>
+        </w:numPr>
+        <w:spacing w:before="100" w:beforeAutospacing="1" w:after="100" w:afterAutospacing="1" w:line="240" w:lineRule="auto"/>
+        <w:rPr>
+          <w:rFonts w:ascii="Times New Roman" w:eastAsia="Times New Roman" w:hAnsi="Times New Roman" w:cs="Times New Roman"/>
+          <w:sz w:val="24"/>
+          <w:szCs w:val="24"/>
+        </w:rPr>
+      </w:pPr>
+      <w:r>
+        <w:rPr>
+          <w:rFonts w:ascii="Times New Roman" w:eastAsia="Times New Roman" w:hAnsi="Times New Roman" w:cs="Times New Roman"/>
+          <w:sz w:val="24"/>
+          <w:szCs w:val="24"/>
+        </w:rPr>
+        <w:t>Admin/shop owner CRUD sản phẩm.</w:t>
+      </w:r>
+    </w:p>
+    <w:p>
+      <w:pPr>
+        <w:numPr>
+          <w:ilvl w:val="1"/>
+          <w:numId w:val="2"/>
+        </w:numPr>
+        <w:spacing w:before="100" w:beforeAutospacing="1" w:after="100" w:afterAutospacing="1" w:line="240" w:lineRule="auto"/>
+        <w:rPr>
+          <w:rFonts w:ascii="Times New Roman" w:eastAsia="Times New Roman" w:hAnsi="Times New Roman" w:cs="Times New Roman"/>
+          <w:sz w:val="24"/>
+          <w:szCs w:val="24"/>
+        </w:rPr>
+      </w:pPr>
+      <w:r>
+        <w:rPr>
+          <w:rFonts w:ascii="Times New Roman" w:eastAsia="Times New Roman" w:hAnsi="Times New Roman" w:cs="Times New Roman"/>
+          <w:sz w:val="24"/>
+          <w:szCs w:val="24"/>
+        </w:rPr>
+        <w:t>Validate inventory và visibility.</w:t>
+      </w:r>
+    </w:p>
+    <w:p>
+      <w:pPr>
+        <w:numPr>
+          <w:ilvl w:val="0"/>
+          <w:numId w:val="2"/>
+        </w:numPr>
+        <w:spacing w:before="100" w:beforeAutospacing="1" w:after="100" w:afterAutospacing="1" w:line="240" w:lineRule="auto"/>
+        <w:rPr>
+          <w:rFonts w:ascii="Times New Roman" w:eastAsia="Times New Roman" w:hAnsi="Times New Roman" w:cs="Times New Roman"/>
+          <w:sz w:val="24"/>
+          <w:szCs w:val="24"/>
+        </w:rPr>
+      </w:pPr>
+      <w:r>
+        <w:rPr>
+          <w:rFonts w:ascii="Times New Roman" w:eastAsia="Times New Roman" w:hAnsi="Times New Roman" w:cs="Times New Roman"/>
+          <w:b/>
+          <w:bCs/>
+          <w:sz w:val="24"/>
+          <w:szCs w:val="24"/>
+        </w:rPr>
+        <w:t>Cart</w:t>
+      </w:r>
+    </w:p>
+    <w:p>
+      <w:pPr>
+        <w:numPr>
+          <w:ilvl w:val="1"/>
+          <w:numId w:val="2"/>
+        </w:numPr>
+        <w:spacing w:before="100" w:beforeAutospacing="1" w:after="100" w:afterAutospacing="1" w:line="240" w:lineRule="auto"/>
+        <w:rPr>
+          <w:rFonts w:ascii="Times New Roman" w:eastAsia="Times New Roman" w:hAnsi="Times New Roman" w:cs="Times New Roman"/>
+          <w:sz w:val="24"/>
+          <w:szCs w:val="24"/>
+        </w:rPr>
+      </w:pPr>
+      <w:r>
+        <w:rPr>
+          <w:rFonts w:ascii="Times New Roman" w:eastAsia="Times New Roman" w:hAnsi="Times New Roman" w:cs="Times New Roman"/>
+          <w:sz w:val="24"/>
+          <w:szCs w:val="24"/>
+        </w:rPr>
+        <w:t xml:space="preserve">Tạo/lấy cart </w:t>
+      </w:r>
+      <w:proofErr w:type="gramStart"/>
+      <w:r>
+        <w:rPr>
+          <w:rFonts w:ascii="Times New Roman" w:eastAsia="Times New Roman" w:hAnsi="Times New Roman" w:cs="Times New Roman"/>
+          <w:sz w:val="24"/>
+          <w:szCs w:val="24"/>
+        </w:rPr>
+        <w:t>theo</w:t>
+      </w:r>
+      <w:proofErr w:type="gramEnd"/>
+      <w:r>
+        <w:rPr>
+          <w:rFonts w:ascii="Times New Roman" w:eastAsia="Times New Roman" w:hAnsi="Times New Roman" w:cs="Times New Roman"/>
+          <w:sz w:val="24"/>
+          <w:szCs w:val="24"/>
+        </w:rPr>
+        <w:t xml:space="preserve"> user.</w:t>
+      </w:r>
+    </w:p>
+    <w:p>
+      <w:pPr>
+        <w:numPr>
+          <w:ilvl w:val="1"/>
+          <w:numId w:val="2"/>
+        </w:numPr>
+        <w:spacing w:before="100" w:beforeAutospacing="1" w:after="100" w:afterAutospacing="1" w:line="240" w:lineRule="auto"/>
+        <w:rPr>
+          <w:rFonts w:ascii="Times New Roman" w:eastAsia="Times New Roman" w:hAnsi="Times New Roman" w:cs="Times New Roman"/>
+          <w:sz w:val="24"/>
+          <w:szCs w:val="24"/>
+        </w:rPr>
+      </w:pPr>
+      <w:r>
+        <w:rPr>
+          <w:rFonts w:ascii="Times New Roman" w:eastAsia="Times New Roman" w:hAnsi="Times New Roman" w:cs="Times New Roman"/>
+          <w:sz w:val="24"/>
+          <w:szCs w:val="24"/>
+        </w:rPr>
+        <w:t>Add/update/remove cart item.</w:t>
+      </w:r>
+    </w:p>
+    <w:p>
+      <w:pPr>
+        <w:numPr>
+          <w:ilvl w:val="1"/>
+          <w:numId w:val="2"/>
+        </w:numPr>
+        <w:spacing w:before="100" w:beforeAutospacing="1" w:after="100" w:afterAutospacing="1" w:line="240" w:lineRule="auto"/>
+        <w:rPr>
+          <w:rFonts w:ascii="Times New Roman" w:eastAsia="Times New Roman" w:hAnsi="Times New Roman" w:cs="Times New Roman"/>
+          <w:sz w:val="24"/>
+          <w:szCs w:val="24"/>
+        </w:rPr>
+      </w:pPr>
+      <w:r>
+        <w:rPr>
+          <w:rFonts w:ascii="Times New Roman" w:eastAsia="Times New Roman" w:hAnsi="Times New Roman" w:cs="Times New Roman"/>
+          <w:sz w:val="24"/>
+          <w:szCs w:val="24"/>
+        </w:rPr>
+        <w:t>Validate product variant còn tồn kho.</w:t>
+      </w:r>
+    </w:p>
+    <w:p>
+      <w:pPr>
+        <w:numPr>
+          <w:ilvl w:val="1"/>
+          <w:numId w:val="2"/>
+        </w:numPr>
+        <w:spacing w:before="100" w:beforeAutospacing="1" w:after="100" w:afterAutospacing="1" w:line="240" w:lineRule="auto"/>
+        <w:rPr>
+          <w:rFonts w:ascii="Times New Roman" w:eastAsia="Times New Roman" w:hAnsi="Times New Roman" w:cs="Times New Roman"/>
+          <w:sz w:val="24"/>
+          <w:szCs w:val="24"/>
+        </w:rPr>
+      </w:pPr>
+      <w:r>
+        <w:rPr>
+          <w:rFonts w:ascii="Times New Roman" w:eastAsia="Times New Roman" w:hAnsi="Times New Roman" w:cs="Times New Roman"/>
+          <w:sz w:val="24"/>
+          <w:szCs w:val="24"/>
+        </w:rPr>
+        <w:t>Tính subtotal, discount preview, shipping preview nếu có.</w:t>
+      </w:r>
+    </w:p>
+    <w:p>
+      <w:pPr>
+        <w:numPr>
+          <w:ilvl w:val="1"/>
+          <w:numId w:val="2"/>
+        </w:numPr>
+        <w:spacing w:before="100" w:beforeAutospacing="1" w:after="100" w:afterAutospacing="1" w:line="240" w:lineRule="auto"/>
+        <w:rPr>
+          <w:rFonts w:ascii="Times New Roman" w:eastAsia="Times New Roman" w:hAnsi="Times New Roman" w:cs="Times New Roman"/>
+          <w:sz w:val="24"/>
+          <w:szCs w:val="24"/>
+        </w:rPr>
+      </w:pPr>
+      <w:r>
+        <w:rPr>
+          <w:rFonts w:ascii="Times New Roman" w:eastAsia="Times New Roman" w:hAnsi="Times New Roman" w:cs="Times New Roman"/>
+          <w:sz w:val="24"/>
+          <w:szCs w:val="24"/>
+        </w:rPr>
+        <w:t xml:space="preserve">Preserve compatibility với frontend hiện tại nếu vẫn còn dùng </w:t>
+      </w:r>
+      <w:r>
+        <w:rPr>
+          <w:rFonts w:ascii="Courier New" w:eastAsia="Times New Roman" w:hAnsi="Courier New" w:cs="Courier New"/>
+          <w:sz w:val="20"/>
+          <w:szCs w:val="20"/>
+        </w:rPr>
+        <w:t>localStorage</w:t>
+      </w:r>
+      <w:r>
+        <w:rPr>
+          <w:rFonts w:ascii="Times New Roman" w:eastAsia="Times New Roman" w:hAnsi="Times New Roman" w:cs="Times New Roman"/>
+          <w:sz w:val="24"/>
+          <w:szCs w:val="24"/>
+        </w:rPr>
+        <w:t>.</w:t>
+      </w:r>
+    </w:p>
+    <w:p>
+      <w:pPr>
+        <w:numPr>
+          <w:ilvl w:val="0"/>
+          <w:numId w:val="2"/>
+        </w:numPr>
+        <w:spacing w:before="100" w:beforeAutospacing="1" w:after="100" w:afterAutospacing="1" w:line="240" w:lineRule="auto"/>
+        <w:rPr>
+          <w:rFonts w:ascii="Times New Roman" w:eastAsia="Times New Roman" w:hAnsi="Times New Roman" w:cs="Times New Roman"/>
+          <w:sz w:val="24"/>
+          <w:szCs w:val="24"/>
+        </w:rPr>
+      </w:pPr>
+      <w:r>
+        <w:rPr>
+          <w:rFonts w:ascii="Times New Roman" w:eastAsia="Times New Roman" w:hAnsi="Times New Roman" w:cs="Times New Roman"/>
+          <w:b/>
+          <w:bCs/>
+          <w:sz w:val="24"/>
+          <w:szCs w:val="24"/>
+        </w:rPr>
+        <w:t>Order/rental workflow</w:t>
+      </w:r>
+    </w:p>
+    <w:p>
+      <w:pPr>
+        <w:numPr>
+          <w:ilvl w:val="1"/>
+          <w:numId w:val="2"/>
+        </w:numPr>
+        <w:spacing w:before="100" w:beforeAutospacing="1" w:after="100" w:afterAutospacing="1" w:line="240" w:lineRule="auto"/>
+        <w:rPr>
+          <w:rFonts w:ascii="Times New Roman" w:eastAsia="Times New Roman" w:hAnsi="Times New Roman" w:cs="Times New Roman"/>
+          <w:sz w:val="24"/>
+          <w:szCs w:val="24"/>
+        </w:rPr>
+      </w:pPr>
+      <w:r>
+        <w:rPr>
+          <w:rFonts w:ascii="Times New Roman" w:eastAsia="Times New Roman" w:hAnsi="Times New Roman" w:cs="Times New Roman"/>
+          <w:sz w:val="24"/>
+          <w:szCs w:val="24"/>
+        </w:rPr>
+        <w:t>Checkout từ cart.</w:t>
+      </w:r>
+    </w:p>
+    <w:p>
+      <w:pPr>
+        <w:numPr>
+          <w:ilvl w:val="1"/>
+          <w:numId w:val="2"/>
+        </w:numPr>
+        <w:spacing w:before="100" w:beforeAutospacing="1" w:after="100" w:afterAutospacing="1" w:line="240" w:lineRule="auto"/>
+        <w:rPr>
+          <w:rFonts w:ascii="Times New Roman" w:eastAsia="Times New Roman" w:hAnsi="Times New Roman" w:cs="Times New Roman"/>
+          <w:sz w:val="24"/>
+          <w:szCs w:val="24"/>
+        </w:rPr>
+      </w:pPr>
+      <w:r>
+        <w:rPr>
+          <w:rFonts w:ascii="Times New Roman" w:eastAsia="Times New Roman" w:hAnsi="Times New Roman" w:cs="Times New Roman"/>
+          <w:sz w:val="24"/>
+          <w:szCs w:val="24"/>
+        </w:rPr>
+        <w:t>Tạo order và order items.</w:t>
+      </w:r>
+    </w:p>
+    <w:p>
+      <w:pPr>
+        <w:numPr>
+          <w:ilvl w:val="1"/>
+          <w:numId w:val="2"/>
+        </w:numPr>
+        <w:spacing w:before="100" w:beforeAutospacing="1" w:after="100" w:afterAutospacing="1" w:line="240" w:lineRule="auto"/>
+        <w:rPr>
+          <w:rFonts w:ascii="Times New Roman" w:eastAsia="Times New Roman" w:hAnsi="Times New Roman" w:cs="Times New Roman"/>
+          <w:sz w:val="24"/>
+          <w:szCs w:val="24"/>
+        </w:rPr>
+      </w:pPr>
+      <w:r>
+        <w:rPr>
+          <w:rFonts w:ascii="Times New Roman" w:eastAsia="Times New Roman" w:hAnsi="Times New Roman" w:cs="Times New Roman"/>
+          <w:sz w:val="24"/>
+          <w:szCs w:val="24"/>
+        </w:rPr>
+        <w:t>Rental reservation: ngày thuê, ngày trả, availability check.</w:t>
+      </w:r>
+    </w:p>
+    <w:p>
+      <w:pPr>
+        <w:numPr>
+          <w:ilvl w:val="1"/>
+          <w:numId w:val="2"/>
+        </w:numPr>
+        <w:spacing w:before="100" w:beforeAutospacing="1" w:after="100" w:afterAutospacing="1" w:line="240" w:lineRule="auto"/>
+        <w:rPr>
+          <w:rFonts w:ascii="Times New Roman" w:eastAsia="Times New Roman" w:hAnsi="Times New Roman" w:cs="Times New Roman"/>
+          <w:sz w:val="24"/>
+          <w:szCs w:val="24"/>
+        </w:rPr>
+      </w:pPr>
+      <w:r>
+        <w:rPr>
+          <w:rFonts w:ascii="Times New Roman" w:eastAsia="Times New Roman" w:hAnsi="Times New Roman" w:cs="Times New Roman"/>
+          <w:sz w:val="24"/>
+          <w:szCs w:val="24"/>
+        </w:rPr>
+        <w:t>Order status history.</w:t>
+      </w:r>
+    </w:p>
+    <w:p>
+      <w:pPr>
+        <w:numPr>
+          <w:ilvl w:val="1"/>
+          <w:numId w:val="2"/>
+        </w:numPr>
+        <w:spacing w:before="100" w:beforeAutospacing="1" w:after="100" w:afterAutospacing="1" w:line="240" w:lineRule="auto"/>
+        <w:rPr>
+          <w:rFonts w:ascii="Times New Roman" w:eastAsia="Times New Roman" w:hAnsi="Times New Roman" w:cs="Times New Roman"/>
+          <w:sz w:val="24"/>
+          <w:szCs w:val="24"/>
+        </w:rPr>
+      </w:pPr>
+      <w:r>
+        <w:rPr>
+          <w:rFonts w:ascii="Times New Roman" w:eastAsia="Times New Roman" w:hAnsi="Times New Roman" w:cs="Times New Roman"/>
+          <w:sz w:val="24"/>
+          <w:szCs w:val="24"/>
+        </w:rPr>
+        <w:t>Cancel order.</w:t>
+      </w:r>
+    </w:p>
+    <w:p>
+      <w:pPr>
+        <w:numPr>
+          <w:ilvl w:val="1"/>
+          <w:numId w:val="2"/>
+        </w:numPr>
+        <w:spacing w:before="100" w:beforeAutospacing="1" w:after="100" w:afterAutospacing="1" w:line="240" w:lineRule="auto"/>
+        <w:rPr>
+          <w:rFonts w:ascii="Times New Roman" w:eastAsia="Times New Roman" w:hAnsi="Times New Roman" w:cs="Times New Roman"/>
+          <w:sz w:val="24"/>
+          <w:szCs w:val="24"/>
+        </w:rPr>
+      </w:pPr>
+      <w:r>
+        <w:rPr>
+          <w:rFonts w:ascii="Times New Roman" w:eastAsia="Times New Roman" w:hAnsi="Times New Roman" w:cs="Times New Roman"/>
+          <w:sz w:val="24"/>
+          <w:szCs w:val="24"/>
+        </w:rPr>
+        <w:t>Admin/shop owner update trạng thái.</w:t>
+      </w:r>
+    </w:p>
+    <w:p>
+      <w:pPr>
+        <w:numPr>
+          <w:ilvl w:val="1"/>
+          <w:numId w:val="2"/>
+        </w:numPr>
+        <w:spacing w:before="100" w:beforeAutospacing="1" w:after="100" w:afterAutospacing="1" w:line="240" w:lineRule="auto"/>
+        <w:rPr>
+          <w:rFonts w:ascii="Times New Roman" w:eastAsia="Times New Roman" w:hAnsi="Times New Roman" w:cs="Times New Roman"/>
+          <w:sz w:val="24"/>
+          <w:szCs w:val="24"/>
+        </w:rPr>
+      </w:pPr>
+      <w:r>
+        <w:rPr>
+          <w:rFonts w:ascii="Times New Roman" w:eastAsia="Times New Roman" w:hAnsi="Times New Roman" w:cs="Times New Roman"/>
+          <w:sz w:val="24"/>
+          <w:szCs w:val="24"/>
+        </w:rPr>
+        <w:t>Tests cho race condition cơ bản: không cho đặt quá số lượng tồn.</w:t>
+      </w:r>
+    </w:p>
+    <w:p>
+      <w:pPr>
+        <w:numPr>
+          <w:ilvl w:val="0"/>
+          <w:numId w:val="2"/>
+        </w:numPr>
+        <w:spacing w:before="100" w:beforeAutospacing="1" w:after="100" w:afterAutospacing="1" w:line="240" w:lineRule="auto"/>
+        <w:rPr>
+          <w:rFonts w:ascii="Times New Roman" w:eastAsia="Times New Roman" w:hAnsi="Times New Roman" w:cs="Times New Roman"/>
+          <w:sz w:val="24"/>
+          <w:szCs w:val="24"/>
+        </w:rPr>
+      </w:pPr>
+      <w:r>
+        <w:rPr>
+          <w:rFonts w:ascii="Times New Roman" w:eastAsia="Times New Roman" w:hAnsi="Times New Roman" w:cs="Times New Roman"/>
+          <w:b/>
+          <w:bCs/>
+          <w:sz w:val="24"/>
+          <w:szCs w:val="24"/>
+        </w:rPr>
+        <w:t>Payment</w:t>
+      </w:r>
+    </w:p>
+    <w:p>
+      <w:pPr>
+        <w:numPr>
+          <w:ilvl w:val="1"/>
+          <w:numId w:val="2"/>
+        </w:numPr>
+        <w:spacing w:before="100" w:beforeAutospacing="1" w:after="100" w:afterAutospacing="1" w:line="240" w:lineRule="auto"/>
+        <w:rPr>
+          <w:rFonts w:ascii="Times New Roman" w:eastAsia="Times New Roman" w:hAnsi="Times New Roman" w:cs="Times New Roman"/>
+          <w:sz w:val="24"/>
+          <w:szCs w:val="24"/>
+        </w:rPr>
+      </w:pPr>
+      <w:r>
+        <w:rPr>
+          <w:rFonts w:ascii="Times New Roman" w:eastAsia="Times New Roman" w:hAnsi="Times New Roman" w:cs="Times New Roman"/>
+          <w:sz w:val="24"/>
+          <w:szCs w:val="24"/>
+        </w:rPr>
+        <w:t>Thiết kế abstraction payment provider trước.</w:t>
+      </w:r>
+    </w:p>
+    <w:p>
+      <w:pPr>
+        <w:numPr>
+          <w:ilvl w:val="1"/>
+          <w:numId w:val="2"/>
+        </w:numPr>
+        <w:spacing w:before="100" w:beforeAutospacing="1" w:after="100" w:afterAutospacing="1" w:line="240" w:lineRule="auto"/>
+        <w:rPr>
+          <w:rFonts w:ascii="Times New Roman" w:eastAsia="Times New Roman" w:hAnsi="Times New Roman" w:cs="Times New Roman"/>
+          <w:sz w:val="24"/>
+          <w:szCs w:val="24"/>
+        </w:rPr>
+      </w:pPr>
+      <w:r>
+        <w:rPr>
+          <w:rFonts w:ascii="Times New Roman" w:eastAsia="Times New Roman" w:hAnsi="Times New Roman" w:cs="Times New Roman"/>
+          <w:sz w:val="24"/>
+          <w:szCs w:val="24"/>
+        </w:rPr>
+        <w:t>Mock/manual payment trước để hoàn thiện flow.</w:t>
+      </w:r>
+    </w:p>
+    <w:p>
+      <w:pPr>
+        <w:numPr>
+          <w:ilvl w:val="1"/>
+          <w:numId w:val="2"/>
+        </w:numPr>
+        <w:spacing w:before="100" w:beforeAutospacing="1" w:after="100" w:afterAutospacing="1" w:line="240" w:lineRule="auto"/>
+        <w:rPr>
+          <w:rFonts w:ascii="Times New Roman" w:eastAsia="Times New Roman" w:hAnsi="Times New Roman" w:cs="Times New Roman"/>
+          <w:sz w:val="24"/>
+          <w:szCs w:val="24"/>
+        </w:rPr>
+      </w:pPr>
+      <w:r>
+        <w:rPr>
+          <w:rFonts w:ascii="Times New Roman" w:eastAsia="Times New Roman" w:hAnsi="Times New Roman" w:cs="Times New Roman"/>
+          <w:sz w:val="24"/>
+          <w:szCs w:val="24"/>
+        </w:rPr>
+        <w:t>Sau đó mới tích hợp VNPay/MoMo nếu được yêu cầu.</w:t>
+      </w:r>
+    </w:p>
+    <w:p>
+      <w:pPr>
+        <w:numPr>
+          <w:ilvl w:val="1"/>
+          <w:numId w:val="2"/>
+        </w:numPr>
+        <w:spacing w:before="100" w:beforeAutospacing="1" w:after="100" w:afterAutospacing="1" w:line="240" w:lineRule="auto"/>
+        <w:rPr>
+          <w:rFonts w:ascii="Times New Roman" w:eastAsia="Times New Roman" w:hAnsi="Times New Roman" w:cs="Times New Roman"/>
+          <w:sz w:val="24"/>
+          <w:szCs w:val="24"/>
+        </w:rPr>
+      </w:pPr>
+      <w:r>
+        <w:rPr>
+          <w:rFonts w:ascii="Times New Roman" w:eastAsia="Times New Roman" w:hAnsi="Times New Roman" w:cs="Times New Roman"/>
+          <w:sz w:val="24"/>
+          <w:szCs w:val="24"/>
+        </w:rPr>
+        <w:t>Payment callback/webhook.</w:t>
+      </w:r>
+    </w:p>
+    <w:p>
+      <w:pPr>
+        <w:numPr>
+          <w:ilvl w:val="1"/>
+          <w:numId w:val="2"/>
+        </w:numPr>
+        <w:spacing w:before="100" w:beforeAutospacing="1" w:after="100" w:afterAutospacing="1" w:line="240" w:lineRule="auto"/>
+        <w:rPr>
+          <w:rFonts w:ascii="Times New Roman" w:eastAsia="Times New Roman" w:hAnsi="Times New Roman" w:cs="Times New Roman"/>
+          <w:sz w:val="24"/>
+          <w:szCs w:val="24"/>
+        </w:rPr>
+      </w:pPr>
+      <w:r>
+        <w:rPr>
+          <w:rFonts w:ascii="Times New Roman" w:eastAsia="Times New Roman" w:hAnsi="Times New Roman" w:cs="Times New Roman"/>
+          <w:sz w:val="24"/>
+          <w:szCs w:val="24"/>
+        </w:rPr>
+        <w:t>Refund model và trạng thái hoàn tiền.</w:t>
+      </w:r>
+    </w:p>
+    <w:p>
+      <w:pPr>
+        <w:numPr>
+          <w:ilvl w:val="1"/>
+          <w:numId w:val="2"/>
+        </w:numPr>
+        <w:spacing w:before="100" w:beforeAutospacing="1" w:after="100" w:afterAutospacing="1" w:line="240" w:lineRule="auto"/>
+        <w:rPr>
+          <w:rFonts w:ascii="Times New Roman" w:eastAsia="Times New Roman" w:hAnsi="Times New Roman" w:cs="Times New Roman"/>
+          <w:sz w:val="24"/>
+          <w:szCs w:val="24"/>
+        </w:rPr>
+      </w:pPr>
+      <w:r>
+        <w:rPr>
+          <w:rFonts w:ascii="Times New Roman" w:eastAsia="Times New Roman" w:hAnsi="Times New Roman" w:cs="Times New Roman"/>
+          <w:sz w:val="24"/>
+          <w:szCs w:val="24"/>
+        </w:rPr>
+        <w:t>Không đưa secret payment vào frontend.</w:t>
+      </w:r>
+    </w:p>
+    <w:p>
+      <w:pPr>
+        <w:numPr>
+          <w:ilvl w:val="0"/>
+          <w:numId w:val="2"/>
+        </w:numPr>
+        <w:spacing w:before="100" w:beforeAutospacing="1" w:after="100" w:afterAutospacing="1" w:line="240" w:lineRule="auto"/>
+        <w:rPr>
+          <w:rFonts w:ascii="Times New Roman" w:eastAsia="Times New Roman" w:hAnsi="Times New Roman" w:cs="Times New Roman"/>
+          <w:sz w:val="24"/>
+          <w:szCs w:val="24"/>
+        </w:rPr>
+      </w:pPr>
+      <w:r>
+        <w:rPr>
+          <w:rFonts w:ascii="Times New Roman" w:eastAsia="Times New Roman" w:hAnsi="Times New Roman" w:cs="Times New Roman"/>
+          <w:b/>
+          <w:bCs/>
+          <w:sz w:val="24"/>
+          <w:szCs w:val="24"/>
+        </w:rPr>
+        <w:t>Shipment</w:t>
+      </w:r>
+    </w:p>
+    <w:p>
+      <w:pPr>
+        <w:numPr>
+          <w:ilvl w:val="1"/>
+          <w:numId w:val="2"/>
+        </w:numPr>
+        <w:spacing w:before="100" w:beforeAutospacing="1" w:after="100" w:afterAutospacing="1" w:line="240" w:lineRule="auto"/>
+        <w:rPr>
+          <w:rFonts w:ascii="Times New Roman" w:eastAsia="Times New Roman" w:hAnsi="Times New Roman" w:cs="Times New Roman"/>
+          <w:sz w:val="24"/>
+          <w:szCs w:val="24"/>
+        </w:rPr>
+      </w:pPr>
+      <w:r>
+        <w:rPr>
+          <w:rFonts w:ascii="Times New Roman" w:eastAsia="Times New Roman" w:hAnsi="Times New Roman" w:cs="Times New Roman"/>
+          <w:sz w:val="24"/>
+          <w:szCs w:val="24"/>
+        </w:rPr>
+        <w:t xml:space="preserve">Shipment record </w:t>
+      </w:r>
+      <w:proofErr w:type="gramStart"/>
+      <w:r>
+        <w:rPr>
+          <w:rFonts w:ascii="Times New Roman" w:eastAsia="Times New Roman" w:hAnsi="Times New Roman" w:cs="Times New Roman"/>
+          <w:sz w:val="24"/>
+          <w:szCs w:val="24"/>
+        </w:rPr>
+        <w:t>theo</w:t>
+      </w:r>
+      <w:proofErr w:type="gramEnd"/>
+      <w:r>
+        <w:rPr>
+          <w:rFonts w:ascii="Times New Roman" w:eastAsia="Times New Roman" w:hAnsi="Times New Roman" w:cs="Times New Roman"/>
+          <w:sz w:val="24"/>
+          <w:szCs w:val="24"/>
+        </w:rPr>
+        <w:t xml:space="preserve"> order.</w:t>
+      </w:r>
+    </w:p>
+    <w:p>
+      <w:pPr>
+        <w:numPr>
+          <w:ilvl w:val="1"/>
+          <w:numId w:val="2"/>
+        </w:numPr>
+        <w:spacing w:before="100" w:beforeAutospacing="1" w:after="100" w:afterAutospacing="1" w:line="240" w:lineRule="auto"/>
+        <w:rPr>
+          <w:rFonts w:ascii="Times New Roman" w:eastAsia="Times New Roman" w:hAnsi="Times New Roman" w:cs="Times New Roman"/>
+          <w:sz w:val="24"/>
+          <w:szCs w:val="24"/>
+        </w:rPr>
+      </w:pPr>
+      <w:r>
+        <w:rPr>
+          <w:rFonts w:ascii="Times New Roman" w:eastAsia="Times New Roman" w:hAnsi="Times New Roman" w:cs="Times New Roman"/>
+          <w:sz w:val="24"/>
+          <w:szCs w:val="24"/>
+        </w:rPr>
+        <w:t>Tracking events.</w:t>
+      </w:r>
+    </w:p>
+    <w:p>
+      <w:pPr>
+        <w:numPr>
+          <w:ilvl w:val="1"/>
+          <w:numId w:val="2"/>
+        </w:numPr>
+        <w:spacing w:before="100" w:beforeAutospacing="1" w:after="100" w:afterAutospacing="1" w:line="240" w:lineRule="auto"/>
+        <w:rPr>
+          <w:rFonts w:ascii="Times New Roman" w:eastAsia="Times New Roman" w:hAnsi="Times New Roman" w:cs="Times New Roman"/>
+          <w:sz w:val="24"/>
+          <w:szCs w:val="24"/>
+        </w:rPr>
+      </w:pPr>
+      <w:r>
+        <w:rPr>
+          <w:rFonts w:ascii="Times New Roman" w:eastAsia="Times New Roman" w:hAnsi="Times New Roman" w:cs="Times New Roman"/>
+          <w:sz w:val="24"/>
+          <w:szCs w:val="24"/>
+        </w:rPr>
+        <w:t>Update delivery status.</w:t>
+      </w:r>
+    </w:p>
+    <w:p>
+      <w:pPr>
+        <w:numPr>
+          <w:ilvl w:val="1"/>
+          <w:numId w:val="2"/>
+        </w:numPr>
+        <w:spacing w:before="100" w:beforeAutospacing="1" w:after="100" w:afterAutospacing="1" w:line="240" w:lineRule="auto"/>
+        <w:rPr>
+          <w:rFonts w:ascii="Times New Roman" w:eastAsia="Times New Roman" w:hAnsi="Times New Roman" w:cs="Times New Roman"/>
+          <w:sz w:val="24"/>
+          <w:szCs w:val="24"/>
+        </w:rPr>
+      </w:pPr>
+      <w:r>
+        <w:rPr>
+          <w:rFonts w:ascii="Times New Roman" w:eastAsia="Times New Roman" w:hAnsi="Times New Roman" w:cs="Times New Roman"/>
+          <w:sz w:val="24"/>
+          <w:szCs w:val="24"/>
+        </w:rPr>
+        <w:lastRenderedPageBreak/>
+        <w:t>Customer xem tracking.</w:t>
+      </w:r>
+    </w:p>
+    <w:p>
+      <w:pPr>
+        <w:numPr>
+          <w:ilvl w:val="1"/>
+          <w:numId w:val="2"/>
+        </w:numPr>
+        <w:spacing w:before="100" w:beforeAutospacing="1" w:after="100" w:afterAutospacing="1" w:line="240" w:lineRule="auto"/>
+        <w:rPr>
+          <w:rFonts w:ascii="Times New Roman" w:eastAsia="Times New Roman" w:hAnsi="Times New Roman" w:cs="Times New Roman"/>
+          <w:sz w:val="24"/>
+          <w:szCs w:val="24"/>
+        </w:rPr>
+      </w:pPr>
+      <w:r>
+        <w:rPr>
+          <w:rFonts w:ascii="Times New Roman" w:eastAsia="Times New Roman" w:hAnsi="Times New Roman" w:cs="Times New Roman"/>
+          <w:sz w:val="24"/>
+          <w:szCs w:val="24"/>
+        </w:rPr>
+        <w:t>Admin/shop owner quản lý giao nhận.</w:t>
+      </w:r>
+    </w:p>
+    <w:p>
+      <w:pPr>
+        <w:numPr>
+          <w:ilvl w:val="0"/>
+          <w:numId w:val="2"/>
+        </w:numPr>
+        <w:spacing w:before="100" w:beforeAutospacing="1" w:after="100" w:afterAutospacing="1" w:line="240" w:lineRule="auto"/>
+        <w:rPr>
+          <w:rFonts w:ascii="Times New Roman" w:eastAsia="Times New Roman" w:hAnsi="Times New Roman" w:cs="Times New Roman"/>
+          <w:sz w:val="24"/>
+          <w:szCs w:val="24"/>
+        </w:rPr>
+      </w:pPr>
+      <w:r>
+        <w:rPr>
+          <w:rFonts w:ascii="Times New Roman" w:eastAsia="Times New Roman" w:hAnsi="Times New Roman" w:cs="Times New Roman"/>
+          <w:b/>
+          <w:bCs/>
+          <w:sz w:val="24"/>
+          <w:szCs w:val="24"/>
+        </w:rPr>
+        <w:t>Voucher/loyalty</w:t>
+      </w:r>
+    </w:p>
+    <w:p>
+      <w:pPr>
+        <w:numPr>
+          <w:ilvl w:val="1"/>
+          <w:numId w:val="2"/>
+        </w:numPr>
+        <w:spacing w:before="100" w:beforeAutospacing="1" w:after="100" w:afterAutospacing="1" w:line="240" w:lineRule="auto"/>
+        <w:rPr>
+          <w:rFonts w:ascii="Times New Roman" w:eastAsia="Times New Roman" w:hAnsi="Times New Roman" w:cs="Times New Roman"/>
+          <w:sz w:val="24"/>
+          <w:szCs w:val="24"/>
+        </w:rPr>
+      </w:pPr>
+      <w:r>
+        <w:rPr>
+          <w:rFonts w:ascii="Times New Roman" w:eastAsia="Times New Roman" w:hAnsi="Times New Roman" w:cs="Times New Roman"/>
+          <w:sz w:val="24"/>
+          <w:szCs w:val="24"/>
+        </w:rPr>
+        <w:t>Voucher validation.</w:t>
+      </w:r>
+    </w:p>
+    <w:p>
+      <w:pPr>
+        <w:numPr>
+          <w:ilvl w:val="1"/>
+          <w:numId w:val="2"/>
+        </w:numPr>
+        <w:spacing w:before="100" w:beforeAutospacing="1" w:after="100" w:afterAutospacing="1" w:line="240" w:lineRule="auto"/>
+        <w:rPr>
+          <w:rFonts w:ascii="Times New Roman" w:eastAsia="Times New Roman" w:hAnsi="Times New Roman" w:cs="Times New Roman"/>
+          <w:sz w:val="24"/>
+          <w:szCs w:val="24"/>
+        </w:rPr>
+      </w:pPr>
+      <w:r>
+        <w:rPr>
+          <w:rFonts w:ascii="Times New Roman" w:eastAsia="Times New Roman" w:hAnsi="Times New Roman" w:cs="Times New Roman"/>
+          <w:sz w:val="24"/>
+          <w:szCs w:val="24"/>
+        </w:rPr>
+        <w:t>User voucher ownership.</w:t>
+      </w:r>
+    </w:p>
+    <w:p>
+      <w:pPr>
+        <w:numPr>
+          <w:ilvl w:val="1"/>
+          <w:numId w:val="2"/>
+        </w:numPr>
+        <w:spacing w:before="100" w:beforeAutospacing="1" w:after="100" w:afterAutospacing="1" w:line="240" w:lineRule="auto"/>
+        <w:rPr>
+          <w:rFonts w:ascii="Times New Roman" w:eastAsia="Times New Roman" w:hAnsi="Times New Roman" w:cs="Times New Roman"/>
+          <w:sz w:val="24"/>
+          <w:szCs w:val="24"/>
+        </w:rPr>
+      </w:pPr>
+      <w:r>
+        <w:rPr>
+          <w:rFonts w:ascii="Times New Roman" w:eastAsia="Times New Roman" w:hAnsi="Times New Roman" w:cs="Times New Roman"/>
+          <w:sz w:val="24"/>
+          <w:szCs w:val="24"/>
+        </w:rPr>
+        <w:t>Điều kiện áp dụng: ngày hết hạn, min order, usage limit.</w:t>
+      </w:r>
+    </w:p>
+    <w:p>
+      <w:pPr>
+        <w:numPr>
+          <w:ilvl w:val="1"/>
+          <w:numId w:val="2"/>
+        </w:numPr>
+        <w:spacing w:before="100" w:beforeAutospacing="1" w:after="100" w:afterAutospacing="1" w:line="240" w:lineRule="auto"/>
+        <w:rPr>
+          <w:rFonts w:ascii="Times New Roman" w:eastAsia="Times New Roman" w:hAnsi="Times New Roman" w:cs="Times New Roman"/>
+          <w:sz w:val="24"/>
+          <w:szCs w:val="24"/>
+        </w:rPr>
+      </w:pPr>
+      <w:r>
+        <w:rPr>
+          <w:rFonts w:ascii="Times New Roman" w:eastAsia="Times New Roman" w:hAnsi="Times New Roman" w:cs="Times New Roman"/>
+          <w:sz w:val="24"/>
+          <w:szCs w:val="24"/>
+        </w:rPr>
+        <w:t>Loyalty transaction: cộng/trừ điểm sau đơn hàng.</w:t>
+      </w:r>
+    </w:p>
+    <w:p>
+      <w:pPr>
+        <w:numPr>
+          <w:ilvl w:val="1"/>
+          <w:numId w:val="2"/>
+        </w:numPr>
+        <w:spacing w:before="100" w:beforeAutospacing="1" w:after="100" w:afterAutospacing="1" w:line="240" w:lineRule="auto"/>
+        <w:rPr>
+          <w:rFonts w:ascii="Times New Roman" w:eastAsia="Times New Roman" w:hAnsi="Times New Roman" w:cs="Times New Roman"/>
+          <w:sz w:val="24"/>
+          <w:szCs w:val="24"/>
+        </w:rPr>
+      </w:pPr>
+      <w:r>
+        <w:rPr>
+          <w:rFonts w:ascii="Times New Roman" w:eastAsia="Times New Roman" w:hAnsi="Times New Roman" w:cs="Times New Roman"/>
+          <w:sz w:val="24"/>
+          <w:szCs w:val="24"/>
+        </w:rPr>
+        <w:t>Tests cho discount calculation.</w:t>
+      </w:r>
+    </w:p>
+    <w:p>
+      <w:pPr>
+        <w:numPr>
+          <w:ilvl w:val="0"/>
+          <w:numId w:val="2"/>
+        </w:numPr>
+        <w:spacing w:before="100" w:beforeAutospacing="1" w:after="100" w:afterAutospacing="1" w:line="240" w:lineRule="auto"/>
+        <w:rPr>
+          <w:rFonts w:ascii="Times New Roman" w:eastAsia="Times New Roman" w:hAnsi="Times New Roman" w:cs="Times New Roman"/>
+          <w:sz w:val="24"/>
+          <w:szCs w:val="24"/>
+        </w:rPr>
+      </w:pPr>
+      <w:r>
+        <w:rPr>
+          <w:rFonts w:ascii="Times New Roman" w:eastAsia="Times New Roman" w:hAnsi="Times New Roman" w:cs="Times New Roman"/>
+          <w:b/>
+          <w:bCs/>
+          <w:sz w:val="24"/>
+          <w:szCs w:val="24"/>
+        </w:rPr>
+        <w:t>Review và moderation</w:t>
+      </w:r>
+    </w:p>
+    <w:p>
+      <w:pPr>
+        <w:numPr>
+          <w:ilvl w:val="1"/>
+          <w:numId w:val="2"/>
+        </w:numPr>
+        <w:spacing w:before="100" w:beforeAutospacing="1" w:after="100" w:afterAutospacing="1" w:line="240" w:lineRule="auto"/>
+        <w:rPr>
+          <w:rFonts w:ascii="Times New Roman" w:eastAsia="Times New Roman" w:hAnsi="Times New Roman" w:cs="Times New Roman"/>
+          <w:sz w:val="24"/>
+          <w:szCs w:val="24"/>
+        </w:rPr>
+      </w:pPr>
+      <w:r>
+        <w:rPr>
+          <w:rFonts w:ascii="Times New Roman" w:eastAsia="Times New Roman" w:hAnsi="Times New Roman" w:cs="Times New Roman"/>
+          <w:sz w:val="24"/>
+          <w:szCs w:val="24"/>
+        </w:rPr>
+        <w:t>User review sản phẩm sau khi order hoàn tất.</w:t>
+      </w:r>
+    </w:p>
+    <w:p>
+      <w:pPr>
+        <w:numPr>
+          <w:ilvl w:val="1"/>
+          <w:numId w:val="2"/>
+        </w:numPr>
+        <w:spacing w:before="100" w:beforeAutospacing="1" w:after="100" w:afterAutospacing="1" w:line="240" w:lineRule="auto"/>
+        <w:rPr>
+          <w:rFonts w:ascii="Times New Roman" w:eastAsia="Times New Roman" w:hAnsi="Times New Roman" w:cs="Times New Roman"/>
+          <w:sz w:val="24"/>
+          <w:szCs w:val="24"/>
+        </w:rPr>
+      </w:pPr>
+      <w:r>
+        <w:rPr>
+          <w:rFonts w:ascii="Times New Roman" w:eastAsia="Times New Roman" w:hAnsi="Times New Roman" w:cs="Times New Roman"/>
+          <w:sz w:val="24"/>
+          <w:szCs w:val="24"/>
+        </w:rPr>
+        <w:t>Rating/comment.</w:t>
+      </w:r>
+    </w:p>
+    <w:p>
+      <w:pPr>
+        <w:numPr>
+          <w:ilvl w:val="1"/>
+          <w:numId w:val="2"/>
+        </w:numPr>
+        <w:spacing w:before="100" w:beforeAutospacing="1" w:after="100" w:afterAutospacing="1" w:line="240" w:lineRule="auto"/>
+        <w:rPr>
+          <w:rFonts w:ascii="Times New Roman" w:eastAsia="Times New Roman" w:hAnsi="Times New Roman" w:cs="Times New Roman"/>
+          <w:sz w:val="24"/>
+          <w:szCs w:val="24"/>
+        </w:rPr>
+      </w:pPr>
+      <w:r>
+        <w:rPr>
+          <w:rFonts w:ascii="Times New Roman" w:eastAsia="Times New Roman" w:hAnsi="Times New Roman" w:cs="Times New Roman"/>
+          <w:sz w:val="24"/>
+          <w:szCs w:val="24"/>
+        </w:rPr>
+        <w:t>Admin ẩn/xóa review nếu cần.</w:t>
+      </w:r>
+    </w:p>
+    <w:p>
+      <w:pPr>
+        <w:numPr>
+          <w:ilvl w:val="1"/>
+          <w:numId w:val="2"/>
+        </w:numPr>
+        <w:spacing w:before="100" w:beforeAutospacing="1" w:after="100" w:afterAutospacing="1" w:line="240" w:lineRule="auto"/>
+        <w:rPr>
+          <w:rFonts w:ascii="Times New Roman" w:eastAsia="Times New Roman" w:hAnsi="Times New Roman" w:cs="Times New Roman"/>
+          <w:sz w:val="24"/>
+          <w:szCs w:val="24"/>
+        </w:rPr>
+      </w:pPr>
+      <w:r>
+        <w:rPr>
+          <w:rFonts w:ascii="Times New Roman" w:eastAsia="Times New Roman" w:hAnsi="Times New Roman" w:cs="Times New Roman"/>
+          <w:sz w:val="24"/>
+          <w:szCs w:val="24"/>
+        </w:rPr>
+        <w:t>Aggregate rating cho product.</w:t>
+      </w:r>
+    </w:p>
+    <w:p>
+      <w:pPr>
+        <w:numPr>
+          <w:ilvl w:val="0"/>
+          <w:numId w:val="2"/>
+        </w:numPr>
+        <w:spacing w:before="100" w:beforeAutospacing="1" w:after="100" w:afterAutospacing="1" w:line="240" w:lineRule="auto"/>
+        <w:rPr>
+          <w:rFonts w:ascii="Times New Roman" w:eastAsia="Times New Roman" w:hAnsi="Times New Roman" w:cs="Times New Roman"/>
+          <w:sz w:val="24"/>
+          <w:szCs w:val="24"/>
+        </w:rPr>
+      </w:pPr>
+      <w:r>
+        <w:rPr>
+          <w:rFonts w:ascii="Times New Roman" w:eastAsia="Times New Roman" w:hAnsi="Times New Roman" w:cs="Times New Roman"/>
+          <w:b/>
+          <w:bCs/>
+          <w:sz w:val="24"/>
+          <w:szCs w:val="24"/>
+        </w:rPr>
+        <w:t>Contact, notification, news</w:t>
+      </w:r>
+    </w:p>
+    <w:p>
+      <w:pPr>
+        <w:numPr>
+          <w:ilvl w:val="1"/>
+          <w:numId w:val="2"/>
+        </w:numPr>
+        <w:spacing w:before="100" w:beforeAutospacing="1" w:after="100" w:afterAutospacing="1" w:line="240" w:lineRule="auto"/>
+        <w:rPr>
+          <w:rFonts w:ascii="Times New Roman" w:eastAsia="Times New Roman" w:hAnsi="Times New Roman" w:cs="Times New Roman"/>
+          <w:sz w:val="24"/>
+          <w:szCs w:val="24"/>
+        </w:rPr>
+      </w:pPr>
+      <w:r>
+        <w:rPr>
+          <w:rFonts w:ascii="Times New Roman" w:eastAsia="Times New Roman" w:hAnsi="Times New Roman" w:cs="Times New Roman"/>
+          <w:sz w:val="24"/>
+          <w:szCs w:val="24"/>
+        </w:rPr>
+        <w:t>Contact message admin inbox.</w:t>
+      </w:r>
+    </w:p>
+    <w:p>
+      <w:pPr>
+        <w:numPr>
+          <w:ilvl w:val="1"/>
+          <w:numId w:val="2"/>
+        </w:numPr>
+        <w:spacing w:before="100" w:beforeAutospacing="1" w:after="100" w:afterAutospacing="1" w:line="240" w:lineRule="auto"/>
+        <w:rPr>
+          <w:rFonts w:ascii="Times New Roman" w:eastAsia="Times New Roman" w:hAnsi="Times New Roman" w:cs="Times New Roman"/>
+          <w:sz w:val="24"/>
+          <w:szCs w:val="24"/>
+        </w:rPr>
+      </w:pPr>
+      <w:r>
+        <w:rPr>
+          <w:rFonts w:ascii="Times New Roman" w:eastAsia="Times New Roman" w:hAnsi="Times New Roman" w:cs="Times New Roman"/>
+          <w:sz w:val="24"/>
+          <w:szCs w:val="24"/>
+        </w:rPr>
+        <w:t>Notification table/API.</w:t>
+      </w:r>
+    </w:p>
+    <w:p>
+      <w:pPr>
+        <w:numPr>
+          <w:ilvl w:val="1"/>
+          <w:numId w:val="2"/>
+        </w:numPr>
+        <w:spacing w:before="100" w:beforeAutospacing="1" w:after="100" w:afterAutospacing="1" w:line="240" w:lineRule="auto"/>
+        <w:rPr>
+          <w:rFonts w:ascii="Times New Roman" w:eastAsia="Times New Roman" w:hAnsi="Times New Roman" w:cs="Times New Roman"/>
+          <w:sz w:val="24"/>
+          <w:szCs w:val="24"/>
+        </w:rPr>
+      </w:pPr>
+      <w:r>
+        <w:rPr>
+          <w:rFonts w:ascii="Times New Roman" w:eastAsia="Times New Roman" w:hAnsi="Times New Roman" w:cs="Times New Roman"/>
+          <w:sz w:val="24"/>
+          <w:szCs w:val="24"/>
+        </w:rPr>
+        <w:t xml:space="preserve">News article CRUD cho admin. nhóm dễ hơn, </w:t>
+      </w:r>
+      <w:proofErr w:type="gramStart"/>
+      <w:r>
+        <w:rPr>
+          <w:rFonts w:ascii="Times New Roman" w:eastAsia="Times New Roman" w:hAnsi="Times New Roman" w:cs="Times New Roman"/>
+          <w:sz w:val="24"/>
+          <w:szCs w:val="24"/>
+        </w:rPr>
+        <w:t>làm sau core commerc</w:t>
+      </w:r>
+      <w:r>
+        <w:rPr>
+          <w:rFonts w:ascii="Times New Roman" w:eastAsia="Times New Roman" w:hAnsi="Times New Roman" w:cs="Times New Roman"/>
+          <w:sz w:val="24"/>
+          <w:szCs w:val="24"/>
+        </w:rPr>
+        <w:t xml:space="preserve"> </w:t>
+      </w:r>
+      <w:proofErr w:type="gramEnd"/>
+    </w:p>
+    <w:p>
+      <w:pPr>
+        <w:numPr>
+          <w:ilvl w:val="1"/>
+          <w:numId w:val="2"/>
+        </w:numPr>
+        <w:spacing w:before="100" w:beforeAutospacing="1" w:after="100" w:afterAutospacing="1" w:line="240" w:lineRule="auto"/>
+        <w:rPr>
+          <w:rFonts w:ascii="Times New Roman" w:eastAsia="Times New Roman" w:hAnsi="Times New Roman" w:cs="Times New Roman"/>
+          <w:sz w:val="24"/>
+          <w:szCs w:val="24"/>
+        </w:rPr>
+      </w:pPr>
+      <w:r>
+        <w:rPr>
+          <w:rFonts w:ascii="Times New Roman" w:eastAsia="Times New Roman" w:hAnsi="Times New Roman" w:cs="Times New Roman"/>
+          <w:sz w:val="24"/>
+          <w:szCs w:val="24"/>
+        </w:rPr>
+        <w:t xml:space="preserve">Đây là </w:t>
+      </w:r>
+      <w:proofErr w:type="gramStart"/>
+      <w:r>
+        <w:rPr>
+          <w:rFonts w:ascii="Times New Roman" w:eastAsia="Times New Roman" w:hAnsi="Times New Roman" w:cs="Times New Roman"/>
+          <w:sz w:val="24"/>
+          <w:szCs w:val="24"/>
+        </w:rPr>
+        <w:t>e flow</w:t>
+      </w:r>
+      <w:proofErr w:type="gramEnd"/>
+      <w:r>
+        <w:rPr>
+          <w:rFonts w:ascii="Times New Roman" w:eastAsia="Times New Roman" w:hAnsi="Times New Roman" w:cs="Times New Roman"/>
+          <w:sz w:val="24"/>
+          <w:szCs w:val="24"/>
+        </w:rPr>
+        <w:t>.</w:t>
+      </w:r>
+    </w:p>
+    <w:p>
+      <w:pPr>
+        <w:numPr>
+          <w:ilvl w:val="0"/>
+          <w:numId w:val="2"/>
+        </w:numPr>
+        <w:spacing w:before="100" w:beforeAutospacing="1" w:after="100" w:afterAutospacing="1" w:line="240" w:lineRule="auto"/>
+        <w:rPr>
+          <w:rFonts w:ascii="Times New Roman" w:eastAsia="Times New Roman" w:hAnsi="Times New Roman" w:cs="Times New Roman"/>
+          <w:sz w:val="24"/>
+          <w:szCs w:val="24"/>
+        </w:rPr>
+      </w:pPr>
+      <w:r>
+        <w:rPr>
+          <w:rFonts w:ascii="Times New Roman" w:eastAsia="Times New Roman" w:hAnsi="Times New Roman" w:cs="Times New Roman"/>
+          <w:b/>
+          <w:bCs/>
+          <w:sz w:val="24"/>
+          <w:szCs w:val="24"/>
+        </w:rPr>
+        <w:t>AI routes hiện có</w:t>
+      </w:r>
+    </w:p>
+    <w:p>
+      <w:pPr>
+        <w:numPr>
+          <w:ilvl w:val="1"/>
+          <w:numId w:val="2"/>
+        </w:numPr>
+        <w:spacing w:before="100" w:beforeAutospacing="1" w:after="100" w:afterAutospacing="1" w:line="240" w:lineRule="auto"/>
+        <w:rPr>
+          <w:rFonts w:ascii="Times New Roman" w:eastAsia="Times New Roman" w:hAnsi="Times New Roman" w:cs="Times New Roman"/>
+          <w:sz w:val="24"/>
+          <w:szCs w:val="24"/>
+        </w:rPr>
+      </w:pPr>
+      <w:r>
+        <w:rPr>
+          <w:rFonts w:ascii="Times New Roman" w:eastAsia="Times New Roman" w:hAnsi="Times New Roman" w:cs="Times New Roman"/>
+          <w:sz w:val="24"/>
+          <w:szCs w:val="24"/>
+        </w:rPr>
+        <w:t xml:space="preserve">Giữ </w:t>
+      </w:r>
+      <w:r>
+        <w:rPr>
+          <w:rFonts w:ascii="Courier New" w:eastAsia="Times New Roman" w:hAnsi="Courier New" w:cs="Courier New"/>
+          <w:sz w:val="20"/>
+          <w:szCs w:val="20"/>
+        </w:rPr>
+        <w:t>/api/chat</w:t>
+      </w:r>
+      <w:r>
+        <w:rPr>
+          <w:rFonts w:ascii="Times New Roman" w:eastAsia="Times New Roman" w:hAnsi="Times New Roman" w:cs="Times New Roman"/>
+          <w:sz w:val="24"/>
+          <w:szCs w:val="24"/>
+        </w:rPr>
+        <w:t xml:space="preserve"> và </w:t>
+      </w:r>
+      <w:r>
+        <w:rPr>
+          <w:rFonts w:ascii="Courier New" w:eastAsia="Times New Roman" w:hAnsi="Courier New" w:cs="Courier New"/>
+          <w:sz w:val="20"/>
+          <w:szCs w:val="20"/>
+        </w:rPr>
+        <w:t>/api/tryon</w:t>
+      </w:r>
+      <w:r>
+        <w:rPr>
+          <w:rFonts w:ascii="Times New Roman" w:eastAsia="Times New Roman" w:hAnsi="Times New Roman" w:cs="Times New Roman"/>
+          <w:sz w:val="24"/>
+          <w:szCs w:val="24"/>
+        </w:rPr>
+        <w:t xml:space="preserve"> </w:t>
+      </w:r>
+      <w:proofErr w:type="gramStart"/>
+      <w:r>
+        <w:rPr>
+          <w:rFonts w:ascii="Times New Roman" w:eastAsia="Times New Roman" w:hAnsi="Times New Roman" w:cs="Times New Roman"/>
+          <w:sz w:val="24"/>
+          <w:szCs w:val="24"/>
+        </w:rPr>
+        <w:t>theo</w:t>
+      </w:r>
+      <w:proofErr w:type="gramEnd"/>
+      <w:r>
+        <w:rPr>
+          <w:rFonts w:ascii="Times New Roman" w:eastAsia="Times New Roman" w:hAnsi="Times New Roman" w:cs="Times New Roman"/>
+          <w:sz w:val="24"/>
+          <w:szCs w:val="24"/>
+        </w:rPr>
+        <w:t xml:space="preserve"> guardrail hiện tại.</w:t>
+      </w:r>
+    </w:p>
+    <w:p>
+      <w:pPr>
+        <w:numPr>
+          <w:ilvl w:val="1"/>
+          <w:numId w:val="2"/>
+        </w:numPr>
+        <w:spacing w:before="100" w:beforeAutospacing="1" w:after="100" w:afterAutospacing="1" w:line="240" w:lineRule="auto"/>
+        <w:rPr>
+          <w:rFonts w:ascii="Times New Roman" w:eastAsia="Times New Roman" w:hAnsi="Times New Roman" w:cs="Times New Roman"/>
+          <w:sz w:val="24"/>
+          <w:szCs w:val="24"/>
+        </w:rPr>
+      </w:pPr>
+      <w:r>
+        <w:rPr>
+          <w:rFonts w:ascii="Times New Roman" w:eastAsia="Times New Roman" w:hAnsi="Times New Roman" w:cs="Times New Roman"/>
+          <w:sz w:val="24"/>
+          <w:szCs w:val="24"/>
+        </w:rPr>
+        <w:t xml:space="preserve">Không expose </w:t>
+      </w:r>
+      <w:r>
+        <w:rPr>
+          <w:rFonts w:ascii="Courier New" w:eastAsia="Times New Roman" w:hAnsi="Courier New" w:cs="Courier New"/>
+          <w:sz w:val="20"/>
+          <w:szCs w:val="20"/>
+        </w:rPr>
+        <w:t>GEMINI_API_KEY</w:t>
+      </w:r>
+      <w:r>
+        <w:rPr>
+          <w:rFonts w:ascii="Times New Roman" w:eastAsia="Times New Roman" w:hAnsi="Times New Roman" w:cs="Times New Roman"/>
+          <w:sz w:val="24"/>
+          <w:szCs w:val="24"/>
+        </w:rPr>
+        <w:t xml:space="preserve">, </w:t>
+      </w:r>
+      <w:r>
+        <w:rPr>
+          <w:rFonts w:ascii="Courier New" w:eastAsia="Times New Roman" w:hAnsi="Courier New" w:cs="Courier New"/>
+          <w:sz w:val="20"/>
+          <w:szCs w:val="20"/>
+        </w:rPr>
+        <w:t>FASHN_API_KEY</w:t>
+      </w:r>
+      <w:r>
+        <w:rPr>
+          <w:rFonts w:ascii="Times New Roman" w:eastAsia="Times New Roman" w:hAnsi="Times New Roman" w:cs="Times New Roman"/>
+          <w:sz w:val="24"/>
+          <w:szCs w:val="24"/>
+        </w:rPr>
+        <w:t xml:space="preserve"> ra </w:t>
+      </w:r>
+      <w:r>
+        <w:rPr>
+          <w:rFonts w:ascii="Courier New" w:eastAsia="Times New Roman" w:hAnsi="Courier New" w:cs="Courier New"/>
+          <w:sz w:val="20"/>
+          <w:szCs w:val="20"/>
+        </w:rPr>
+        <w:t>VITE_*</w:t>
+      </w:r>
+      <w:r>
+        <w:rPr>
+          <w:rFonts w:ascii="Times New Roman" w:eastAsia="Times New Roman" w:hAnsi="Times New Roman" w:cs="Times New Roman"/>
+          <w:sz w:val="24"/>
+          <w:szCs w:val="24"/>
+        </w:rPr>
+        <w:t>.</w:t>
+      </w:r>
+    </w:p>
+    <w:p>
+      <w:pPr>
+        <w:numPr>
+          <w:ilvl w:val="1"/>
+          <w:numId w:val="2"/>
+        </w:numPr>
+        <w:spacing w:before="100" w:beforeAutospacing="1" w:after="100" w:afterAutospacing="1" w:line="240" w:lineRule="auto"/>
+        <w:rPr>
+          <w:rFonts w:ascii="Times New Roman" w:eastAsia="Times New Roman" w:hAnsi="Times New Roman" w:cs="Times New Roman"/>
+          <w:sz w:val="24"/>
+          <w:szCs w:val="24"/>
+        </w:rPr>
+      </w:pPr>
+      <w:proofErr w:type="gramStart"/>
+      <w:r>
+        <w:rPr>
+          <w:rFonts w:ascii="Times New Roman" w:eastAsia="Times New Roman" w:hAnsi="Times New Roman" w:cs="Times New Roman"/>
+          <w:sz w:val="24"/>
+          <w:szCs w:val="24"/>
+        </w:rPr>
+        <w:t>Thêm</w:t>
+      </w:r>
+      <w:proofErr w:type="gramEnd"/>
+      <w:r>
+        <w:rPr>
+          <w:rFonts w:ascii="Times New Roman" w:eastAsia="Times New Roman" w:hAnsi="Times New Roman" w:cs="Times New Roman"/>
+          <w:sz w:val="24"/>
+          <w:szCs w:val="24"/>
+        </w:rPr>
+        <w:t xml:space="preserve"> rate limit, auth nếu cần.</w:t>
+      </w:r>
+    </w:p>
+    <w:p>
+      <w:pPr>
+        <w:numPr>
+          <w:ilvl w:val="1"/>
+          <w:numId w:val="2"/>
+        </w:numPr>
+        <w:spacing w:before="100" w:beforeAutospacing="1" w:after="100" w:afterAutospacing="1" w:line="240" w:lineRule="auto"/>
+        <w:rPr>
+          <w:rFonts w:ascii="Times New Roman" w:eastAsia="Times New Roman" w:hAnsi="Times New Roman" w:cs="Times New Roman"/>
+          <w:sz w:val="24"/>
+          <w:szCs w:val="24"/>
+        </w:rPr>
+      </w:pPr>
+      <w:r>
+        <w:rPr>
+          <w:rFonts w:ascii="Times New Roman" w:eastAsia="Times New Roman" w:hAnsi="Times New Roman" w:cs="Times New Roman"/>
+          <w:sz w:val="24"/>
+          <w:szCs w:val="24"/>
+        </w:rPr>
+        <w:t>Logging lỗi không lộ secret.</w:t>
+      </w:r>
+    </w:p>
+    <w:p>
+      <w:pPr>
+        <w:numPr>
+          <w:ilvl w:val="0"/>
+          <w:numId w:val="2"/>
+        </w:numPr>
+        <w:spacing w:before="100" w:beforeAutospacing="1" w:after="100" w:afterAutospacing="1" w:line="240" w:lineRule="auto"/>
+        <w:rPr>
+          <w:rFonts w:ascii="Times New Roman" w:eastAsia="Times New Roman" w:hAnsi="Times New Roman" w:cs="Times New Roman"/>
+          <w:sz w:val="24"/>
+          <w:szCs w:val="24"/>
+        </w:rPr>
+      </w:pPr>
+      <w:r>
+        <w:rPr>
+          <w:rFonts w:ascii="Times New Roman" w:eastAsia="Times New Roman" w:hAnsi="Times New Roman" w:cs="Times New Roman"/>
+          <w:b/>
+          <w:bCs/>
+          <w:sz w:val="24"/>
+          <w:szCs w:val="24"/>
+        </w:rPr>
+        <w:t>Admin APIs</w:t>
+      </w:r>
+    </w:p>
+    <w:p>
+      <w:pPr>
+        <w:numPr>
+          <w:ilvl w:val="1"/>
+          <w:numId w:val="2"/>
+        </w:numPr>
+        <w:spacing w:before="100" w:beforeAutospacing="1" w:after="100" w:afterAutospacing="1" w:line="240" w:lineRule="auto"/>
+        <w:rPr>
+          <w:rFonts w:ascii="Times New Roman" w:eastAsia="Times New Roman" w:hAnsi="Times New Roman" w:cs="Times New Roman"/>
+          <w:sz w:val="24"/>
+          <w:szCs w:val="24"/>
+        </w:rPr>
+      </w:pPr>
+      <w:r>
+        <w:rPr>
+          <w:rFonts w:ascii="Times New Roman" w:eastAsia="Times New Roman" w:hAnsi="Times New Roman" w:cs="Times New Roman"/>
+          <w:sz w:val="24"/>
+          <w:szCs w:val="24"/>
+        </w:rPr>
+        <w:t>Dashboard summary: users, orders, revenue, products.</w:t>
+      </w:r>
+    </w:p>
+    <w:p>
+      <w:pPr>
+        <w:numPr>
+          <w:ilvl w:val="1"/>
+          <w:numId w:val="2"/>
+        </w:numPr>
+        <w:spacing w:before="100" w:beforeAutospacing="1" w:after="100" w:afterAutospacing="1" w:line="240" w:lineRule="auto"/>
+        <w:rPr>
+          <w:rFonts w:ascii="Times New Roman" w:eastAsia="Times New Roman" w:hAnsi="Times New Roman" w:cs="Times New Roman"/>
+          <w:sz w:val="24"/>
+          <w:szCs w:val="24"/>
+        </w:rPr>
+      </w:pPr>
+      <w:r>
+        <w:rPr>
+          <w:rFonts w:ascii="Times New Roman" w:eastAsia="Times New Roman" w:hAnsi="Times New Roman" w:cs="Times New Roman"/>
+          <w:sz w:val="24"/>
+          <w:szCs w:val="24"/>
+        </w:rPr>
+        <w:t>User management.</w:t>
+      </w:r>
+    </w:p>
+    <w:p>
+      <w:pPr>
+        <w:numPr>
+          <w:ilvl w:val="1"/>
+          <w:numId w:val="2"/>
+        </w:numPr>
+        <w:spacing w:before="100" w:beforeAutospacing="1" w:after="100" w:afterAutospacing="1" w:line="240" w:lineRule="auto"/>
+        <w:rPr>
+          <w:rFonts w:ascii="Times New Roman" w:eastAsia="Times New Roman" w:hAnsi="Times New Roman" w:cs="Times New Roman"/>
+          <w:sz w:val="24"/>
+          <w:szCs w:val="24"/>
+        </w:rPr>
+      </w:pPr>
+      <w:r>
+        <w:rPr>
+          <w:rFonts w:ascii="Times New Roman" w:eastAsia="Times New Roman" w:hAnsi="Times New Roman" w:cs="Times New Roman"/>
+          <w:sz w:val="24"/>
+          <w:szCs w:val="24"/>
+        </w:rPr>
+        <w:t>Product/order/payment/shipment management.</w:t>
+      </w:r>
+    </w:p>
+    <w:p>
+      <w:pPr>
+        <w:numPr>
+          <w:ilvl w:val="1"/>
+          <w:numId w:val="2"/>
+        </w:numPr>
+        <w:spacing w:before="100" w:beforeAutospacing="1" w:after="100" w:afterAutospacing="1" w:line="240" w:lineRule="auto"/>
+        <w:rPr>
+          <w:rFonts w:ascii="Times New Roman" w:eastAsia="Times New Roman" w:hAnsi="Times New Roman" w:cs="Times New Roman"/>
+          <w:sz w:val="24"/>
+          <w:szCs w:val="24"/>
+        </w:rPr>
+      </w:pPr>
+      <w:r>
+        <w:rPr>
+          <w:rFonts w:ascii="Times New Roman" w:eastAsia="Times New Roman" w:hAnsi="Times New Roman" w:cs="Times New Roman"/>
+          <w:sz w:val="24"/>
+          <w:szCs w:val="24"/>
+        </w:rPr>
+        <w:t>Contact inbox.</w:t>
+      </w:r>
+    </w:p>
+    <w:p>
+      <w:pPr>
+        <w:numPr>
+          <w:ilvl w:val="1"/>
+          <w:numId w:val="2"/>
+        </w:numPr>
+        <w:spacing w:before="100" w:beforeAutospacing="1" w:after="100" w:afterAutospacing="1" w:line="240" w:lineRule="auto"/>
+        <w:rPr>
+          <w:rFonts w:ascii="Times New Roman" w:eastAsia="Times New Roman" w:hAnsi="Times New Roman" w:cs="Times New Roman"/>
+          <w:sz w:val="24"/>
+          <w:szCs w:val="24"/>
+        </w:rPr>
+      </w:pPr>
+      <w:r>
+        <w:rPr>
+          <w:rFonts w:ascii="Times New Roman" w:eastAsia="Times New Roman" w:hAnsi="Times New Roman" w:cs="Times New Roman"/>
+          <w:sz w:val="24"/>
+          <w:szCs w:val="24"/>
+        </w:rPr>
+        <w:t>Role authorization bắt buộc.</w:t>
+      </w:r>
+    </w:p>
+    <w:p>
+      <w:pPr>
+        <w:numPr>
+          <w:ilvl w:val="0"/>
+          <w:numId w:val="2"/>
+        </w:numPr>
+        <w:spacing w:before="100" w:beforeAutospacing="1" w:after="100" w:afterAutospacing="1" w:line="240" w:lineRule="auto"/>
+        <w:rPr>
+          <w:rFonts w:ascii="Times New Roman" w:eastAsia="Times New Roman" w:hAnsi="Times New Roman" w:cs="Times New Roman"/>
+          <w:sz w:val="24"/>
+          <w:szCs w:val="24"/>
+        </w:rPr>
+      </w:pPr>
+      <w:r>
+        <w:rPr>
+          <w:rFonts w:ascii="Times New Roman" w:eastAsia="Times New Roman" w:hAnsi="Times New Roman" w:cs="Times New Roman"/>
+          <w:b/>
+          <w:bCs/>
+          <w:sz w:val="24"/>
+          <w:szCs w:val="24"/>
+        </w:rPr>
+        <w:t>Cross-cutting production readiness</w:t>
+      </w:r>
+    </w:p>
+    <w:p>
+      <w:pPr>
+        <w:numPr>
+          <w:ilvl w:val="1"/>
+          <w:numId w:val="2"/>
+        </w:numPr>
+        <w:spacing w:before="100" w:beforeAutospacing="1" w:after="100" w:afterAutospacing="1" w:line="240" w:lineRule="auto"/>
+        <w:rPr>
+          <w:rFonts w:ascii="Times New Roman" w:eastAsia="Times New Roman" w:hAnsi="Times New Roman" w:cs="Times New Roman"/>
+          <w:sz w:val="24"/>
+          <w:szCs w:val="24"/>
+        </w:rPr>
+      </w:pPr>
+      <w:r>
+        <w:rPr>
+          <w:rFonts w:ascii="Times New Roman" w:eastAsia="Times New Roman" w:hAnsi="Times New Roman" w:cs="Times New Roman"/>
+          <w:sz w:val="24"/>
+          <w:szCs w:val="24"/>
+        </w:rPr>
+        <w:t>Request validation nhất quán.</w:t>
+      </w:r>
+    </w:p>
+    <w:p>
+      <w:pPr>
+        <w:numPr>
+          <w:ilvl w:val="1"/>
+          <w:numId w:val="2"/>
+        </w:numPr>
+        <w:spacing w:before="100" w:beforeAutospacing="1" w:after="100" w:afterAutospacing="1" w:line="240" w:lineRule="auto"/>
+        <w:rPr>
+          <w:rFonts w:ascii="Times New Roman" w:eastAsia="Times New Roman" w:hAnsi="Times New Roman" w:cs="Times New Roman"/>
+          <w:sz w:val="24"/>
+          <w:szCs w:val="24"/>
+        </w:rPr>
+      </w:pPr>
+      <w:r>
+        <w:rPr>
+          <w:rFonts w:ascii="Times New Roman" w:eastAsia="Times New Roman" w:hAnsi="Times New Roman" w:cs="Times New Roman"/>
+          <w:sz w:val="24"/>
+          <w:szCs w:val="24"/>
+        </w:rPr>
+        <w:t xml:space="preserve">Pagination model </w:t>
+      </w:r>
+      <w:proofErr w:type="gramStart"/>
+      <w:r>
+        <w:rPr>
+          <w:rFonts w:ascii="Times New Roman" w:eastAsia="Times New Roman" w:hAnsi="Times New Roman" w:cs="Times New Roman"/>
+          <w:sz w:val="24"/>
+          <w:szCs w:val="24"/>
+        </w:rPr>
+        <w:t>chung</w:t>
+      </w:r>
+      <w:proofErr w:type="gramEnd"/>
+      <w:r>
+        <w:rPr>
+          <w:rFonts w:ascii="Times New Roman" w:eastAsia="Times New Roman" w:hAnsi="Times New Roman" w:cs="Times New Roman"/>
+          <w:sz w:val="24"/>
+          <w:szCs w:val="24"/>
+        </w:rPr>
+        <w:t>.</w:t>
+      </w:r>
+    </w:p>
+    <w:p>
+      <w:pPr>
+        <w:numPr>
+          <w:ilvl w:val="1"/>
+          <w:numId w:val="2"/>
+        </w:numPr>
+        <w:spacing w:before="100" w:beforeAutospacing="1" w:after="100" w:afterAutospacing="1" w:line="240" w:lineRule="auto"/>
+        <w:rPr>
+          <w:rFonts w:ascii="Times New Roman" w:eastAsia="Times New Roman" w:hAnsi="Times New Roman" w:cs="Times New Roman"/>
+          <w:sz w:val="24"/>
+          <w:szCs w:val="24"/>
+        </w:rPr>
+      </w:pPr>
+      <w:r>
+        <w:rPr>
+          <w:rFonts w:ascii="Times New Roman" w:eastAsia="Times New Roman" w:hAnsi="Times New Roman" w:cs="Times New Roman"/>
+          <w:sz w:val="24"/>
+          <w:szCs w:val="24"/>
+        </w:rPr>
+        <w:t>Idempotency cho checkout/payment callback.</w:t>
+      </w:r>
+    </w:p>
+    <w:p>
+      <w:pPr>
+        <w:numPr>
+          <w:ilvl w:val="1"/>
+          <w:numId w:val="2"/>
+        </w:numPr>
+        <w:spacing w:before="100" w:beforeAutospacing="1" w:after="100" w:afterAutospacing="1" w:line="240" w:lineRule="auto"/>
+        <w:rPr>
+          <w:rFonts w:ascii="Times New Roman" w:eastAsia="Times New Roman" w:hAnsi="Times New Roman" w:cs="Times New Roman"/>
+          <w:sz w:val="24"/>
+          <w:szCs w:val="24"/>
+        </w:rPr>
+      </w:pPr>
+      <w:r>
+        <w:rPr>
+          <w:rFonts w:ascii="Times New Roman" w:eastAsia="Times New Roman" w:hAnsi="Times New Roman" w:cs="Times New Roman"/>
+          <w:sz w:val="24"/>
+          <w:szCs w:val="24"/>
+        </w:rPr>
+        <w:t>Rate limiting cho auth/contact/AI endpoints.</w:t>
+      </w:r>
+    </w:p>
+    <w:p>
+      <w:pPr>
+        <w:numPr>
+          <w:ilvl w:val="1"/>
+          <w:numId w:val="2"/>
+        </w:numPr>
+        <w:spacing w:before="100" w:beforeAutospacing="1" w:after="100" w:afterAutospacing="1" w:line="240" w:lineRule="auto"/>
+        <w:rPr>
+          <w:rFonts w:ascii="Times New Roman" w:eastAsia="Times New Roman" w:hAnsi="Times New Roman" w:cs="Times New Roman"/>
+          <w:sz w:val="24"/>
+          <w:szCs w:val="24"/>
+        </w:rPr>
+      </w:pPr>
+      <w:r>
+        <w:rPr>
+          <w:rFonts w:ascii="Times New Roman" w:eastAsia="Times New Roman" w:hAnsi="Times New Roman" w:cs="Times New Roman"/>
+          <w:sz w:val="24"/>
+          <w:szCs w:val="24"/>
+        </w:rPr>
+        <w:t>Structured logging.</w:t>
+      </w:r>
+    </w:p>
+    <w:p>
+      <w:pPr>
+        <w:numPr>
+          <w:ilvl w:val="1"/>
+          <w:numId w:val="2"/>
+        </w:numPr>
+        <w:spacing w:before="100" w:beforeAutospacing="1" w:after="100" w:afterAutospacing="1" w:line="240" w:lineRule="auto"/>
+        <w:rPr>
+          <w:rFonts w:ascii="Times New Roman" w:eastAsia="Times New Roman" w:hAnsi="Times New Roman" w:cs="Times New Roman"/>
+          <w:sz w:val="24"/>
+          <w:szCs w:val="24"/>
+        </w:rPr>
+      </w:pPr>
+      <w:r>
+        <w:rPr>
+          <w:rFonts w:ascii="Times New Roman" w:eastAsia="Times New Roman" w:hAnsi="Times New Roman" w:cs="Times New Roman"/>
+          <w:sz w:val="24"/>
+          <w:szCs w:val="24"/>
+        </w:rPr>
+        <w:t>Seed data cho dev/test.</w:t>
+      </w:r>
+    </w:p>
+    <w:p>
+      <w:pPr>
+        <w:numPr>
+          <w:ilvl w:val="1"/>
+          <w:numId w:val="2"/>
+        </w:numPr>
+        <w:spacing w:before="100" w:beforeAutospacing="1" w:after="100" w:afterAutospacing="1" w:line="240" w:lineRule="auto"/>
+        <w:rPr>
+          <w:rFonts w:ascii="Times New Roman" w:eastAsia="Times New Roman" w:hAnsi="Times New Roman" w:cs="Times New Roman"/>
+          <w:sz w:val="24"/>
+          <w:szCs w:val="24"/>
+        </w:rPr>
+      </w:pPr>
+      <w:r>
+        <w:rPr>
+          <w:rFonts w:ascii="Times New Roman" w:eastAsia="Times New Roman" w:hAnsi="Times New Roman" w:cs="Times New Roman"/>
+          <w:sz w:val="24"/>
+          <w:szCs w:val="24"/>
+        </w:rPr>
+        <w:t>Docker/dev startup script ổn định.</w:t>
+      </w:r>
+    </w:p>
+    <w:p>
+      <w:pPr>
+        <w:numPr>
+          <w:ilvl w:val="0"/>
+          <w:numId w:val="2"/>
+        </w:numPr>
+        <w:spacing w:before="100" w:beforeAutospacing="1" w:after="100" w:afterAutospacing="1" w:line="240" w:lineRule="auto"/>
+        <w:rPr>
+          <w:rFonts w:ascii="Times New Roman" w:eastAsia="Times New Roman" w:hAnsi="Times New Roman" w:cs="Times New Roman"/>
+          <w:sz w:val="24"/>
+          <w:szCs w:val="24"/>
+        </w:rPr>
+      </w:pPr>
+      <w:r>
+        <w:rPr>
+          <w:rFonts w:ascii="Times New Roman" w:eastAsia="Times New Roman" w:hAnsi="Times New Roman" w:cs="Times New Roman"/>
+          <w:b/>
+          <w:bCs/>
+          <w:sz w:val="24"/>
+          <w:szCs w:val="24"/>
+        </w:rPr>
+        <w:t>Validation và CI</w:t>
+      </w:r>
+    </w:p>
+    <w:p>
+      <w:pPr>
+        <w:numPr>
+          <w:ilvl w:val="1"/>
+          <w:numId w:val="2"/>
+        </w:numPr>
+        <w:spacing w:before="100" w:beforeAutospacing="1" w:after="100" w:afterAutospacing="1" w:line="240" w:lineRule="auto"/>
+        <w:rPr>
+          <w:rFonts w:ascii="Times New Roman" w:eastAsia="Times New Roman" w:hAnsi="Times New Roman" w:cs="Times New Roman"/>
+          <w:sz w:val="24"/>
+          <w:szCs w:val="24"/>
+        </w:rPr>
+      </w:pPr>
+      <w:r>
+        <w:rPr>
+          <w:rFonts w:ascii="Times New Roman" w:eastAsia="Times New Roman" w:hAnsi="Times New Roman" w:cs="Times New Roman"/>
+          <w:sz w:val="24"/>
+          <w:szCs w:val="24"/>
+        </w:rPr>
+        <w:t>Unit tests cho service logic.</w:t>
+      </w:r>
+    </w:p>
+    <w:p>
+      <w:pPr>
+        <w:numPr>
+          <w:ilvl w:val="1"/>
+          <w:numId w:val="2"/>
+        </w:numPr>
+        <w:spacing w:before="100" w:beforeAutospacing="1" w:after="100" w:afterAutospacing="1" w:line="240" w:lineRule="auto"/>
+        <w:rPr>
+          <w:rFonts w:ascii="Times New Roman" w:eastAsia="Times New Roman" w:hAnsi="Times New Roman" w:cs="Times New Roman"/>
+          <w:sz w:val="24"/>
+          <w:szCs w:val="24"/>
+        </w:rPr>
+      </w:pPr>
+      <w:r>
+        <w:rPr>
+          <w:rFonts w:ascii="Times New Roman" w:eastAsia="Times New Roman" w:hAnsi="Times New Roman" w:cs="Times New Roman"/>
+          <w:sz w:val="24"/>
+          <w:szCs w:val="24"/>
+        </w:rPr>
+        <w:t>Integration tests cho từng module API.</w:t>
+      </w:r>
+    </w:p>
+    <w:p>
+      <w:pPr>
+        <w:numPr>
+          <w:ilvl w:val="1"/>
+          <w:numId w:val="2"/>
+        </w:numPr>
+        <w:spacing w:before="100" w:beforeAutospacing="1" w:after="100" w:afterAutospacing="1" w:line="240" w:lineRule="auto"/>
+        <w:rPr>
+          <w:rFonts w:ascii="Times New Roman" w:eastAsia="Times New Roman" w:hAnsi="Times New Roman" w:cs="Times New Roman"/>
+          <w:sz w:val="24"/>
+          <w:szCs w:val="24"/>
+        </w:rPr>
+      </w:pPr>
+      <w:proofErr w:type="gramStart"/>
+      <w:r>
+        <w:rPr>
+          <w:rFonts w:ascii="Courier New" w:eastAsia="Times New Roman" w:hAnsi="Courier New" w:cs="Courier New"/>
+          <w:sz w:val="20"/>
+          <w:szCs w:val="20"/>
+        </w:rPr>
+        <w:t>dotnet</w:t>
+      </w:r>
+      <w:proofErr w:type="gramEnd"/>
+      <w:r>
+        <w:rPr>
+          <w:rFonts w:ascii="Courier New" w:eastAsia="Times New Roman" w:hAnsi="Courier New" w:cs="Courier New"/>
+          <w:sz w:val="20"/>
+          <w:szCs w:val="20"/>
+        </w:rPr>
+        <w:t xml:space="preserve"> test</w:t>
+      </w:r>
+      <w:r>
+        <w:rPr>
+          <w:rFonts w:ascii="Times New Roman" w:eastAsia="Times New Roman" w:hAnsi="Times New Roman" w:cs="Times New Roman"/>
+          <w:sz w:val="24"/>
+          <w:szCs w:val="24"/>
+        </w:rPr>
+        <w:t>.</w:t>
+      </w:r>
+    </w:p>
+    <w:p>
+      <w:pPr>
+        <w:numPr>
+          <w:ilvl w:val="1"/>
+          <w:numId w:val="2"/>
+        </w:numPr>
+        <w:spacing w:before="100" w:beforeAutospacing="1" w:after="100" w:afterAutospacing="1" w:line="240" w:lineRule="auto"/>
+        <w:rPr>
+          <w:rFonts w:ascii="Times New Roman" w:eastAsia="Times New Roman" w:hAnsi="Times New Roman" w:cs="Times New Roman"/>
+          <w:sz w:val="24"/>
+          <w:szCs w:val="24"/>
+        </w:rPr>
+      </w:pPr>
+      <w:r>
+        <w:rPr>
+          <w:rFonts w:ascii="Times New Roman" w:eastAsia="Times New Roman" w:hAnsi="Times New Roman" w:cs="Times New Roman"/>
+          <w:sz w:val="24"/>
+          <w:szCs w:val="24"/>
+        </w:rPr>
+        <w:t>Build backend trong CI.</w:t>
+      </w:r>
+    </w:p>
+    <w:p>
+      <w:pPr>
+        <w:numPr>
+          <w:ilvl w:val="1"/>
+          <w:numId w:val="2"/>
+        </w:numPr>
+        <w:spacing w:before="100" w:beforeAutospacing="1" w:after="100" w:afterAutospacing="1" w:line="240" w:lineRule="auto"/>
+        <w:rPr>
+          <w:rFonts w:ascii="Times New Roman" w:eastAsia="Times New Roman" w:hAnsi="Times New Roman" w:cs="Times New Roman"/>
+          <w:sz w:val="24"/>
+          <w:szCs w:val="24"/>
+        </w:rPr>
+      </w:pPr>
+      <w:r>
+        <w:rPr>
+          <w:rFonts w:ascii="Times New Roman" w:eastAsia="Times New Roman" w:hAnsi="Times New Roman" w:cs="Times New Roman"/>
+          <w:sz w:val="24"/>
+          <w:szCs w:val="24"/>
+        </w:rPr>
+        <w:t>Migration verification.</w:t>
+      </w:r>
+    </w:p>
+    <w:p>
+      <w:pPr>
+        <w:numPr>
+          <w:ilvl w:val="1"/>
+          <w:numId w:val="2"/>
+        </w:numPr>
+        <w:spacing w:before="100" w:beforeAutospacing="1" w:after="100" w:afterAutospacing="1" w:line="240" w:lineRule="auto"/>
+        <w:rPr>
+          <w:rFonts w:ascii="Times New Roman" w:eastAsia="Times New Roman" w:hAnsi="Times New Roman" w:cs="Times New Roman"/>
+          <w:sz w:val="24"/>
+          <w:szCs w:val="24"/>
+        </w:rPr>
+      </w:pPr>
+      <w:r>
+        <w:rPr>
+          <w:rFonts w:ascii="Times New Roman" w:eastAsia="Times New Roman" w:hAnsi="Times New Roman" w:cs="Times New Roman"/>
+          <w:sz w:val="24"/>
+          <w:szCs w:val="24"/>
+        </w:rPr>
+        <w:t>Optional: OpenAPI contract check cho frontend.</w:t>
+      </w:r>
+    </w:p>
+    <w:p>
+      <w:pPr>
+        <w:spacing w:before="100" w:beforeAutospacing="1" w:after="100" w:afterAutospacing="1" w:line="240" w:lineRule="auto"/>
+        <w:rPr>
+          <w:rFonts w:ascii="Times New Roman" w:eastAsia="Times New Roman" w:hAnsi="Times New Roman" w:cs="Times New Roman"/>
+          <w:sz w:val="24"/>
+          <w:szCs w:val="24"/>
+        </w:rPr>
+      </w:pPr>
+      <w:r>
+        <w:rPr>
+          <w:rFonts w:ascii="Times New Roman" w:eastAsia="Times New Roman" w:hAnsi="Times New Roman" w:cs="Times New Roman"/>
+          <w:b/>
+          <w:bCs/>
+          <w:sz w:val="24"/>
+          <w:szCs w:val="24"/>
+        </w:rPr>
+        <w:t>Thứ tự triển khai đề xuất</w:t>
+      </w:r>
+    </w:p>
+    <w:p>
+      <w:pPr>
+        <w:spacing w:before="100" w:beforeAutospacing="1" w:after="100" w:afterAutospacing="1" w:line="240" w:lineRule="auto"/>
+        <w:rPr>
+          <w:rFonts w:ascii="Times New Roman" w:eastAsia="Times New Roman" w:hAnsi="Times New Roman" w:cs="Times New Roman"/>
+          <w:sz w:val="24"/>
+          <w:szCs w:val="24"/>
+        </w:rPr>
+      </w:pPr>
+      <w:r>
+        <w:rPr>
+          <w:rFonts w:ascii="Times New Roman" w:eastAsia="Times New Roman" w:hAnsi="Times New Roman" w:cs="Times New Roman"/>
+          <w:sz w:val="24"/>
+          <w:szCs w:val="24"/>
+        </w:rPr>
+        <w:lastRenderedPageBreak/>
+        <w:t>Phase 1: nền tảng + auth + database cleanup.</w:t>
+      </w:r>
+      <w:r>
+        <w:rPr>
+          <w:rFonts w:ascii="Times New Roman" w:eastAsia="Times New Roman" w:hAnsi="Times New Roman" w:cs="Times New Roman"/>
+          <w:sz w:val="24"/>
+          <w:szCs w:val="24"/>
+        </w:rPr>
+        <w:br/>
+        <w:t>Phase 2: product/catalog + cart.</w:t>
+      </w:r>
+      <w:r>
+        <w:rPr>
+          <w:rFonts w:ascii="Times New Roman" w:eastAsia="Times New Roman" w:hAnsi="Times New Roman" w:cs="Times New Roman"/>
+          <w:sz w:val="24"/>
+          <w:szCs w:val="24"/>
+        </w:rPr>
+        <w:br/>
+        <w:t>Phase 3: order/rental + inventory locking.</w:t>
+      </w:r>
+      <w:r>
+        <w:rPr>
+          <w:rFonts w:ascii="Times New Roman" w:eastAsia="Times New Roman" w:hAnsi="Times New Roman" w:cs="Times New Roman"/>
+          <w:sz w:val="24"/>
+          <w:szCs w:val="24"/>
+        </w:rPr>
+        <w:br/>
+        <w:t>Phase 4: payment + shipment.</w:t>
+      </w:r>
+      <w:r>
+        <w:rPr>
+          <w:rFonts w:ascii="Times New Roman" w:eastAsia="Times New Roman" w:hAnsi="Times New Roman" w:cs="Times New Roman"/>
+          <w:sz w:val="24"/>
+          <w:szCs w:val="24"/>
+        </w:rPr>
+        <w:br/>
+        <w:t>Phase 5: voucher/loyalty/review.</w:t>
+      </w:r>
+      <w:r>
+        <w:rPr>
+          <w:rFonts w:ascii="Times New Roman" w:eastAsia="Times New Roman" w:hAnsi="Times New Roman" w:cs="Times New Roman"/>
+          <w:sz w:val="24"/>
+          <w:szCs w:val="24"/>
+        </w:rPr>
+        <w:br/>
+        <w:t>Phase 6: admin + notifications + polish.</w:t>
+      </w:r>
+      <w:r>
+        <w:rPr>
+          <w:rFonts w:ascii="Times New Roman" w:eastAsia="Times New Roman" w:hAnsi="Times New Roman" w:cs="Times New Roman"/>
+          <w:sz w:val="24"/>
+          <w:szCs w:val="24"/>
+        </w:rPr>
+        <w:br/>
+        <w:t>Phase 7: hardening, tests, CI, deployment.</w:t>
+      </w:r>
+    </w:p>
+    <w:p>
+      <w:pPr>
+        <w:spacing w:before="100" w:beforeAutospacing="1" w:after="100" w:afterAutospacing="1" w:line="240" w:lineRule="auto"/>
+        <w:rPr>
+          <w:rFonts w:ascii="Times New Roman" w:eastAsia="Times New Roman" w:hAnsi="Times New Roman" w:cs="Times New Roman"/>
+          <w:sz w:val="24"/>
+          <w:szCs w:val="24"/>
+        </w:rPr>
+      </w:pPr>
+      <w:r>
+        <w:rPr>
+          <w:rFonts w:ascii="Times New Roman" w:eastAsia="Times New Roman" w:hAnsi="Times New Roman" w:cs="Times New Roman"/>
+          <w:sz w:val="24"/>
+          <w:szCs w:val="24"/>
+        </w:rPr>
+        <w:t xml:space="preserve">Mình chưa sửa file nào trong lượt này. </w:t>
+      </w:r>
+      <w:proofErr w:type="gramStart"/>
+      <w:r>
+        <w:rPr>
+          <w:rFonts w:ascii="Courier New" w:eastAsia="Times New Roman" w:hAnsi="Courier New" w:cs="Courier New"/>
+          <w:sz w:val="20"/>
+          <w:szCs w:val="20"/>
+        </w:rPr>
+        <w:t>git</w:t>
+      </w:r>
+      <w:proofErr w:type="gramEnd"/>
+      <w:r>
+        <w:rPr>
+          <w:rFonts w:ascii="Courier New" w:eastAsia="Times New Roman" w:hAnsi="Courier New" w:cs="Courier New"/>
+          <w:sz w:val="20"/>
+          <w:szCs w:val="20"/>
+        </w:rPr>
+        <w:t xml:space="preserve"> status</w:t>
+      </w:r>
+      <w:r>
+        <w:rPr>
+          <w:rFonts w:ascii="Times New Roman" w:eastAsia="Times New Roman" w:hAnsi="Times New Roman" w:cs="Times New Roman"/>
+          <w:sz w:val="24"/>
+          <w:szCs w:val="24"/>
+        </w:rPr>
+        <w:t xml:space="preserve"> hiện có một thư mục chưa tracked: </w:t>
+      </w:r>
+      <w:r>
+        <w:rPr>
+          <w:rFonts w:ascii="Courier New" w:eastAsia="Times New Roman" w:hAnsi="Courier New" w:cs="Courier New"/>
+          <w:sz w:val="20"/>
+          <w:szCs w:val="20"/>
+        </w:rPr>
+        <w:t>.claude/</w:t>
+      </w:r>
+      <w:r>
+        <w:rPr>
+          <w:rFonts w:ascii="Times New Roman" w:eastAsia="Times New Roman" w:hAnsi="Times New Roman" w:cs="Times New Roman"/>
+          <w:sz w:val="24"/>
+          <w:szCs w:val="24"/>
+        </w:rPr>
+        <w:t>, mình sẽ tránh đụng vào trừ khi bạn yêu cầu.</w:t>
+      </w:r>
+    </w:p>
+    <w:p>
+      <w:pPr>
+        <w:spacing w:before="100" w:beforeAutospacing="1" w:after="100" w:afterAutospacing="1" w:line="240" w:lineRule="auto"/>
+        <w:rPr>
+          <w:rFonts w:ascii="Times New Roman" w:eastAsia="Times New Roman" w:hAnsi="Times New Roman" w:cs="Times New Roman"/>
+          <w:sz w:val="24"/>
+          <w:szCs w:val="24"/>
+        </w:rPr>
+      </w:pPr>
     </w:p>
     <w:bookmarkEnd w:id="0"/>
     <w:p/>
@@ -16461,6 +19859,123 @@
 <file path=word/numbering.xml><?xml version="1.0" encoding="utf-8"?>
 <w:numbering xmlns:wpc="http://schemas.microsoft.com/office/word/2010/wordprocessingCanvas" xmlns:cx="http://schemas.microsoft.com/office/drawing/2014/chartex" xmlns:cx1="http://schemas.microsoft.com/office/drawing/2015/9/8/chartex" xmlns:mc="http://schemas.openxmlformats.org/markup-compatibility/2006" xmlns:o="urn:schemas-microsoft-com:office:office" xmlns:r="http://schemas.openxmlformats.org/officeDocument/2006/relationships" xmlns:m="http://schemas.openxmlformats.org/officeDocument/2006/math" xmlns:v="urn:schemas-microsoft-com:vml" xmlns:wp14="http://schemas.microsoft.com/office/word/2010/wordprocessingDrawing" xmlns:wp="http://schemas.openxmlformats.org/drawingml/2006/wordprocessingDrawing" xmlns:w10="urn:schemas-microsoft-com:office:word" xmlns:w="http://schemas.openxmlformats.org/wordprocessingml/2006/main" xmlns:w14="http://schemas.microsoft.com/office/word/2010/wordml" xmlns:w15="http://schemas.microsoft.com/office/word/2012/wordml" xmlns:w16se="http://schemas.microsoft.com/office/word/2015/wordml/symex" xmlns:wpg="http://schemas.microsoft.com/office/word/2010/wordprocessingGroup" xmlns:wpi="http://schemas.microsoft.com/office/word/2010/wordprocessingInk" xmlns:wne="http://schemas.microsoft.com/office/word/2006/wordml" xmlns:wps="http://schemas.microsoft.com/office/word/2010/wordprocessingShape" mc:Ignorable="w14 w15 w16se wp14">
   <w:abstractNum w:abstractNumId="0" w15:restartNumberingAfterBreak="0">
+    <w:nsid w:val="1E235BFD"/>
+    <w:multiLevelType w:val="multilevel"/>
+    <w:tmpl w:val="7AF0ECEC"/>
+    <w:lvl w:ilvl="0">
+      <w:start w:val="1"/>
+      <w:numFmt w:val="decimal"/>
+      <w:lvlText w:val="%1."/>
+      <w:lvlJc w:val="left"/>
+      <w:pPr>
+        <w:tabs>
+          <w:tab w:val="num" w:pos="720"/>
+        </w:tabs>
+        <w:ind w:left="720" w:hanging="360"/>
+      </w:pPr>
+    </w:lvl>
+    <w:lvl w:ilvl="1">
+      <w:start w:val="1"/>
+      <w:numFmt w:val="bullet"/>
+      <w:lvlText w:val="o"/>
+      <w:lvlJc w:val="left"/>
+      <w:pPr>
+        <w:tabs>
+          <w:tab w:val="num" w:pos="1440"/>
+        </w:tabs>
+        <w:ind w:left="1440" w:hanging="360"/>
+      </w:pPr>
+      <w:rPr>
+        <w:rFonts w:ascii="Courier New" w:hAnsi="Courier New" w:hint="default"/>
+        <w:sz w:val="20"/>
+      </w:rPr>
+    </w:lvl>
+    <w:lvl w:ilvl="2" w:tentative="1">
+      <w:start w:val="1"/>
+      <w:numFmt w:val="decimal"/>
+      <w:lvlText w:val="%3."/>
+      <w:lvlJc w:val="left"/>
+      <w:pPr>
+        <w:tabs>
+          <w:tab w:val="num" w:pos="2160"/>
+        </w:tabs>
+        <w:ind w:left="2160" w:hanging="360"/>
+      </w:pPr>
+    </w:lvl>
+    <w:lvl w:ilvl="3" w:tentative="1">
+      <w:start w:val="1"/>
+      <w:numFmt w:val="decimal"/>
+      <w:lvlText w:val="%4."/>
+      <w:lvlJc w:val="left"/>
+      <w:pPr>
+        <w:tabs>
+          <w:tab w:val="num" w:pos="2880"/>
+        </w:tabs>
+        <w:ind w:left="2880" w:hanging="360"/>
+      </w:pPr>
+    </w:lvl>
+    <w:lvl w:ilvl="4" w:tentative="1">
+      <w:start w:val="1"/>
+      <w:numFmt w:val="decimal"/>
+      <w:lvlText w:val="%5."/>
+      <w:lvlJc w:val="left"/>
+      <w:pPr>
+        <w:tabs>
+          <w:tab w:val="num" w:pos="3600"/>
+        </w:tabs>
+        <w:ind w:left="3600" w:hanging="360"/>
+      </w:pPr>
+    </w:lvl>
+    <w:lvl w:ilvl="5" w:tentative="1">
+      <w:start w:val="1"/>
+      <w:numFmt w:val="decimal"/>
+      <w:lvlText w:val="%6."/>
+      <w:lvlJc w:val="left"/>
+      <w:pPr>
+        <w:tabs>
+          <w:tab w:val="num" w:pos="4320"/>
+        </w:tabs>
+        <w:ind w:left="4320" w:hanging="360"/>
+      </w:pPr>
+    </w:lvl>
+    <w:lvl w:ilvl="6" w:tentative="1">
+      <w:start w:val="1"/>
+      <w:numFmt w:val="decimal"/>
+      <w:lvlText w:val="%7."/>
+      <w:lvlJc w:val="left"/>
+      <w:pPr>
+        <w:tabs>
+          <w:tab w:val="num" w:pos="5040"/>
+        </w:tabs>
+        <w:ind w:left="5040" w:hanging="360"/>
+      </w:pPr>
+    </w:lvl>
+    <w:lvl w:ilvl="7" w:tentative="1">
+      <w:start w:val="1"/>
+      <w:numFmt w:val="decimal"/>
+      <w:lvlText w:val="%8."/>
+      <w:lvlJc w:val="left"/>
+      <w:pPr>
+        <w:tabs>
+          <w:tab w:val="num" w:pos="5760"/>
+        </w:tabs>
+        <w:ind w:left="5760" w:hanging="360"/>
+      </w:pPr>
+    </w:lvl>
+    <w:lvl w:ilvl="8" w:tentative="1">
+      <w:start w:val="1"/>
+      <w:numFmt w:val="decimal"/>
+      <w:lvlText w:val="%9."/>
+      <w:lvlJc w:val="left"/>
+      <w:pPr>
+        <w:tabs>
+          <w:tab w:val="num" w:pos="6480"/>
+        </w:tabs>
+        <w:ind w:left="6480" w:hanging="360"/>
+      </w:pPr>
+    </w:lvl>
+  </w:abstractNum>
+  <w:abstractNum w:abstractNumId="1" w15:restartNumberingAfterBreak="0">
     <w:nsid w:val="6DC32CF6"/>
     <w:multiLevelType w:val="multilevel"/>
     <w:tmpl w:val="4C4430EE"/>
@@ -16574,6 +20089,9 @@
     </w:lvl>
   </w:abstractNum>
   <w:num w:numId="1">
+    <w:abstractNumId w:val="1"/>
+  </w:num>
+  <w:num w:numId="2">
     <w:abstractNumId w:val="0"/>
   </w:num>
 </w:numbering>

</xml_diff>